<commit_message>
se agrego logica de Rasp y algunos conectores
</commit_message>
<xml_diff>
--- a/Salus IV/Lista Componentes.docx
+++ b/Salus IV/Lista Componentes.docx
@@ -12,7 +12,21 @@
         <w:rPr>
           <w:lang w:val="es-ES"/>
         </w:rPr>
-        <w:t>Lista de componentes usados en definitiva:</w:t>
+        <w:t xml:space="preserve">Lista de componentes </w:t>
+      </w:r>
+      <w:proofErr w:type="gramStart"/>
+      <w:r>
+        <w:rPr>
+          <w:lang w:val="es-ES"/>
+        </w:rPr>
+        <w:t>usados</w:t>
+      </w:r>
+      <w:proofErr w:type="gramEnd"/>
+      <w:r>
+        <w:rPr>
+          <w:lang w:val="es-ES"/>
+        </w:rPr>
+        <w:t xml:space="preserve"> en definitiva:</w:t>
       </w:r>
     </w:p>
     <w:p>
@@ -150,7 +164,23 @@
           <w:b/>
           <w:bCs/>
         </w:rPr>
-        <w:t xml:space="preserve"> (Estas de 1K ohm pero todas son del mismo empaquetado distinto valor).</w:t>
+        <w:t xml:space="preserve"> (Estas de 1K </w:t>
+      </w:r>
+      <w:proofErr w:type="gramStart"/>
+      <w:r>
+        <w:rPr>
+          <w:b/>
+          <w:bCs/>
+        </w:rPr>
+        <w:t>ohm</w:t>
+      </w:r>
+      <w:proofErr w:type="gramEnd"/>
+      <w:r>
+        <w:rPr>
+          <w:b/>
+          <w:bCs/>
+        </w:rPr>
+        <w:t xml:space="preserve"> pero todas son del mismo empaquetado distinto valor).</w:t>
       </w:r>
     </w:p>
     <w:p>
@@ -171,8 +201,619 @@
           <w:u w:val="single"/>
           <w:lang w:val="es-ES"/>
         </w:rPr>
-        <w:t xml:space="preserve">Siguientes componentes: </w:t>
-      </w:r>
+        <w:t xml:space="preserve">Componentes </w:t>
+      </w:r>
+      <w:proofErr w:type="spellStart"/>
+      <w:r>
+        <w:rPr>
+          <w:rFonts w:ascii="Aptos" w:hAnsi="Aptos"/>
+          <w:sz w:val="32"/>
+          <w:szCs w:val="32"/>
+          <w:u w:val="single"/>
+          <w:lang w:val="es-ES"/>
+        </w:rPr>
+        <w:t>Logica</w:t>
+      </w:r>
+      <w:proofErr w:type="spellEnd"/>
+      <w:r>
+        <w:rPr>
+          <w:rFonts w:ascii="Aptos" w:hAnsi="Aptos"/>
+          <w:sz w:val="32"/>
+          <w:szCs w:val="32"/>
+          <w:u w:val="single"/>
+          <w:lang w:val="es-ES"/>
+        </w:rPr>
+        <w:t xml:space="preserve"> </w:t>
+      </w:r>
+      <w:proofErr w:type="spellStart"/>
+      <w:r>
+        <w:rPr>
+          <w:rFonts w:ascii="Aptos" w:hAnsi="Aptos"/>
+          <w:sz w:val="32"/>
+          <w:szCs w:val="32"/>
+          <w:u w:val="single"/>
+          <w:lang w:val="es-ES"/>
+        </w:rPr>
+        <w:t>Rasp</w:t>
+      </w:r>
+      <w:proofErr w:type="spellEnd"/>
+      <w:r>
+        <w:rPr>
+          <w:rFonts w:ascii="Aptos" w:hAnsi="Aptos"/>
+          <w:sz w:val="32"/>
+          <w:szCs w:val="32"/>
+          <w:u w:val="single"/>
+          <w:lang w:val="es-ES"/>
+        </w:rPr>
+        <w:t xml:space="preserve">: </w:t>
+      </w:r>
+    </w:p>
+    <w:p>
+      <w:pPr>
+        <w:rPr>
+          <w:rFonts w:cstheme="minorHAnsi"/>
+          <w:b/>
+          <w:bCs/>
+          <w:sz w:val="24"/>
+          <w:szCs w:val="24"/>
+        </w:rPr>
+      </w:pPr>
+      <w:r>
+        <w:rPr>
+          <w:rFonts w:cstheme="minorHAnsi"/>
+          <w:sz w:val="24"/>
+          <w:szCs w:val="24"/>
+          <w:lang w:val="es-ES"/>
+        </w:rPr>
+        <w:t xml:space="preserve">Conectores para </w:t>
+      </w:r>
+      <w:proofErr w:type="spellStart"/>
+      <w:r>
+        <w:rPr>
+          <w:rFonts w:cstheme="minorHAnsi"/>
+          <w:sz w:val="24"/>
+          <w:szCs w:val="24"/>
+          <w:lang w:val="es-ES"/>
+        </w:rPr>
+        <w:t>Rasp</w:t>
+      </w:r>
+      <w:proofErr w:type="spellEnd"/>
+      <w:r>
+        <w:rPr>
+          <w:rFonts w:cstheme="minorHAnsi"/>
+          <w:sz w:val="24"/>
+          <w:szCs w:val="24"/>
+          <w:lang w:val="es-ES"/>
+        </w:rPr>
+        <w:t>:</w:t>
+      </w:r>
+      <w:r>
+        <w:rPr>
+          <w:rFonts w:cstheme="minorHAnsi"/>
+          <w:sz w:val="24"/>
+          <w:szCs w:val="24"/>
+          <w:lang w:val="es-ES"/>
+        </w:rPr>
+        <w:t xml:space="preserve"> </w:t>
+      </w:r>
+      <w:r>
+        <w:rPr>
+          <w:rFonts w:cstheme="minorHAnsi" w:hint="eastAsia"/>
+          <w:b/>
+          <w:bCs/>
+          <w:sz w:val="24"/>
+          <w:szCs w:val="24"/>
+        </w:rPr>
+        <w:t xml:space="preserve">2.54-2*20P </w:t>
+      </w:r>
+      <w:proofErr w:type="spellStart"/>
+      <w:r>
+        <w:rPr>
+          <w:rFonts w:cstheme="minorHAnsi" w:hint="eastAsia"/>
+          <w:b/>
+          <w:bCs/>
+          <w:sz w:val="24"/>
+          <w:szCs w:val="24"/>
+        </w:rPr>
+        <w:t>Straight</w:t>
+      </w:r>
+      <w:proofErr w:type="spellEnd"/>
+      <w:r>
+        <w:rPr>
+          <w:rFonts w:cstheme="minorHAnsi" w:hint="eastAsia"/>
+          <w:b/>
+          <w:bCs/>
+          <w:sz w:val="24"/>
+          <w:szCs w:val="24"/>
+        </w:rPr>
+        <w:t xml:space="preserve"> IDC </w:t>
+      </w:r>
+      <w:proofErr w:type="spellStart"/>
+      <w:r>
+        <w:rPr>
+          <w:rFonts w:cstheme="minorHAnsi" w:hint="eastAsia"/>
+          <w:b/>
+          <w:bCs/>
+          <w:sz w:val="24"/>
+          <w:szCs w:val="24"/>
+        </w:rPr>
+        <w:t>Header</w:t>
+      </w:r>
+      <w:proofErr w:type="spellEnd"/>
+      <w:r>
+        <w:rPr>
+          <w:rFonts w:cstheme="minorHAnsi" w:hint="eastAsia"/>
+          <w:b/>
+          <w:bCs/>
+          <w:sz w:val="24"/>
+          <w:szCs w:val="24"/>
+        </w:rPr>
+        <w:t xml:space="preserve">, No </w:t>
+      </w:r>
+      <w:proofErr w:type="spellStart"/>
+      <w:r>
+        <w:rPr>
+          <w:rFonts w:cstheme="minorHAnsi" w:hint="eastAsia"/>
+          <w:b/>
+          <w:bCs/>
+          <w:sz w:val="24"/>
+          <w:szCs w:val="24"/>
+        </w:rPr>
+        <w:t>Ejector</w:t>
+      </w:r>
+      <w:proofErr w:type="spellEnd"/>
+      <w:r>
+        <w:rPr>
+          <w:rFonts w:cstheme="minorHAnsi"/>
+          <w:b/>
+          <w:bCs/>
+          <w:sz w:val="24"/>
+          <w:szCs w:val="24"/>
+        </w:rPr>
+        <w:t>.</w:t>
+      </w:r>
+    </w:p>
+    <w:p>
+      <w:pPr>
+        <w:rPr>
+          <w:rFonts w:cstheme="minorHAnsi"/>
+          <w:b/>
+          <w:bCs/>
+          <w:sz w:val="24"/>
+          <w:szCs w:val="24"/>
+        </w:rPr>
+      </w:pPr>
+      <w:r>
+        <w:rPr>
+          <w:rFonts w:cstheme="minorHAnsi"/>
+          <w:sz w:val="24"/>
+          <w:szCs w:val="24"/>
+        </w:rPr>
+        <w:t>Transistores para la Lógica:</w:t>
+      </w:r>
+      <w:r>
+        <w:rPr>
+          <w:rFonts w:cstheme="minorHAnsi"/>
+          <w:sz w:val="24"/>
+          <w:szCs w:val="24"/>
+        </w:rPr>
+        <w:t xml:space="preserve"> </w:t>
+      </w:r>
+      <w:r>
+        <w:rPr>
+          <w:rFonts w:cstheme="minorHAnsi" w:hint="eastAsia"/>
+          <w:b/>
+          <w:bCs/>
+          <w:sz w:val="24"/>
+          <w:szCs w:val="24"/>
+        </w:rPr>
+        <w:t>IRLML6344PBF-HXY</w:t>
+      </w:r>
+      <w:r>
+        <w:rPr>
+          <w:rFonts w:cstheme="minorHAnsi"/>
+          <w:b/>
+          <w:bCs/>
+          <w:sz w:val="24"/>
+          <w:szCs w:val="24"/>
+        </w:rPr>
+        <w:t>.</w:t>
+      </w:r>
+    </w:p>
+    <w:p>
+      <w:pPr>
+        <w:rPr>
+          <w:rFonts w:cstheme="minorHAnsi"/>
+          <w:b/>
+          <w:bCs/>
+          <w:sz w:val="24"/>
+          <w:szCs w:val="24"/>
+        </w:rPr>
+      </w:pPr>
+      <w:r>
+        <w:rPr>
+          <w:rFonts w:cstheme="minorHAnsi"/>
+          <w:sz w:val="24"/>
+          <w:szCs w:val="24"/>
+        </w:rPr>
+        <w:t xml:space="preserve">Conector Output Señales: </w:t>
+      </w:r>
+      <w:r>
+        <w:rPr>
+          <w:rFonts w:cstheme="minorHAnsi" w:hint="eastAsia"/>
+          <w:b/>
+          <w:bCs/>
+          <w:sz w:val="24"/>
+          <w:szCs w:val="24"/>
+        </w:rPr>
+        <w:t>WJ127-5.0-06P-14-00A</w:t>
+      </w:r>
+    </w:p>
+    <w:p>
+      <w:pPr>
+        <w:rPr>
+          <w:rFonts w:cstheme="minorHAnsi"/>
+          <w:b/>
+          <w:bCs/>
+          <w:sz w:val="24"/>
+          <w:szCs w:val="24"/>
+        </w:rPr>
+      </w:pPr>
+      <w:proofErr w:type="spellStart"/>
+      <w:r>
+        <w:rPr>
+          <w:rFonts w:cstheme="minorHAnsi"/>
+          <w:sz w:val="24"/>
+          <w:szCs w:val="24"/>
+        </w:rPr>
+        <w:t>Relay</w:t>
+      </w:r>
+      <w:proofErr w:type="spellEnd"/>
+      <w:r>
+        <w:rPr>
+          <w:rFonts w:cstheme="minorHAnsi"/>
+          <w:sz w:val="24"/>
+          <w:szCs w:val="24"/>
+        </w:rPr>
+        <w:t xml:space="preserve">: </w:t>
+      </w:r>
+      <w:r>
+        <w:rPr>
+          <w:rFonts w:cstheme="minorHAnsi"/>
+          <w:sz w:val="24"/>
+          <w:szCs w:val="24"/>
+        </w:rPr>
+        <w:t xml:space="preserve">Este lo cambiamos, </w:t>
+      </w:r>
+      <w:bookmarkStart w:id="0" w:name="_Hlk221796421"/>
+      <w:r>
+        <w:rPr>
+          <w:rFonts w:cstheme="minorHAnsi" w:hint="eastAsia"/>
+          <w:b/>
+          <w:bCs/>
+          <w:sz w:val="24"/>
+          <w:szCs w:val="24"/>
+        </w:rPr>
+        <w:t>SRD-05VDC-SL-C</w:t>
+      </w:r>
+      <w:bookmarkEnd w:id="0"/>
+      <w:r>
+        <w:rPr>
+          <w:rFonts w:cstheme="minorHAnsi"/>
+          <w:b/>
+          <w:bCs/>
+          <w:sz w:val="24"/>
+          <w:szCs w:val="24"/>
+        </w:rPr>
+        <w:t>.</w:t>
+      </w:r>
+      <w:r>
+        <w:rPr>
+          <w:rFonts w:cstheme="minorHAnsi"/>
+          <w:b/>
+          <w:bCs/>
+          <w:sz w:val="24"/>
+          <w:szCs w:val="24"/>
+        </w:rPr>
+        <w:br/>
+      </w:r>
+      <w:r>
+        <w:rPr>
+          <w:rFonts w:cstheme="minorHAnsi"/>
+          <w:b/>
+          <w:bCs/>
+          <w:sz w:val="24"/>
+          <w:szCs w:val="24"/>
+        </w:rPr>
+        <w:br/>
+      </w:r>
+      <w:r>
+        <w:rPr>
+          <w:rFonts w:cstheme="minorHAnsi"/>
+          <w:sz w:val="24"/>
+          <w:szCs w:val="24"/>
+        </w:rPr>
+        <w:t>Diodo TVS</w:t>
+      </w:r>
+      <w:r>
+        <w:rPr>
+          <w:rFonts w:cstheme="minorHAnsi"/>
+          <w:b/>
+          <w:bCs/>
+          <w:sz w:val="24"/>
+          <w:szCs w:val="24"/>
+        </w:rPr>
+        <w:t xml:space="preserve">: </w:t>
+      </w:r>
+      <w:bookmarkStart w:id="1" w:name="_Hlk221796440"/>
+      <w:r>
+        <w:rPr>
+          <w:rFonts w:cstheme="minorHAnsi" w:hint="eastAsia"/>
+          <w:b/>
+          <w:bCs/>
+          <w:sz w:val="24"/>
+          <w:szCs w:val="24"/>
+        </w:rPr>
+        <w:t>1N6267A-E3/54</w:t>
+      </w:r>
+      <w:r>
+        <w:rPr>
+          <w:rFonts w:cstheme="minorHAnsi"/>
+          <w:b/>
+          <w:bCs/>
+          <w:sz w:val="24"/>
+          <w:szCs w:val="24"/>
+        </w:rPr>
+        <w:t>.</w:t>
+      </w:r>
+    </w:p>
+    <w:p>
+      <w:pPr>
+        <w:rPr>
+          <w:rFonts w:cstheme="minorHAnsi"/>
+          <w:b/>
+          <w:bCs/>
+          <w:sz w:val="24"/>
+          <w:szCs w:val="24"/>
+        </w:rPr>
+      </w:pPr>
+    </w:p>
+    <w:p>
+      <w:pPr>
+        <w:rPr>
+          <w:rFonts w:ascii="Aptos" w:hAnsi="Aptos"/>
+          <w:sz w:val="32"/>
+          <w:szCs w:val="32"/>
+          <w:u w:val="single"/>
+          <w:lang w:val="es-ES"/>
+        </w:rPr>
+      </w:pPr>
+      <w:r>
+        <w:rPr>
+          <w:rFonts w:ascii="Aptos" w:hAnsi="Aptos"/>
+          <w:sz w:val="32"/>
+          <w:szCs w:val="32"/>
+          <w:u w:val="single"/>
+          <w:lang w:val="es-ES"/>
+        </w:rPr>
+        <w:t>Conectores que van al Exterior</w:t>
+      </w:r>
+      <w:r>
+        <w:rPr>
+          <w:rFonts w:ascii="Aptos" w:hAnsi="Aptos"/>
+          <w:sz w:val="32"/>
+          <w:szCs w:val="32"/>
+          <w:u w:val="single"/>
+          <w:lang w:val="es-ES"/>
+        </w:rPr>
+        <w:t xml:space="preserve">: </w:t>
+      </w:r>
+    </w:p>
+    <w:p>
+      <w:pPr>
+        <w:rPr>
+          <w:rFonts w:cstheme="minorHAnsi"/>
+          <w:b/>
+          <w:bCs/>
+          <w:sz w:val="24"/>
+          <w:szCs w:val="24"/>
+        </w:rPr>
+      </w:pPr>
+    </w:p>
+    <w:bookmarkEnd w:id="1"/>
+    <w:p>
+      <w:pPr>
+        <w:rPr>
+          <w:rFonts w:cstheme="minorHAnsi"/>
+          <w:b/>
+          <w:bCs/>
+          <w:sz w:val="24"/>
+          <w:szCs w:val="24"/>
+        </w:rPr>
+      </w:pPr>
+      <w:r>
+        <w:rPr>
+          <w:rFonts w:cstheme="minorHAnsi"/>
+          <w:sz w:val="24"/>
+          <w:szCs w:val="24"/>
+        </w:rPr>
+        <w:t xml:space="preserve">Conector Servos: </w:t>
+      </w:r>
+      <w:r>
+        <w:rPr>
+          <w:rFonts w:cstheme="minorHAnsi" w:hint="eastAsia"/>
+          <w:b/>
+          <w:bCs/>
+          <w:sz w:val="24"/>
+          <w:szCs w:val="24"/>
+        </w:rPr>
+        <w:t>2.54-2*3PPin</w:t>
+      </w:r>
+      <w:r>
+        <w:rPr>
+          <w:rFonts w:cstheme="minorHAnsi"/>
+          <w:b/>
+          <w:bCs/>
+          <w:sz w:val="24"/>
+          <w:szCs w:val="24"/>
+        </w:rPr>
+        <w:t>.</w:t>
+      </w:r>
+    </w:p>
+    <w:p>
+      <w:pPr>
+        <w:rPr>
+          <w:rFonts w:cstheme="minorHAnsi"/>
+          <w:b/>
+          <w:bCs/>
+          <w:sz w:val="24"/>
+          <w:szCs w:val="24"/>
+        </w:rPr>
+      </w:pPr>
+      <w:r>
+        <w:rPr>
+          <w:rFonts w:cstheme="minorHAnsi"/>
+          <w:sz w:val="24"/>
+          <w:szCs w:val="24"/>
+        </w:rPr>
+        <w:t>Cable</w:t>
+      </w:r>
+      <w:r>
+        <w:rPr>
+          <w:rFonts w:cstheme="minorHAnsi"/>
+          <w:sz w:val="24"/>
+          <w:szCs w:val="24"/>
+        </w:rPr>
+        <w:t xml:space="preserve"> Puente H:</w:t>
+      </w:r>
+      <w:r>
+        <w:rPr>
+          <w:rFonts w:cstheme="minorHAnsi"/>
+          <w:b/>
+          <w:bCs/>
+          <w:sz w:val="24"/>
+          <w:szCs w:val="24"/>
+        </w:rPr>
+        <w:t xml:space="preserve"> </w:t>
+      </w:r>
+      <w:proofErr w:type="spellStart"/>
+      <w:r>
+        <w:rPr>
+          <w:rFonts w:cstheme="minorHAnsi"/>
+          <w:b/>
+          <w:bCs/>
+          <w:sz w:val="24"/>
+          <w:szCs w:val="24"/>
+        </w:rPr>
+        <w:t>hanxia</w:t>
+      </w:r>
+      <w:proofErr w:type="spellEnd"/>
+      <w:r>
+        <w:rPr>
+          <w:rFonts w:cstheme="minorHAnsi"/>
+          <w:b/>
+          <w:bCs/>
+          <w:sz w:val="24"/>
+          <w:szCs w:val="24"/>
+        </w:rPr>
+        <w:t xml:space="preserve"> HX PH2.0-4P ST 200mm 24AWG</w:t>
+      </w:r>
+      <w:r>
+        <w:rPr>
+          <w:rFonts w:cstheme="minorHAnsi"/>
+          <w:b/>
+          <w:bCs/>
+          <w:sz w:val="24"/>
+          <w:szCs w:val="24"/>
+        </w:rPr>
+        <w:t>.</w:t>
+      </w:r>
+    </w:p>
+    <w:p>
+      <w:pPr>
+        <w:rPr>
+          <w:rFonts w:cstheme="minorHAnsi"/>
+          <w:b/>
+          <w:bCs/>
+          <w:sz w:val="24"/>
+          <w:szCs w:val="24"/>
+        </w:rPr>
+      </w:pPr>
+      <w:r>
+        <w:rPr>
+          <w:rFonts w:cstheme="minorHAnsi"/>
+          <w:sz w:val="24"/>
+          <w:szCs w:val="24"/>
+        </w:rPr>
+        <w:t>Conector Puente H:</w:t>
+      </w:r>
+      <w:r>
+        <w:rPr>
+          <w:rFonts w:cstheme="minorHAnsi"/>
+          <w:b/>
+          <w:bCs/>
+          <w:sz w:val="24"/>
+          <w:szCs w:val="24"/>
+        </w:rPr>
+        <w:t xml:space="preserve"> </w:t>
+      </w:r>
+      <w:r>
+        <w:rPr>
+          <w:rFonts w:cstheme="minorHAnsi"/>
+          <w:b/>
+          <w:bCs/>
+          <w:sz w:val="24"/>
+          <w:szCs w:val="24"/>
+        </w:rPr>
+        <w:t>S4B-PH-K-S</w:t>
+      </w:r>
+    </w:p>
+    <w:p>
+      <w:pPr>
+        <w:rPr>
+          <w:rFonts w:cstheme="minorHAnsi"/>
+          <w:sz w:val="24"/>
+          <w:szCs w:val="24"/>
+        </w:rPr>
+      </w:pPr>
+    </w:p>
+    <w:p>
+      <w:pPr>
+        <w:rPr>
+          <w:rFonts w:cstheme="minorHAnsi"/>
+          <w:sz w:val="24"/>
+          <w:szCs w:val="24"/>
+        </w:rPr>
+      </w:pPr>
+      <w:r>
+        <w:rPr>
+          <w:rFonts w:cstheme="minorHAnsi"/>
+          <w:sz w:val="24"/>
+          <w:szCs w:val="24"/>
+        </w:rPr>
+        <w:t xml:space="preserve"> </w:t>
+      </w:r>
+    </w:p>
+    <w:p>
+      <w:pPr>
+        <w:rPr>
+          <w:rFonts w:cstheme="minorHAnsi"/>
+          <w:sz w:val="24"/>
+          <w:szCs w:val="24"/>
+          <w:lang w:val="es-ES"/>
+        </w:rPr>
+      </w:pPr>
+    </w:p>
+    <w:p>
+      <w:pPr>
+        <w:rPr>
+          <w:rFonts w:ascii="Aptos" w:hAnsi="Aptos"/>
+          <w:sz w:val="32"/>
+          <w:szCs w:val="32"/>
+          <w:u w:val="single"/>
+          <w:lang w:val="es-ES"/>
+        </w:rPr>
+      </w:pPr>
     </w:p>
     <w:p>
       <w:pPr>

</xml_diff>

<commit_message>
pusheo por seguridad, avanzado Esquematico
</commit_message>
<xml_diff>
--- a/Salus IV/Lista Componentes.docx
+++ b/Salus IV/Lista Componentes.docx
@@ -596,9 +596,181 @@
           <w:u w:val="single"/>
           <w:lang w:val="es-ES"/>
         </w:rPr>
-        <w:t>Conectores que van al Exterior</w:t>
-      </w:r>
-      <w:r>
+        <w:t xml:space="preserve">Conectores que van al Exterior: </w:t>
+      </w:r>
+    </w:p>
+    <w:p>
+      <w:pPr>
+        <w:rPr>
+          <w:rFonts w:cstheme="minorHAnsi"/>
+          <w:b/>
+          <w:bCs/>
+          <w:sz w:val="24"/>
+          <w:szCs w:val="24"/>
+        </w:rPr>
+      </w:pPr>
+    </w:p>
+    <w:bookmarkEnd w:id="1"/>
+    <w:p>
+      <w:pPr>
+        <w:rPr>
+          <w:rFonts w:cstheme="minorHAnsi"/>
+          <w:b/>
+          <w:bCs/>
+          <w:sz w:val="24"/>
+          <w:szCs w:val="24"/>
+        </w:rPr>
+      </w:pPr>
+      <w:r>
+        <w:rPr>
+          <w:rFonts w:cstheme="minorHAnsi"/>
+          <w:sz w:val="24"/>
+          <w:szCs w:val="24"/>
+        </w:rPr>
+        <w:t xml:space="preserve">Conector Servos: </w:t>
+      </w:r>
+      <w:r>
+        <w:rPr>
+          <w:rFonts w:cstheme="minorHAnsi" w:hint="eastAsia"/>
+          <w:b/>
+          <w:bCs/>
+          <w:sz w:val="24"/>
+          <w:szCs w:val="24"/>
+        </w:rPr>
+        <w:t>2.54-2*3PPin</w:t>
+      </w:r>
+      <w:r>
+        <w:rPr>
+          <w:rFonts w:cstheme="minorHAnsi"/>
+          <w:b/>
+          <w:bCs/>
+          <w:sz w:val="24"/>
+          <w:szCs w:val="24"/>
+        </w:rPr>
+        <w:t>.</w:t>
+      </w:r>
+    </w:p>
+    <w:p>
+      <w:pPr>
+        <w:rPr>
+          <w:rFonts w:cstheme="minorHAnsi"/>
+          <w:b/>
+          <w:bCs/>
+          <w:sz w:val="24"/>
+          <w:szCs w:val="24"/>
+        </w:rPr>
+      </w:pPr>
+      <w:r>
+        <w:rPr>
+          <w:rFonts w:cstheme="minorHAnsi"/>
+          <w:sz w:val="24"/>
+          <w:szCs w:val="24"/>
+        </w:rPr>
+        <w:t>Cable</w:t>
+      </w:r>
+      <w:r>
+        <w:rPr>
+          <w:rFonts w:cstheme="minorHAnsi"/>
+          <w:sz w:val="24"/>
+          <w:szCs w:val="24"/>
+        </w:rPr>
+        <w:t xml:space="preserve"> Puente H:</w:t>
+      </w:r>
+      <w:r>
+        <w:rPr>
+          <w:rFonts w:cstheme="minorHAnsi"/>
+          <w:b/>
+          <w:bCs/>
+          <w:sz w:val="24"/>
+          <w:szCs w:val="24"/>
+        </w:rPr>
+        <w:t xml:space="preserve"> </w:t>
+      </w:r>
+      <w:proofErr w:type="spellStart"/>
+      <w:r>
+        <w:rPr>
+          <w:rFonts w:cstheme="minorHAnsi"/>
+          <w:b/>
+          <w:bCs/>
+          <w:sz w:val="24"/>
+          <w:szCs w:val="24"/>
+        </w:rPr>
+        <w:t>hanxia</w:t>
+      </w:r>
+      <w:proofErr w:type="spellEnd"/>
+      <w:r>
+        <w:rPr>
+          <w:rFonts w:cstheme="minorHAnsi"/>
+          <w:b/>
+          <w:bCs/>
+          <w:sz w:val="24"/>
+          <w:szCs w:val="24"/>
+        </w:rPr>
+        <w:t xml:space="preserve"> HX PH2.0-4P ST 200mm 24AWG</w:t>
+      </w:r>
+      <w:r>
+        <w:rPr>
+          <w:rFonts w:cstheme="minorHAnsi"/>
+          <w:b/>
+          <w:bCs/>
+          <w:sz w:val="24"/>
+          <w:szCs w:val="24"/>
+        </w:rPr>
+        <w:t>.</w:t>
+      </w:r>
+    </w:p>
+    <w:p>
+      <w:pPr>
+        <w:rPr>
+          <w:rFonts w:cstheme="minorHAnsi"/>
+          <w:b/>
+          <w:bCs/>
+          <w:sz w:val="24"/>
+          <w:szCs w:val="24"/>
+        </w:rPr>
+      </w:pPr>
+      <w:r>
+        <w:rPr>
+          <w:rFonts w:cstheme="minorHAnsi"/>
+          <w:sz w:val="24"/>
+          <w:szCs w:val="24"/>
+        </w:rPr>
+        <w:t>Conector Puente H:</w:t>
+      </w:r>
+      <w:r>
+        <w:rPr>
+          <w:rFonts w:cstheme="minorHAnsi"/>
+          <w:b/>
+          <w:bCs/>
+          <w:sz w:val="24"/>
+          <w:szCs w:val="24"/>
+        </w:rPr>
+        <w:t xml:space="preserve"> </w:t>
+      </w:r>
+      <w:r>
+        <w:rPr>
+          <w:rFonts w:cstheme="minorHAnsi"/>
+          <w:b/>
+          <w:bCs/>
+          <w:sz w:val="24"/>
+          <w:szCs w:val="24"/>
+        </w:rPr>
+        <w:t>S4B-PH-K-S</w:t>
+      </w:r>
+    </w:p>
+    <w:p>
+      <w:pPr>
+        <w:rPr>
+          <w:rFonts w:cstheme="minorHAnsi"/>
+          <w:b/>
+          <w:bCs/>
+          <w:sz w:val="24"/>
+          <w:szCs w:val="24"/>
+        </w:rPr>
+      </w:pPr>
+    </w:p>
+    <w:p>
+      <w:pPr>
         <w:rPr>
           <w:rFonts w:ascii="Aptos" w:hAnsi="Aptos"/>
           <w:sz w:val="32"/>
@@ -606,54 +778,579 @@
           <w:u w:val="single"/>
           <w:lang w:val="es-ES"/>
         </w:rPr>
+      </w:pPr>
+      <w:r>
+        <w:rPr>
+          <w:rFonts w:ascii="Aptos" w:hAnsi="Aptos"/>
+          <w:sz w:val="32"/>
+          <w:szCs w:val="32"/>
+          <w:u w:val="single"/>
+          <w:lang w:val="es-ES"/>
+        </w:rPr>
+        <w:t xml:space="preserve">Expansor de </w:t>
+      </w:r>
+      <w:proofErr w:type="spellStart"/>
+      <w:r>
+        <w:rPr>
+          <w:rFonts w:ascii="Aptos" w:hAnsi="Aptos"/>
+          <w:sz w:val="32"/>
+          <w:szCs w:val="32"/>
+          <w:u w:val="single"/>
+          <w:lang w:val="es-ES"/>
+        </w:rPr>
+        <w:t>Gpios</w:t>
+      </w:r>
+      <w:proofErr w:type="spellEnd"/>
+      <w:r>
+        <w:rPr>
+          <w:rFonts w:ascii="Aptos" w:hAnsi="Aptos"/>
+          <w:sz w:val="32"/>
+          <w:szCs w:val="32"/>
+          <w:u w:val="single"/>
+          <w:lang w:val="es-ES"/>
+        </w:rPr>
+        <w:t>:</w:t>
+      </w:r>
+    </w:p>
+    <w:p>
+      <w:pPr>
+        <w:rPr>
+          <w:rFonts w:cstheme="minorHAnsi"/>
+          <w:sz w:val="24"/>
+          <w:szCs w:val="24"/>
+        </w:rPr>
+      </w:pPr>
+      <w:r>
+        <w:rPr>
+          <w:rFonts w:cstheme="minorHAnsi"/>
+          <w:sz w:val="24"/>
+          <w:szCs w:val="24"/>
+          <w:lang w:val="es-ES"/>
+        </w:rPr>
+        <w:t xml:space="preserve">Estoy entre dos </w:t>
+      </w:r>
+      <w:proofErr w:type="gramStart"/>
+      <w:r>
+        <w:rPr>
+          <w:rFonts w:cstheme="minorHAnsi"/>
+          <w:sz w:val="24"/>
+          <w:szCs w:val="24"/>
+          <w:lang w:val="es-ES"/>
+        </w:rPr>
+        <w:t xml:space="preserve">expansores, </w:t>
+      </w:r>
+      <w:r>
+        <w:rPr>
+          <w:rFonts w:ascii="Aptos" w:hAnsi="Aptos"/>
+          <w:sz w:val="32"/>
+          <w:szCs w:val="32"/>
+          <w:u w:val="single"/>
+          <w:lang w:val="es-ES"/>
+        </w:rPr>
+        <w:t xml:space="preserve"> </w:t>
+      </w:r>
+      <w:r>
+        <w:rPr>
+          <w:rFonts w:cstheme="minorHAnsi"/>
+          <w:b/>
+          <w:bCs/>
+          <w:sz w:val="24"/>
+          <w:szCs w:val="24"/>
+          <w:lang w:val="es-ES"/>
+        </w:rPr>
+        <w:t>MCP</w:t>
+      </w:r>
+      <w:proofErr w:type="gramEnd"/>
+      <w:r>
+        <w:rPr>
+          <w:rFonts w:cstheme="minorHAnsi"/>
+          <w:b/>
+          <w:bCs/>
+          <w:sz w:val="24"/>
+          <w:szCs w:val="24"/>
+          <w:lang w:val="es-ES"/>
+        </w:rPr>
+        <w:t>23008T-E/SS</w:t>
+      </w:r>
+      <w:r>
+        <w:rPr>
+          <w:rFonts w:cstheme="minorHAnsi"/>
+          <w:b/>
+          <w:bCs/>
+          <w:sz w:val="24"/>
+          <w:szCs w:val="24"/>
+          <w:lang w:val="es-ES"/>
+        </w:rPr>
+        <w:t xml:space="preserve"> y</w:t>
+      </w:r>
+      <w:r>
+        <w:rPr>
+          <w:rFonts w:cstheme="minorHAnsi"/>
+          <w:b/>
+          <w:bCs/>
+          <w:sz w:val="24"/>
+          <w:szCs w:val="24"/>
+        </w:rPr>
+        <w:t xml:space="preserve"> </w:t>
+      </w:r>
+      <w:r>
+        <w:rPr>
+          <w:rFonts w:cstheme="minorHAnsi" w:hint="eastAsia"/>
+          <w:b/>
+          <w:bCs/>
+          <w:sz w:val="24"/>
+          <w:szCs w:val="24"/>
+        </w:rPr>
+        <w:t>MCP23017T-E/SS</w:t>
+      </w:r>
+      <w:r>
+        <w:rPr>
+          <w:rFonts w:cstheme="minorHAnsi"/>
+          <w:sz w:val="24"/>
+          <w:szCs w:val="24"/>
+        </w:rPr>
+        <w:t xml:space="preserve">, la principal diferencia entre los dos es el empaquetado, esto me jode en el tamaño, voy a empezar con el MCP23017 porque es el mas comercial y el que </w:t>
+      </w:r>
+      <w:proofErr w:type="spellStart"/>
+      <w:r>
+        <w:rPr>
+          <w:rFonts w:cstheme="minorHAnsi"/>
+          <w:sz w:val="24"/>
+          <w:szCs w:val="24"/>
+        </w:rPr>
+        <w:t>mas</w:t>
+      </w:r>
+      <w:proofErr w:type="spellEnd"/>
+      <w:r>
+        <w:rPr>
+          <w:rFonts w:cstheme="minorHAnsi"/>
+          <w:sz w:val="24"/>
+          <w:szCs w:val="24"/>
+        </w:rPr>
+        <w:t xml:space="preserve"> </w:t>
+      </w:r>
+      <w:proofErr w:type="spellStart"/>
+      <w:r>
+        <w:rPr>
+          <w:rFonts w:cstheme="minorHAnsi"/>
+          <w:sz w:val="24"/>
+          <w:szCs w:val="24"/>
+        </w:rPr>
+        <w:t>datasheets</w:t>
+      </w:r>
+      <w:proofErr w:type="spellEnd"/>
+      <w:r>
+        <w:rPr>
+          <w:rFonts w:cstheme="minorHAnsi"/>
+          <w:sz w:val="24"/>
+          <w:szCs w:val="24"/>
+        </w:rPr>
+        <w:t xml:space="preserve"> tiene pero si veo que estoy jugado de espacio.</w:t>
+      </w:r>
+    </w:p>
+    <w:p>
+      <w:pPr>
+        <w:rPr>
+          <w:rFonts w:cstheme="minorHAnsi"/>
+          <w:sz w:val="24"/>
+          <w:szCs w:val="24"/>
+        </w:rPr>
+      </w:pPr>
+      <w:r>
+        <w:rPr>
+          <w:rFonts w:cstheme="minorHAnsi"/>
+          <w:sz w:val="24"/>
+          <w:szCs w:val="24"/>
+        </w:rPr>
+        <w:t xml:space="preserve">Usamos un conector de 16 Pines: </w:t>
+      </w:r>
+      <w:r>
+        <w:rPr>
+          <w:rFonts w:cstheme="minorHAnsi" w:hint="eastAsia"/>
+          <w:sz w:val="24"/>
+          <w:szCs w:val="24"/>
+        </w:rPr>
+        <w:t>2.54-2*8PPin</w:t>
+      </w:r>
+      <w:r>
+        <w:rPr>
+          <w:rFonts w:cstheme="minorHAnsi"/>
+          <w:sz w:val="24"/>
+          <w:szCs w:val="24"/>
+        </w:rPr>
+        <w:t>.</w:t>
+      </w:r>
+    </w:p>
+    <w:p>
+      <w:pPr>
+        <w:rPr>
+          <w:rFonts w:cstheme="minorHAnsi"/>
+          <w:sz w:val="24"/>
+          <w:szCs w:val="24"/>
+        </w:rPr>
+      </w:pPr>
+      <w:r>
+        <w:rPr>
+          <w:rFonts w:cstheme="minorHAnsi"/>
+          <w:sz w:val="24"/>
+          <w:szCs w:val="24"/>
+        </w:rPr>
+        <w:t xml:space="preserve">Usamos Resistencias de 4.7K: </w:t>
+      </w:r>
+      <w:r>
+        <w:rPr>
+          <w:rFonts w:cstheme="minorHAnsi" w:hint="eastAsia"/>
+          <w:sz w:val="24"/>
+          <w:szCs w:val="24"/>
+        </w:rPr>
+        <w:t>1206W4J0472T5E</w:t>
+      </w:r>
+    </w:p>
+    <w:p>
+      <w:pPr>
+        <w:rPr>
+          <w:rFonts w:cstheme="minorHAnsi"/>
+          <w:sz w:val="24"/>
+          <w:szCs w:val="24"/>
+        </w:rPr>
+      </w:pPr>
+      <w:r>
+        <w:rPr>
+          <w:rFonts w:cstheme="minorHAnsi"/>
+          <w:sz w:val="24"/>
+          <w:szCs w:val="24"/>
+        </w:rPr>
+        <w:t xml:space="preserve">Usamos Resistencia de 10K: </w:t>
+      </w:r>
+      <w:r>
+        <w:rPr>
+          <w:rFonts w:cstheme="minorHAnsi" w:hint="eastAsia"/>
+          <w:sz w:val="24"/>
+          <w:szCs w:val="24"/>
+        </w:rPr>
+        <w:t>1206W4J0103T5E</w:t>
+      </w:r>
+    </w:p>
+    <w:p>
+      <w:pPr>
+        <w:rPr>
+          <w:rFonts w:cstheme="minorHAnsi"/>
+          <w:sz w:val="24"/>
+          <w:szCs w:val="24"/>
+        </w:rPr>
+      </w:pPr>
+      <w:r>
+        <w:rPr>
+          <w:rFonts w:cstheme="minorHAnsi"/>
+          <w:sz w:val="24"/>
+          <w:szCs w:val="24"/>
+        </w:rPr>
+        <w:t xml:space="preserve">Capacitor 100nF para no permitir el paso del ruido:  </w:t>
+      </w:r>
+      <w:r>
+        <w:rPr>
+          <w:rFonts w:cstheme="minorHAnsi" w:hint="eastAsia"/>
+          <w:sz w:val="24"/>
+          <w:szCs w:val="24"/>
+        </w:rPr>
+        <w:t>CL05B104KO5NNNC</w:t>
+      </w:r>
+    </w:p>
+    <w:p>
+      <w:pPr>
+        <w:rPr>
+          <w:rFonts w:cstheme="minorHAnsi"/>
+          <w:sz w:val="24"/>
+          <w:szCs w:val="24"/>
+        </w:rPr>
+      </w:pPr>
+      <w:r>
+        <w:rPr>
+          <w:rFonts w:cstheme="minorHAnsi"/>
+          <w:sz w:val="24"/>
+          <w:szCs w:val="24"/>
+        </w:rPr>
+        <w:lastRenderedPageBreak/>
+        <w:t xml:space="preserve">Me base para conexiones en: </w:t>
+      </w:r>
+    </w:p>
+    <w:p>
+      <w:pPr>
+        <w:rPr>
+          <w:rFonts w:cstheme="minorHAnsi"/>
+          <w:sz w:val="24"/>
+          <w:szCs w:val="24"/>
+        </w:rPr>
+      </w:pPr>
+      <w:hyperlink r:id="rId4" w:history="1">
+        <w:r>
+          <w:rPr>
+            <w:rStyle w:val="Hipervnculo"/>
+            <w:rFonts w:cstheme="minorHAnsi"/>
+            <w:sz w:val="24"/>
+            <w:szCs w:val="24"/>
+          </w:rPr>
+          <w:t>https://protosupplies.com/wp-content/uploads/2021/05/MCP23017-Module.jpg</w:t>
+        </w:r>
+      </w:hyperlink>
+    </w:p>
+    <w:p>
+      <w:pPr>
+        <w:rPr>
+          <w:rFonts w:cstheme="minorHAnsi"/>
+          <w:sz w:val="24"/>
+          <w:szCs w:val="24"/>
+        </w:rPr>
+      </w:pPr>
+      <w:r>
+        <w:rPr>
+          <w:rFonts w:cstheme="minorHAnsi"/>
+          <w:sz w:val="24"/>
+          <w:szCs w:val="24"/>
+        </w:rPr>
+        <w:t>chrome-extension://efaidnbmnnnibpcajpcglclefindmkaj/https://cdn-learn.adafruit.com/downloads/pdf/adafruit-mcp23017-i2c-gpio-expander.pdf</w:t>
+      </w:r>
+    </w:p>
+    <w:p>
+      <w:pPr>
+        <w:rPr>
+          <w:rFonts w:cstheme="minorHAnsi"/>
+          <w:sz w:val="24"/>
+          <w:szCs w:val="24"/>
+        </w:rPr>
+      </w:pPr>
+    </w:p>
+    <w:p>
+      <w:pPr>
+        <w:rPr>
+          <w:rFonts w:ascii="Aptos" w:hAnsi="Aptos"/>
+          <w:sz w:val="32"/>
+          <w:szCs w:val="32"/>
+          <w:u w:val="single"/>
+          <w:lang w:val="es-ES"/>
+        </w:rPr>
+      </w:pPr>
+      <w:r>
+        <w:rPr>
+          <w:rFonts w:ascii="Aptos" w:hAnsi="Aptos"/>
+          <w:sz w:val="32"/>
+          <w:szCs w:val="32"/>
+          <w:u w:val="single"/>
+          <w:lang w:val="es-ES"/>
+        </w:rPr>
+        <w:t>Led Encendido:</w:t>
+      </w:r>
+    </w:p>
+    <w:p>
+      <w:pPr>
+        <w:rPr>
+          <w:rFonts w:cstheme="minorHAnsi"/>
+          <w:sz w:val="24"/>
+          <w:szCs w:val="24"/>
+        </w:rPr>
+      </w:pPr>
+      <w:r>
+        <w:rPr>
+          <w:rFonts w:cstheme="minorHAnsi"/>
+          <w:sz w:val="24"/>
+          <w:szCs w:val="24"/>
+          <w:lang w:val="es-ES"/>
+        </w:rPr>
+        <w:t xml:space="preserve">El LED que elegimos fue: </w:t>
+      </w:r>
+      <w:r>
+        <w:rPr>
+          <w:rFonts w:cstheme="minorHAnsi"/>
+          <w:sz w:val="24"/>
+          <w:szCs w:val="24"/>
+        </w:rPr>
+        <w:t xml:space="preserve"> </w:t>
+      </w:r>
+      <w:r>
+        <w:rPr>
+          <w:rFonts w:cstheme="minorHAnsi" w:hint="eastAsia"/>
+          <w:sz w:val="24"/>
+          <w:szCs w:val="24"/>
+        </w:rPr>
+        <w:t>KT-0603R</w:t>
+      </w:r>
+      <w:r>
+        <w:rPr>
+          <w:rFonts w:cstheme="minorHAnsi"/>
+          <w:sz w:val="24"/>
+          <w:szCs w:val="24"/>
+        </w:rPr>
+        <w:t>.</w:t>
+      </w:r>
+    </w:p>
+    <w:p>
+      <w:pPr>
+        <w:rPr>
+          <w:rFonts w:cstheme="minorHAnsi"/>
+          <w:sz w:val="24"/>
+          <w:szCs w:val="24"/>
+        </w:rPr>
+      </w:pPr>
+      <w:r>
+        <w:rPr>
+          <w:rFonts w:cstheme="minorHAnsi"/>
+          <w:sz w:val="24"/>
+          <w:szCs w:val="24"/>
+        </w:rPr>
+        <w:t xml:space="preserve">Le agregamos una resistencia de 390 </w:t>
+      </w:r>
+      <w:proofErr w:type="spellStart"/>
+      <w:r>
+        <w:rPr>
+          <w:rFonts w:cstheme="minorHAnsi"/>
+          <w:sz w:val="24"/>
+          <w:szCs w:val="24"/>
+        </w:rPr>
+        <w:t>Ohms</w:t>
+      </w:r>
+      <w:proofErr w:type="spellEnd"/>
+      <w:r>
+        <w:rPr>
+          <w:rFonts w:cstheme="minorHAnsi"/>
+          <w:sz w:val="24"/>
+          <w:szCs w:val="24"/>
+        </w:rPr>
         <w:t xml:space="preserve">: </w:t>
       </w:r>
-    </w:p>
-    <w:p>
-      <w:pPr>
-        <w:rPr>
-          <w:rFonts w:cstheme="minorHAnsi"/>
-          <w:b/>
-          <w:bCs/>
-          <w:sz w:val="24"/>
-          <w:szCs w:val="24"/>
-        </w:rPr>
-      </w:pPr>
-    </w:p>
-    <w:bookmarkEnd w:id="1"/>
-    <w:p>
-      <w:pPr>
-        <w:rPr>
-          <w:rFonts w:cstheme="minorHAnsi"/>
-          <w:b/>
-          <w:bCs/>
-          <w:sz w:val="24"/>
-          <w:szCs w:val="24"/>
-        </w:rPr>
-      </w:pPr>
-      <w:r>
-        <w:rPr>
-          <w:rFonts w:cstheme="minorHAnsi"/>
-          <w:sz w:val="24"/>
-          <w:szCs w:val="24"/>
-        </w:rPr>
-        <w:t xml:space="preserve">Conector Servos: </w:t>
-      </w:r>
       <w:r>
         <w:rPr>
           <w:rFonts w:cstheme="minorHAnsi" w:hint="eastAsia"/>
-          <w:b/>
-          <w:bCs/>
-          <w:sz w:val="24"/>
-          <w:szCs w:val="24"/>
-        </w:rPr>
-        <w:t>2.54-2*3PPin</w:t>
-      </w:r>
-      <w:r>
-        <w:rPr>
-          <w:rFonts w:cstheme="minorHAnsi"/>
-          <w:b/>
-          <w:bCs/>
+          <w:sz w:val="24"/>
+          <w:szCs w:val="24"/>
+        </w:rPr>
+        <w:t>1206W4J0391T5E</w:t>
+      </w:r>
+      <w:r>
+        <w:rPr>
+          <w:rFonts w:cstheme="minorHAnsi"/>
+          <w:sz w:val="24"/>
+          <w:szCs w:val="24"/>
+        </w:rPr>
+        <w:t xml:space="preserve">. </w:t>
+      </w:r>
+    </w:p>
+    <w:p>
+      <w:pPr>
+        <w:rPr>
+          <w:rFonts w:ascii="Aptos" w:hAnsi="Aptos" w:cstheme="minorHAnsi"/>
+          <w:sz w:val="32"/>
+          <w:szCs w:val="32"/>
+          <w:u w:val="single"/>
+          <w:lang w:val="es-ES"/>
+        </w:rPr>
+      </w:pPr>
+      <w:r>
+        <w:rPr>
+          <w:rFonts w:ascii="Aptos" w:hAnsi="Aptos" w:cstheme="minorHAnsi"/>
+          <w:sz w:val="32"/>
+          <w:szCs w:val="32"/>
+          <w:u w:val="single"/>
+          <w:lang w:val="es-ES"/>
+        </w:rPr>
+        <w:t>Multiplexor I2C:</w:t>
+      </w:r>
+    </w:p>
+    <w:p>
+      <w:pPr>
+        <w:rPr>
+          <w:rFonts w:cstheme="minorHAnsi"/>
+          <w:sz w:val="24"/>
+          <w:szCs w:val="24"/>
+          <w:lang w:val="es-ES"/>
+        </w:rPr>
+      </w:pPr>
+      <w:r>
+        <w:rPr>
+          <w:rFonts w:cstheme="minorHAnsi"/>
+          <w:sz w:val="24"/>
+          <w:szCs w:val="24"/>
+          <w:lang w:val="es-ES"/>
+        </w:rPr>
+        <w:t xml:space="preserve">El Multiplexor que vamos a usar lo elegimos por el tamaño del empaquetado: </w:t>
+      </w:r>
+      <w:r>
+        <w:rPr>
+          <w:rFonts w:cstheme="minorHAnsi"/>
+          <w:sz w:val="24"/>
+          <w:szCs w:val="24"/>
+          <w:lang w:val="es-ES"/>
+        </w:rPr>
+        <w:t>TCA9548ARGER</w:t>
+      </w:r>
+      <w:r>
+        <w:rPr>
+          <w:rFonts w:cstheme="minorHAnsi"/>
+          <w:sz w:val="24"/>
+          <w:szCs w:val="24"/>
+          <w:lang w:val="es-ES"/>
+        </w:rPr>
+        <w:t xml:space="preserve"> </w:t>
+      </w:r>
+    </w:p>
+    <w:p>
+      <w:pPr>
+        <w:rPr>
+          <w:rFonts w:cstheme="minorHAnsi"/>
+          <w:sz w:val="24"/>
+          <w:szCs w:val="24"/>
+          <w:lang w:val="es-ES"/>
+        </w:rPr>
+      </w:pPr>
+      <w:r>
+        <w:rPr>
+          <w:rFonts w:cstheme="minorHAnsi"/>
+          <w:sz w:val="24"/>
+          <w:szCs w:val="24"/>
+          <w:lang w:val="es-ES"/>
+        </w:rPr>
+        <w:t xml:space="preserve">Conexiones: </w:t>
+      </w:r>
+      <w:hyperlink r:id="rId5" w:history="1">
+        <w:r>
+          <w:rPr>
+            <w:rStyle w:val="Hipervnculo"/>
+            <w:rFonts w:cstheme="minorHAnsi"/>
+            <w:sz w:val="24"/>
+            <w:szCs w:val="24"/>
+            <w:lang w:val="es-ES"/>
+          </w:rPr>
+          <w:t>https://www.ic-components.es/blog/TCA9548ARGER-I2C-switch-pinout-circuit-diagram-and-datasheet.jsp</w:t>
+        </w:r>
+      </w:hyperlink>
+    </w:p>
+    <w:p>
+      <w:pPr>
+        <w:rPr>
+          <w:rFonts w:cstheme="minorHAnsi"/>
+          <w:sz w:val="24"/>
+          <w:szCs w:val="24"/>
+        </w:rPr>
+      </w:pPr>
+      <w:r>
+        <w:rPr>
+          <w:rFonts w:cstheme="minorHAnsi"/>
+          <w:sz w:val="24"/>
+          <w:szCs w:val="24"/>
+          <w:lang w:val="es-ES"/>
+        </w:rPr>
+        <w:t xml:space="preserve">Resistencia de 4.7K: </w:t>
+      </w:r>
+      <w:r>
+        <w:rPr>
+          <w:rFonts w:cstheme="minorHAnsi" w:hint="eastAsia"/>
+          <w:sz w:val="24"/>
+          <w:szCs w:val="24"/>
+        </w:rPr>
+        <w:t>1206W4J0472T5E</w:t>
+      </w:r>
+      <w:r>
+        <w:rPr>
+          <w:rFonts w:cstheme="minorHAnsi"/>
           <w:sz w:val="24"/>
           <w:szCs w:val="24"/>
         </w:rPr>
@@ -664,59 +1361,296 @@
       <w:pPr>
         <w:rPr>
           <w:rFonts w:cstheme="minorHAnsi"/>
-          <w:b/>
-          <w:bCs/>
-          <w:sz w:val="24"/>
-          <w:szCs w:val="24"/>
-        </w:rPr>
-      </w:pPr>
-      <w:r>
-        <w:rPr>
-          <w:rFonts w:cstheme="minorHAnsi"/>
-          <w:sz w:val="24"/>
-          <w:szCs w:val="24"/>
-        </w:rPr>
-        <w:t>Cable</w:t>
-      </w:r>
-      <w:r>
-        <w:rPr>
-          <w:rFonts w:cstheme="minorHAnsi"/>
-          <w:sz w:val="24"/>
-          <w:szCs w:val="24"/>
-        </w:rPr>
-        <w:t xml:space="preserve"> Puente H:</w:t>
-      </w:r>
-      <w:r>
-        <w:rPr>
-          <w:rFonts w:cstheme="minorHAnsi"/>
-          <w:b/>
-          <w:bCs/>
+          <w:sz w:val="24"/>
+          <w:szCs w:val="24"/>
+        </w:rPr>
+      </w:pPr>
+      <w:r>
+        <w:rPr>
+          <w:rFonts w:cstheme="minorHAnsi"/>
+          <w:sz w:val="24"/>
+          <w:szCs w:val="24"/>
+        </w:rPr>
+        <w:t xml:space="preserve">Usamos un conector de 16 Pines: </w:t>
+      </w:r>
+      <w:r>
+        <w:rPr>
+          <w:rFonts w:cstheme="minorHAnsi" w:hint="eastAsia"/>
+          <w:sz w:val="24"/>
+          <w:szCs w:val="24"/>
+        </w:rPr>
+        <w:t>2.54-2*8PPin</w:t>
+      </w:r>
+      <w:r>
+        <w:rPr>
+          <w:rFonts w:cstheme="minorHAnsi"/>
+          <w:sz w:val="24"/>
+          <w:szCs w:val="24"/>
+        </w:rPr>
+        <w:t>.</w:t>
+      </w:r>
+    </w:p>
+    <w:p>
+      <w:pPr>
+        <w:rPr>
+          <w:rFonts w:cstheme="minorHAnsi"/>
+          <w:sz w:val="24"/>
+          <w:szCs w:val="24"/>
+          <w:lang w:val="es-ES"/>
+        </w:rPr>
+      </w:pPr>
+    </w:p>
+    <w:p>
+      <w:pPr>
+        <w:rPr>
+          <w:rFonts w:ascii="Aptos" w:hAnsi="Aptos" w:cstheme="minorHAnsi"/>
+          <w:sz w:val="32"/>
+          <w:szCs w:val="32"/>
+          <w:u w:val="single"/>
+          <w:lang w:val="es-ES"/>
+        </w:rPr>
+      </w:pPr>
+      <w:r>
+        <w:rPr>
+          <w:rFonts w:ascii="Aptos" w:hAnsi="Aptos" w:cstheme="minorHAnsi"/>
+          <w:sz w:val="32"/>
+          <w:szCs w:val="32"/>
+          <w:u w:val="single"/>
+          <w:lang w:val="es-ES"/>
+        </w:rPr>
+        <w:t>Amplificador</w:t>
+      </w:r>
+      <w:r>
+        <w:rPr>
+          <w:rFonts w:ascii="Aptos" w:hAnsi="Aptos" w:cstheme="minorHAnsi"/>
+          <w:sz w:val="32"/>
+          <w:szCs w:val="32"/>
+          <w:u w:val="single"/>
+          <w:lang w:val="es-ES"/>
+        </w:rPr>
+        <w:t>:</w:t>
+      </w:r>
+    </w:p>
+    <w:p>
+      <w:pPr>
+        <w:rPr>
+          <w:rFonts w:ascii="Aptos" w:hAnsi="Aptos"/>
+          <w:sz w:val="24"/>
+          <w:szCs w:val="24"/>
+          <w:lang w:val="es-ES"/>
+        </w:rPr>
+      </w:pPr>
+      <w:r>
+        <w:rPr>
+          <w:rFonts w:ascii="Aptos" w:hAnsi="Aptos"/>
+          <w:sz w:val="24"/>
+          <w:szCs w:val="24"/>
+          <w:lang w:val="es-ES"/>
+        </w:rPr>
+        <w:t xml:space="preserve">No lo vamos a hacer en esta versión porque se nos van los costos y porque requiere mucho tiempo para cosas innecesarias. </w:t>
+      </w:r>
+    </w:p>
+    <w:p>
+      <w:pPr>
+        <w:rPr>
+          <w:rFonts w:ascii="Aptos" w:hAnsi="Aptos" w:cstheme="minorHAnsi"/>
+          <w:sz w:val="32"/>
+          <w:szCs w:val="32"/>
+          <w:u w:val="single"/>
+          <w:lang w:val="es-ES"/>
+        </w:rPr>
+      </w:pPr>
+      <w:r>
+        <w:rPr>
+          <w:rFonts w:ascii="Aptos" w:hAnsi="Aptos" w:cstheme="minorHAnsi"/>
+          <w:sz w:val="32"/>
+          <w:szCs w:val="32"/>
+          <w:u w:val="single"/>
+          <w:lang w:val="es-ES"/>
+        </w:rPr>
+        <w:t>Información Batería</w:t>
+      </w:r>
+      <w:r>
+        <w:rPr>
+          <w:rFonts w:ascii="Aptos" w:hAnsi="Aptos" w:cstheme="minorHAnsi"/>
+          <w:sz w:val="32"/>
+          <w:szCs w:val="32"/>
+          <w:u w:val="single"/>
+          <w:lang w:val="es-ES"/>
+        </w:rPr>
+        <w:t>:</w:t>
+      </w:r>
+    </w:p>
+    <w:p>
+      <w:pPr>
+        <w:rPr>
+          <w:rFonts w:cstheme="minorHAnsi"/>
+          <w:b/>
+          <w:bCs/>
+          <w:sz w:val="24"/>
+          <w:szCs w:val="24"/>
+        </w:rPr>
+      </w:pPr>
+      <w:proofErr w:type="spellStart"/>
+      <w:r>
+        <w:rPr>
+          <w:rFonts w:cstheme="minorHAnsi"/>
+          <w:sz w:val="24"/>
+          <w:szCs w:val="24"/>
+        </w:rPr>
+        <w:t>Rele</w:t>
+      </w:r>
+      <w:proofErr w:type="spellEnd"/>
+      <w:r>
+        <w:rPr>
+          <w:rFonts w:cstheme="minorHAnsi"/>
+          <w:sz w:val="24"/>
+          <w:szCs w:val="24"/>
+        </w:rPr>
+        <w:t xml:space="preserve"> usado para lógica </w:t>
+      </w:r>
+      <w:proofErr w:type="spellStart"/>
+      <w:r>
+        <w:rPr>
+          <w:rFonts w:cstheme="minorHAnsi"/>
+          <w:sz w:val="24"/>
+          <w:szCs w:val="24"/>
+        </w:rPr>
+        <w:t>Rasp</w:t>
+      </w:r>
+      <w:proofErr w:type="spellEnd"/>
+      <w:r>
+        <w:rPr>
+          <w:rFonts w:cstheme="minorHAnsi"/>
+          <w:sz w:val="24"/>
+          <w:szCs w:val="24"/>
+        </w:rPr>
+        <w:t xml:space="preserve">: </w:t>
+      </w:r>
+      <w:r>
+        <w:rPr>
+          <w:rFonts w:cstheme="minorHAnsi" w:hint="eastAsia"/>
+          <w:b/>
+          <w:bCs/>
+          <w:sz w:val="24"/>
+          <w:szCs w:val="24"/>
+        </w:rPr>
+        <w:t>SRD-05VDC-SL-C</w:t>
+      </w:r>
+    </w:p>
+    <w:p>
+      <w:pPr>
+        <w:rPr>
+          <w:rFonts w:cstheme="minorHAnsi"/>
+          <w:sz w:val="24"/>
+          <w:szCs w:val="24"/>
+        </w:rPr>
+      </w:pPr>
+      <w:r>
+        <w:rPr>
+          <w:rFonts w:cstheme="minorHAnsi"/>
+          <w:sz w:val="24"/>
+          <w:szCs w:val="24"/>
+        </w:rPr>
+        <w:t>Resistencias THT: 47K y 1.5K de este estilo (</w:t>
+      </w:r>
+      <w:r>
+        <w:rPr>
+          <w:rFonts w:cstheme="minorHAnsi"/>
+          <w:sz w:val="24"/>
+          <w:szCs w:val="24"/>
+        </w:rPr>
+        <w:t>MFR0W4F1501A50</w:t>
+      </w:r>
+      <w:r>
+        <w:rPr>
+          <w:rFonts w:cstheme="minorHAnsi"/>
+          <w:sz w:val="24"/>
+          <w:szCs w:val="24"/>
+        </w:rPr>
+        <w:t xml:space="preserve">). </w:t>
+      </w:r>
+    </w:p>
+    <w:p>
+      <w:pPr>
+        <w:rPr>
+          <w:rFonts w:cstheme="minorHAnsi"/>
+          <w:b/>
+          <w:bCs/>
+          <w:sz w:val="24"/>
+          <w:szCs w:val="24"/>
+        </w:rPr>
+      </w:pPr>
+      <w:r>
+        <w:rPr>
+          <w:rFonts w:cstheme="minorHAnsi"/>
+          <w:sz w:val="24"/>
+          <w:szCs w:val="24"/>
+        </w:rPr>
+        <w:t xml:space="preserve">Transistor usado en lógica </w:t>
+      </w:r>
+      <w:proofErr w:type="spellStart"/>
+      <w:r>
+        <w:rPr>
+          <w:rFonts w:cstheme="minorHAnsi"/>
+          <w:sz w:val="24"/>
+          <w:szCs w:val="24"/>
+        </w:rPr>
+        <w:t>Rasp</w:t>
+      </w:r>
+      <w:proofErr w:type="spellEnd"/>
+      <w:r>
+        <w:rPr>
+          <w:rFonts w:cstheme="minorHAnsi"/>
+          <w:sz w:val="24"/>
+          <w:szCs w:val="24"/>
+        </w:rPr>
+        <w:t>:</w:t>
+      </w:r>
+      <w:r>
+        <w:rPr>
+          <w:rFonts w:cstheme="minorHAnsi"/>
           <w:sz w:val="24"/>
           <w:szCs w:val="24"/>
         </w:rPr>
         <w:t xml:space="preserve"> </w:t>
       </w:r>
-      <w:proofErr w:type="spellStart"/>
-      <w:r>
-        <w:rPr>
-          <w:rFonts w:cstheme="minorHAnsi"/>
-          <w:b/>
-          <w:bCs/>
-          <w:sz w:val="24"/>
-          <w:szCs w:val="24"/>
-        </w:rPr>
-        <w:t>hanxia</w:t>
-      </w:r>
-      <w:proofErr w:type="spellEnd"/>
-      <w:r>
-        <w:rPr>
-          <w:rFonts w:cstheme="minorHAnsi"/>
-          <w:b/>
-          <w:bCs/>
-          <w:sz w:val="24"/>
-          <w:szCs w:val="24"/>
-        </w:rPr>
-        <w:t xml:space="preserve"> HX PH2.0-4P ST 200mm 24AWG</w:t>
+      <w:r>
+        <w:rPr>
+          <w:rFonts w:cstheme="minorHAnsi" w:hint="eastAsia"/>
+          <w:b/>
+          <w:bCs/>
+          <w:sz w:val="24"/>
+          <w:szCs w:val="24"/>
+        </w:rPr>
+        <w:t>IRLML6344PBF-HXY</w:t>
+      </w:r>
+    </w:p>
+    <w:p>
+      <w:pPr>
+        <w:rPr>
+          <w:rFonts w:cstheme="minorHAnsi"/>
+          <w:sz w:val="24"/>
+          <w:szCs w:val="24"/>
+        </w:rPr>
+      </w:pPr>
+      <w:r>
+        <w:rPr>
+          <w:rFonts w:cstheme="minorHAnsi"/>
+          <w:sz w:val="24"/>
+          <w:szCs w:val="24"/>
+        </w:rPr>
+        <w:t xml:space="preserve">Diodo TVS: </w:t>
+      </w:r>
+      <w:r>
+        <w:rPr>
+          <w:rFonts w:cstheme="minorHAnsi" w:hint="eastAsia"/>
+          <w:b/>
+          <w:bCs/>
+          <w:sz w:val="24"/>
+          <w:szCs w:val="24"/>
+        </w:rPr>
+        <w:t>1N6267A-E3/54</w:t>
       </w:r>
       <w:r>
         <w:rPr>
@@ -727,45 +1661,6 @@
           <w:szCs w:val="24"/>
         </w:rPr>
         <w:t>.</w:t>
-      </w:r>
-    </w:p>
-    <w:p>
-      <w:pPr>
-        <w:rPr>
-          <w:rFonts w:cstheme="minorHAnsi"/>
-          <w:b/>
-          <w:bCs/>
-          <w:sz w:val="24"/>
-          <w:szCs w:val="24"/>
-        </w:rPr>
-      </w:pPr>
-      <w:r>
-        <w:rPr>
-          <w:rFonts w:cstheme="minorHAnsi"/>
-          <w:sz w:val="24"/>
-          <w:szCs w:val="24"/>
-        </w:rPr>
-        <w:t>Conector Puente H:</w:t>
-      </w:r>
-      <w:r>
-        <w:rPr>
-          <w:rFonts w:cstheme="minorHAnsi"/>
-          <w:b/>
-          <w:bCs/>
-          <w:sz w:val="24"/>
-          <w:szCs w:val="24"/>
-        </w:rPr>
-        <w:t xml:space="preserve"> </w:t>
-      </w:r>
-      <w:r>
-        <w:rPr>
-          <w:rFonts w:cstheme="minorHAnsi"/>
-          <w:b/>
-          <w:bCs/>
-          <w:sz w:val="24"/>
-          <w:szCs w:val="24"/>
-        </w:rPr>
-        <w:t>S4B-PH-K-S</w:t>
       </w:r>
     </w:p>
     <w:p>
@@ -1277,6 +2172,7 @@
   <w:style w:type="character" w:default="1" w:styleId="Fuentedeprrafopredeter">
     <w:name w:val="Default Paragraph Font"/>
     <w:uiPriority w:val="1"/>
+    <w:semiHidden/>
     <w:unhideWhenUsed/>
   </w:style>
   <w:style w:type="table" w:default="1" w:styleId="Tablanormal">
@@ -1311,6 +2207,29 @@
       <w:color w:val="2F5496" w:themeColor="accent1" w:themeShade="BF"/>
       <w:sz w:val="32"/>
       <w:szCs w:val="32"/>
+    </w:rPr>
+  </w:style>
+  <w:style w:type="character" w:styleId="Hipervnculo">
+    <w:name w:val="Hyperlink"/>
+    <w:basedOn w:val="Fuentedeprrafopredeter"/>
+    <w:uiPriority w:val="99"/>
+    <w:unhideWhenUsed/>
+    <w:rsid w:val="004F7214"/>
+    <w:rPr>
+      <w:color w:val="0563C1" w:themeColor="hyperlink"/>
+      <w:u w:val="single"/>
+    </w:rPr>
+  </w:style>
+  <w:style w:type="character" w:styleId="Mencinsinresolver">
+    <w:name w:val="Unresolved Mention"/>
+    <w:basedOn w:val="Fuentedeprrafopredeter"/>
+    <w:uiPriority w:val="99"/>
+    <w:semiHidden/>
+    <w:unhideWhenUsed/>
+    <w:rsid w:val="004F7214"/>
+    <w:rPr>
+      <w:color w:val="605E5C"/>
+      <w:shd w:val="clear" w:color="auto" w:fill="E1DFDD"/>
     </w:rPr>
   </w:style>
 </w:styles>

</xml_diff>

<commit_message>
Agregamos Huellas y se dividio en hojas jerarquicas
</commit_message>
<xml_diff>
--- a/Salus IV/Lista Componentes.docx
+++ b/Salus IV/Lista Componentes.docx
@@ -909,7 +909,25 @@
           <w:sz w:val="24"/>
           <w:szCs w:val="24"/>
         </w:rPr>
-        <w:t xml:space="preserve">, la principal diferencia entre los dos es el empaquetado, esto me jode en el tamaño, voy a empezar con el MCP23017 porque es el mas comercial y el que </w:t>
+        <w:t xml:space="preserve">, la principal diferencia entre los dos es el empaquetado, esto me jode en el tamaño, voy a empezar con el MCP23017 porque es el </w:t>
+      </w:r>
+      <w:proofErr w:type="spellStart"/>
+      <w:r>
+        <w:rPr>
+          <w:rFonts w:cstheme="minorHAnsi"/>
+          <w:sz w:val="24"/>
+          <w:szCs w:val="24"/>
+        </w:rPr>
+        <w:t>mas</w:t>
+      </w:r>
+      <w:proofErr w:type="spellEnd"/>
+      <w:r>
+        <w:rPr>
+          <w:rFonts w:cstheme="minorHAnsi"/>
+          <w:sz w:val="24"/>
+          <w:szCs w:val="24"/>
+        </w:rPr>
+        <w:t xml:space="preserve"> comercial y el que </w:t>
       </w:r>
       <w:proofErr w:type="spellStart"/>
       <w:r>
@@ -1630,6 +1648,8 @@
       <w:pPr>
         <w:rPr>
           <w:rFonts w:cstheme="minorHAnsi"/>
+          <w:b/>
+          <w:bCs/>
           <w:sz w:val="24"/>
           <w:szCs w:val="24"/>
         </w:rPr>
@@ -1666,20 +1686,78 @@
     <w:p>
       <w:pPr>
         <w:rPr>
-          <w:rFonts w:cstheme="minorHAnsi"/>
-          <w:sz w:val="24"/>
-          <w:szCs w:val="24"/>
-        </w:rPr>
-      </w:pPr>
-    </w:p>
-    <w:p>
-      <w:pPr>
-        <w:rPr>
-          <w:rFonts w:cstheme="minorHAnsi"/>
-          <w:sz w:val="24"/>
-          <w:szCs w:val="24"/>
-        </w:rPr>
-      </w:pPr>
+          <w:rFonts w:ascii="Aptos" w:hAnsi="Aptos" w:cstheme="minorHAnsi"/>
+          <w:sz w:val="32"/>
+          <w:szCs w:val="32"/>
+          <w:u w:val="single"/>
+          <w:lang w:val="es-ES"/>
+        </w:rPr>
+      </w:pPr>
+      <w:r>
+        <w:rPr>
+          <w:rFonts w:ascii="Aptos" w:hAnsi="Aptos" w:cstheme="minorHAnsi"/>
+          <w:sz w:val="32"/>
+          <w:szCs w:val="32"/>
+          <w:u w:val="single"/>
+          <w:lang w:val="es-ES"/>
+        </w:rPr>
+        <w:t xml:space="preserve">Armado ESP32: </w:t>
+      </w:r>
+    </w:p>
+    <w:p>
+      <w:pPr>
+        <w:rPr>
+          <w:rFonts w:cstheme="minorHAnsi"/>
+          <w:sz w:val="24"/>
+          <w:szCs w:val="24"/>
+        </w:rPr>
+      </w:pPr>
+      <w:r>
+        <w:rPr>
+          <w:rFonts w:cstheme="minorHAnsi"/>
+          <w:sz w:val="24"/>
+          <w:szCs w:val="24"/>
+        </w:rPr>
+        <w:t xml:space="preserve">Video tutorial: </w:t>
+      </w:r>
+      <w:hyperlink r:id="rId6" w:history="1">
+        <w:r>
+          <w:rPr>
+            <w:rStyle w:val="Hipervnculo"/>
+            <w:rFonts w:cstheme="minorHAnsi"/>
+            <w:sz w:val="24"/>
+            <w:szCs w:val="24"/>
+          </w:rPr>
+          <w:t>https://www.youtube.com/watch?v=U1wLDvrBLVI</w:t>
+        </w:r>
+      </w:hyperlink>
+    </w:p>
+    <w:p>
+      <w:pPr>
+        <w:rPr>
+          <w:rFonts w:cstheme="minorHAnsi"/>
+          <w:sz w:val="24"/>
+          <w:szCs w:val="24"/>
+        </w:rPr>
+      </w:pPr>
+      <w:r>
+        <w:rPr>
+          <w:rFonts w:cstheme="minorHAnsi"/>
+          <w:sz w:val="24"/>
+          <w:szCs w:val="24"/>
+        </w:rPr>
+        <w:t xml:space="preserve">Video de </w:t>
+      </w:r>
+      <w:proofErr w:type="spellStart"/>
+      <w:r>
+        <w:rPr>
+          <w:rFonts w:cstheme="minorHAnsi"/>
+          <w:sz w:val="24"/>
+          <w:szCs w:val="24"/>
+        </w:rPr>
+        <w:t>Guia</w:t>
+      </w:r>
+      <w:proofErr w:type="spellEnd"/>
       <w:r>
         <w:rPr>
           <w:rFonts w:cstheme="minorHAnsi"/>
@@ -1688,16 +1766,826 @@
         </w:rPr>
         <w:t xml:space="preserve"> </w:t>
       </w:r>
-    </w:p>
-    <w:p>
-      <w:pPr>
-        <w:rPr>
-          <w:rFonts w:cstheme="minorHAnsi"/>
-          <w:sz w:val="24"/>
-          <w:szCs w:val="24"/>
-          <w:lang w:val="es-ES"/>
-        </w:rPr>
-      </w:pPr>
+      <w:proofErr w:type="spellStart"/>
+      <w:r>
+        <w:rPr>
+          <w:rFonts w:cstheme="minorHAnsi"/>
+          <w:sz w:val="24"/>
+          <w:szCs w:val="24"/>
+        </w:rPr>
+        <w:t>Esquematica</w:t>
+      </w:r>
+      <w:proofErr w:type="spellEnd"/>
+      <w:r>
+        <w:rPr>
+          <w:rFonts w:cstheme="minorHAnsi"/>
+          <w:sz w:val="24"/>
+          <w:szCs w:val="24"/>
+        </w:rPr>
+        <w:t xml:space="preserve">: </w:t>
+      </w:r>
+      <w:hyperlink r:id="rId7" w:history="1">
+        <w:r>
+          <w:rPr>
+            <w:rStyle w:val="Hipervnculo"/>
+            <w:rFonts w:cstheme="minorHAnsi"/>
+            <w:sz w:val="24"/>
+            <w:szCs w:val="24"/>
+          </w:rPr>
+          <w:t>https://www.yout</w:t>
+        </w:r>
+        <w:r>
+          <w:rPr>
+            <w:rStyle w:val="Hipervnculo"/>
+            <w:rFonts w:cstheme="minorHAnsi"/>
+            <w:sz w:val="24"/>
+            <w:szCs w:val="24"/>
+          </w:rPr>
+          <w:t>u</w:t>
+        </w:r>
+        <w:r>
+          <w:rPr>
+            <w:rStyle w:val="Hipervnculo"/>
+            <w:rFonts w:cstheme="minorHAnsi"/>
+            <w:sz w:val="24"/>
+            <w:szCs w:val="24"/>
+          </w:rPr>
+          <w:t>be.com/watch?v=l0SyRu5H_q8&amp;t=16s</w:t>
+        </w:r>
+      </w:hyperlink>
+    </w:p>
+    <w:p>
+      <w:r>
+        <w:rPr>
+          <w:noProof/>
+        </w:rPr>
+        <w:lastRenderedPageBreak/>
+        <w:drawing>
+          <wp:inline distT="0" distB="0" distL="0" distR="0" wp14:anchorId="18C5578F" wp14:editId="60472CEF">
+            <wp:extent cx="5400040" cy="3853815"/>
+            <wp:effectExtent l="0" t="0" r="0" b="0"/>
+            <wp:docPr id="1452632884" name="Imagen 1"/>
+            <wp:cNvGraphicFramePr>
+              <a:graphicFrameLocks xmlns:a="http://schemas.openxmlformats.org/drawingml/2006/main" noChangeAspect="1"/>
+            </wp:cNvGraphicFramePr>
+            <a:graphic xmlns:a="http://schemas.openxmlformats.org/drawingml/2006/main">
+              <a:graphicData uri="http://schemas.openxmlformats.org/drawingml/2006/picture">
+                <pic:pic xmlns:pic="http://schemas.openxmlformats.org/drawingml/2006/picture">
+                  <pic:nvPicPr>
+                    <pic:cNvPr id="1452632884" name=""/>
+                    <pic:cNvPicPr/>
+                  </pic:nvPicPr>
+                  <pic:blipFill>
+                    <a:blip r:embed="rId8"/>
+                    <a:stretch>
+                      <a:fillRect/>
+                    </a:stretch>
+                  </pic:blipFill>
+                  <pic:spPr>
+                    <a:xfrm>
+                      <a:off x="0" y="0"/>
+                      <a:ext cx="5400040" cy="3853815"/>
+                    </a:xfrm>
+                    <a:prstGeom prst="rect">
+                      <a:avLst/>
+                    </a:prstGeom>
+                  </pic:spPr>
+                </pic:pic>
+              </a:graphicData>
+            </a:graphic>
+          </wp:inline>
+        </w:drawing>
+      </w:r>
+    </w:p>
+    <w:p>
+      <w:r>
+        <w:t xml:space="preserve">A esto hay que sumarle el regulador de voltaje y </w:t>
+      </w:r>
+      <w:r>
+        <w:t>la resistencia</w:t>
+      </w:r>
+      <w:r>
+        <w:t xml:space="preserve"> </w:t>
+      </w:r>
+      <w:proofErr w:type="spellStart"/>
+      <w:r>
+        <w:t>pull</w:t>
+      </w:r>
+      <w:proofErr w:type="spellEnd"/>
+      <w:r>
+        <w:t>-up para I2C, además de las conexiones de USB-C como lo hace en el video, igualmente es una buena guía.</w:t>
+      </w:r>
+    </w:p>
+    <w:p>
+      <w:hyperlink r:id="rId9" w:history="1">
+        <w:r>
+          <w:rPr>
+            <w:rStyle w:val="Hipervnculo"/>
+          </w:rPr>
+          <w:t>https://ibb.co/G4pJK0nm</w:t>
+        </w:r>
+      </w:hyperlink>
+      <w:r>
+        <w:t xml:space="preserve"> Es un </w:t>
+      </w:r>
+      <w:r>
+        <w:t>esquemático</w:t>
+      </w:r>
+      <w:r>
+        <w:t xml:space="preserve"> que hizo un usuario de Reddit.</w:t>
+      </w:r>
+    </w:p>
+    <w:p>
+      <w:pPr>
+        <w:rPr>
+          <w:b/>
+          <w:bCs/>
+        </w:rPr>
+      </w:pPr>
+      <w:r>
+        <w:t xml:space="preserve">Podemos ver este componente </w:t>
+      </w:r>
+      <w:r>
+        <w:rPr>
+          <w:b/>
+          <w:bCs/>
+        </w:rPr>
+        <w:t>USBLC6-2SC6</w:t>
+      </w:r>
+      <w:r>
+        <w:rPr>
+          <w:b/>
+          <w:bCs/>
+        </w:rPr>
+        <w:t xml:space="preserve"> que es para la protección de Descargas electroestáticas. </w:t>
+      </w:r>
+    </w:p>
+    <w:p>
+      <w:pPr>
+        <w:rPr>
+          <w:b/>
+          <w:bCs/>
+        </w:rPr>
+      </w:pPr>
+      <w:hyperlink r:id="rId10" w:history="1">
+        <w:r>
+          <w:rPr>
+            <w:rStyle w:val="Hipervnculo"/>
+            <w:b/>
+            <w:bCs/>
+          </w:rPr>
+          <w:t>https://documentation.espressif.com/esp32-s3-wroom-1_wroom-1u_datasheet_en.pdf</w:t>
+        </w:r>
+      </w:hyperlink>
+    </w:p>
+    <w:p>
+      <w:pPr>
+        <w:rPr>
+          <w:b/>
+          <w:bCs/>
+        </w:rPr>
+      </w:pPr>
+      <w:hyperlink r:id="rId11" w:history="1">
+        <w:r>
+          <w:rPr>
+            <w:rStyle w:val="Hipervnculo"/>
+            <w:b/>
+            <w:bCs/>
+          </w:rPr>
+          <w:t>https://www.reddit.com/r/esp32/?f=flair_name%3A%22</w:t>
+        </w:r>
+        <w:r>
+          <w:rPr>
+            <w:rStyle w:val="Hipervnculo"/>
+            <w:b/>
+            <w:bCs/>
+          </w:rPr>
+          <w:t>B</w:t>
+        </w:r>
+        <w:r>
+          <w:rPr>
+            <w:rStyle w:val="Hipervnculo"/>
+            <w:b/>
+            <w:bCs/>
+          </w:rPr>
+          <w:t>oard%20Review%22</w:t>
+        </w:r>
+      </w:hyperlink>
+      <w:r>
+        <w:rPr>
+          <w:b/>
+          <w:bCs/>
+        </w:rPr>
+        <w:t xml:space="preserve"> Este link nos lleva a ejemplos de personas en Reddit que piden revisión.</w:t>
+      </w:r>
+    </w:p>
+    <w:p>
+      <w:pPr>
+        <w:rPr>
+          <w:b/>
+          <w:bCs/>
+        </w:rPr>
+      </w:pPr>
+    </w:p>
+    <w:p>
+      <w:pPr>
+        <w:rPr>
+          <w:b/>
+          <w:bCs/>
+        </w:rPr>
+      </w:pPr>
+      <w:r>
+        <w:rPr>
+          <w:b/>
+          <w:bCs/>
+        </w:rPr>
+        <w:t xml:space="preserve">Para el </w:t>
+      </w:r>
+      <w:proofErr w:type="spellStart"/>
+      <w:r>
+        <w:rPr>
+          <w:b/>
+          <w:bCs/>
+        </w:rPr>
+        <w:t>reincio</w:t>
+      </w:r>
+      <w:proofErr w:type="spellEnd"/>
+      <w:r>
+        <w:rPr>
+          <w:b/>
+          <w:bCs/>
+        </w:rPr>
+        <w:t xml:space="preserve"> del Chip: </w:t>
+      </w:r>
+      <w:r>
+        <w:rPr>
+          <w:b/>
+          <w:bCs/>
+        </w:rPr>
+        <w:t xml:space="preserve">El ajuste recomendado para el circuito de retardo RC suele ser R = 10 </w:t>
+      </w:r>
+      <w:proofErr w:type="spellStart"/>
+      <w:r>
+        <w:rPr>
+          <w:b/>
+          <w:bCs/>
+        </w:rPr>
+        <w:t>kΩ</w:t>
+      </w:r>
+      <w:proofErr w:type="spellEnd"/>
+      <w:r>
+        <w:rPr>
+          <w:b/>
+          <w:bCs/>
+        </w:rPr>
+        <w:t xml:space="preserve"> y C = 1 </w:t>
+      </w:r>
+      <w:proofErr w:type="spellStart"/>
+      <w:r>
+        <w:rPr>
+          <w:b/>
+          <w:bCs/>
+        </w:rPr>
+        <w:t>μF</w:t>
+      </w:r>
+      <w:proofErr w:type="spellEnd"/>
+      <w:r>
+        <w:rPr>
+          <w:b/>
+          <w:bCs/>
+        </w:rPr>
+        <w:t>. Sin embargo, se deben ajustar parámetros específicos según las características de la fuente de alimentación y la sincronización de encendido y reinicio del chip.</w:t>
+      </w:r>
+    </w:p>
+    <w:p>
+      <w:pPr>
+        <w:rPr>
+          <w:b/>
+          <w:bCs/>
+        </w:rPr>
+      </w:pPr>
+      <w:hyperlink r:id="rId12" w:history="1">
+        <w:r>
+          <w:rPr>
+            <w:rStyle w:val="Hipervnculo"/>
+            <w:b/>
+            <w:bCs/>
+          </w:rPr>
+          <w:t>https://docs.espressif.com/projects/esp-hardware-design-guidelines/en/latest/esp32s3/schematic-checklist.html</w:t>
+        </w:r>
+      </w:hyperlink>
+      <w:r>
+        <w:rPr>
+          <w:b/>
+          <w:bCs/>
+        </w:rPr>
+        <w:t xml:space="preserve"> Para </w:t>
+      </w:r>
+      <w:proofErr w:type="spellStart"/>
+      <w:r>
+        <w:rPr>
+          <w:b/>
+          <w:bCs/>
+        </w:rPr>
+        <w:t>guia</w:t>
+      </w:r>
+      <w:proofErr w:type="spellEnd"/>
+      <w:r>
+        <w:rPr>
+          <w:b/>
+          <w:bCs/>
+        </w:rPr>
+        <w:t xml:space="preserve"> de conexiones y </w:t>
+      </w:r>
+      <w:proofErr w:type="spellStart"/>
+      <w:r>
+        <w:rPr>
+          <w:b/>
+          <w:bCs/>
+        </w:rPr>
+        <w:t>esquematico</w:t>
+      </w:r>
+      <w:proofErr w:type="spellEnd"/>
+    </w:p>
+    <w:p>
+      <w:pPr>
+        <w:rPr>
+          <w:b/>
+          <w:bCs/>
+        </w:rPr>
+      </w:pPr>
+      <w:r>
+        <w:rPr>
+          <w:noProof/>
+        </w:rPr>
+        <w:lastRenderedPageBreak/>
+        <w:drawing>
+          <wp:inline distT="0" distB="0" distL="0" distR="0" wp14:anchorId="0231EAB4" wp14:editId="337A8975">
+            <wp:extent cx="5400040" cy="3576955"/>
+            <wp:effectExtent l="0" t="0" r="0" b="4445"/>
+            <wp:docPr id="1567547339" name="Imagen 1"/>
+            <wp:cNvGraphicFramePr>
+              <a:graphicFrameLocks xmlns:a="http://schemas.openxmlformats.org/drawingml/2006/main" noChangeAspect="1"/>
+            </wp:cNvGraphicFramePr>
+            <a:graphic xmlns:a="http://schemas.openxmlformats.org/drawingml/2006/main">
+              <a:graphicData uri="http://schemas.openxmlformats.org/drawingml/2006/picture">
+                <pic:pic xmlns:pic="http://schemas.openxmlformats.org/drawingml/2006/picture">
+                  <pic:nvPicPr>
+                    <pic:cNvPr id="0" name="Picture 1"/>
+                    <pic:cNvPicPr>
+                      <a:picLocks noChangeAspect="1" noChangeArrowheads="1"/>
+                    </pic:cNvPicPr>
+                  </pic:nvPicPr>
+                  <pic:blipFill>
+                    <a:blip r:embed="rId13" cstate="print">
+                      <a:extLst>
+                        <a:ext uri="{28A0092B-C50C-407E-A947-70E740481C1C}">
+                          <a14:useLocalDpi xmlns:a14="http://schemas.microsoft.com/office/drawing/2010/main" val="0"/>
+                        </a:ext>
+                      </a:extLst>
+                    </a:blip>
+                    <a:srcRect/>
+                    <a:stretch>
+                      <a:fillRect/>
+                    </a:stretch>
+                  </pic:blipFill>
+                  <pic:spPr bwMode="auto">
+                    <a:xfrm>
+                      <a:off x="0" y="0"/>
+                      <a:ext cx="5400040" cy="3576955"/>
+                    </a:xfrm>
+                    <a:prstGeom prst="rect">
+                      <a:avLst/>
+                    </a:prstGeom>
+                    <a:noFill/>
+                    <a:ln>
+                      <a:noFill/>
+                    </a:ln>
+                  </pic:spPr>
+                </pic:pic>
+              </a:graphicData>
+            </a:graphic>
+          </wp:inline>
+        </w:drawing>
+      </w:r>
+    </w:p>
+    <w:p>
+      <w:pPr>
+        <w:rPr>
+          <w:b/>
+          <w:bCs/>
+        </w:rPr>
+      </w:pPr>
+      <w:r>
+        <w:rPr>
+          <w:b/>
+          <w:bCs/>
+        </w:rPr>
+        <w:t xml:space="preserve">Placa usada por </w:t>
+      </w:r>
+      <w:proofErr w:type="spellStart"/>
+      <w:r>
+        <w:rPr>
+          <w:b/>
+          <w:bCs/>
+        </w:rPr>
+        <w:t>NodeMCU</w:t>
+      </w:r>
+      <w:proofErr w:type="spellEnd"/>
+    </w:p>
+    <w:p>
+      <w:pPr>
+        <w:rPr>
+          <w:b/>
+          <w:bCs/>
+        </w:rPr>
+      </w:pPr>
+    </w:p>
+    <w:p>
+      <w:pPr>
+        <w:rPr>
+          <w:rFonts w:cstheme="minorHAnsi"/>
+          <w:sz w:val="24"/>
+          <w:szCs w:val="24"/>
+        </w:rPr>
+      </w:pPr>
+      <w:hyperlink r:id="rId14" w:history="1">
+        <w:r>
+          <w:rPr>
+            <w:rStyle w:val="Hipervnculo"/>
+            <w:rFonts w:cstheme="minorHAnsi"/>
+            <w:sz w:val="24"/>
+            <w:szCs w:val="24"/>
+          </w:rPr>
+          <w:t>https://forum.arduino.cc/t/esp32-project-support/1065319</w:t>
+        </w:r>
+      </w:hyperlink>
+      <w:r>
+        <w:rPr>
+          <w:rFonts w:cstheme="minorHAnsi"/>
+          <w:sz w:val="24"/>
+          <w:szCs w:val="24"/>
+        </w:rPr>
+        <w:t xml:space="preserve"> </w:t>
+      </w:r>
+    </w:p>
+    <w:p>
+      <w:pPr>
+        <w:rPr>
+          <w:rFonts w:cstheme="minorHAnsi"/>
+          <w:sz w:val="24"/>
+          <w:szCs w:val="24"/>
+        </w:rPr>
+      </w:pPr>
+      <w:r>
+        <w:rPr>
+          <w:rFonts w:cstheme="minorHAnsi"/>
+          <w:sz w:val="24"/>
+          <w:szCs w:val="24"/>
+        </w:rPr>
+        <w:t xml:space="preserve">Foro </w:t>
+      </w:r>
+      <w:r>
+        <w:rPr>
+          <w:rFonts w:cstheme="minorHAnsi"/>
+          <w:sz w:val="24"/>
+          <w:szCs w:val="24"/>
+        </w:rPr>
+        <w:t>útil</w:t>
+      </w:r>
+      <w:r>
+        <w:rPr>
+          <w:rFonts w:cstheme="minorHAnsi"/>
+          <w:sz w:val="24"/>
+          <w:szCs w:val="24"/>
+        </w:rPr>
+        <w:t xml:space="preserve"> arriba</w:t>
+      </w:r>
+    </w:p>
+    <w:p>
+      <w:pPr>
+        <w:rPr>
+          <w:rFonts w:cstheme="minorHAnsi"/>
+          <w:sz w:val="32"/>
+          <w:szCs w:val="32"/>
+          <w:u w:val="single"/>
+        </w:rPr>
+      </w:pPr>
+      <w:r>
+        <w:rPr>
+          <w:rFonts w:cstheme="minorHAnsi"/>
+          <w:sz w:val="32"/>
+          <w:szCs w:val="32"/>
+          <w:u w:val="single"/>
+        </w:rPr>
+        <w:t xml:space="preserve">LISTA DE COMPONENTES QUE VAMOS A USAR: </w:t>
+      </w:r>
+    </w:p>
+    <w:p>
+      <w:pPr>
+        <w:rPr>
+          <w:rFonts w:cstheme="minorHAnsi"/>
+          <w:sz w:val="24"/>
+          <w:szCs w:val="24"/>
+        </w:rPr>
+      </w:pPr>
+      <w:r>
+        <w:rPr>
+          <w:rFonts w:cstheme="minorHAnsi"/>
+          <w:sz w:val="24"/>
+          <w:szCs w:val="24"/>
+        </w:rPr>
+        <w:t xml:space="preserve"> </w:t>
+      </w:r>
+    </w:p>
+    <w:p>
+      <w:pPr>
+        <w:rPr>
+          <w:rFonts w:cstheme="minorHAnsi"/>
+          <w:sz w:val="24"/>
+          <w:szCs w:val="24"/>
+          <w:lang w:val="es-ES"/>
+        </w:rPr>
+      </w:pPr>
+      <w:r>
+        <w:rPr>
+          <w:rFonts w:cstheme="minorHAnsi"/>
+          <w:sz w:val="24"/>
+          <w:szCs w:val="24"/>
+          <w:lang w:val="es-ES"/>
+        </w:rPr>
+        <w:t xml:space="preserve">MCU-&gt; </w:t>
+      </w:r>
+      <w:r>
+        <w:rPr>
+          <w:rFonts w:cstheme="minorHAnsi"/>
+          <w:sz w:val="24"/>
+          <w:szCs w:val="24"/>
+          <w:lang w:val="es-ES"/>
+        </w:rPr>
+        <w:t xml:space="preserve">ESP32-S3-Wroom-1-N16: </w:t>
+      </w:r>
+      <w:r>
+        <w:rPr>
+          <w:rFonts w:cstheme="minorHAnsi"/>
+          <w:sz w:val="24"/>
+          <w:szCs w:val="24"/>
+          <w:lang w:val="es-ES"/>
+        </w:rPr>
+        <w:t>C2913199</w:t>
+      </w:r>
+      <w:r>
+        <w:rPr>
+          <w:rFonts w:cstheme="minorHAnsi"/>
+          <w:sz w:val="24"/>
+          <w:szCs w:val="24"/>
+          <w:lang w:val="es-ES"/>
+        </w:rPr>
+        <w:t>.</w:t>
+      </w:r>
+    </w:p>
+    <w:p>
+      <w:pPr>
+        <w:rPr>
+          <w:rFonts w:cstheme="minorHAnsi"/>
+          <w:sz w:val="24"/>
+          <w:szCs w:val="24"/>
+        </w:rPr>
+      </w:pPr>
+      <w:r>
+        <w:rPr>
+          <w:rFonts w:cstheme="minorHAnsi"/>
+          <w:sz w:val="24"/>
+          <w:szCs w:val="24"/>
+          <w:lang w:val="es-ES"/>
+        </w:rPr>
+        <w:t xml:space="preserve">Regulador Voltaje-&gt; </w:t>
+      </w:r>
+      <w:r>
+        <w:rPr>
+          <w:rFonts w:cstheme="minorHAnsi"/>
+          <w:sz w:val="24"/>
+          <w:szCs w:val="24"/>
+          <w:lang w:val="es-ES"/>
+        </w:rPr>
+        <w:t>AMS1117-3.3</w:t>
+      </w:r>
+      <w:r>
+        <w:rPr>
+          <w:rFonts w:cstheme="minorHAnsi"/>
+          <w:sz w:val="24"/>
+          <w:szCs w:val="24"/>
+          <w:lang w:val="es-ES"/>
+        </w:rPr>
+        <w:t xml:space="preserve">: </w:t>
+      </w:r>
+      <w:r>
+        <w:rPr>
+          <w:rFonts w:cstheme="minorHAnsi" w:hint="eastAsia"/>
+          <w:sz w:val="24"/>
+          <w:szCs w:val="24"/>
+        </w:rPr>
+        <w:t>C6186</w:t>
+      </w:r>
+      <w:r>
+        <w:rPr>
+          <w:rFonts w:cstheme="minorHAnsi"/>
+          <w:sz w:val="24"/>
+          <w:szCs w:val="24"/>
+        </w:rPr>
+        <w:t xml:space="preserve"> (</w:t>
+      </w:r>
+      <w:hyperlink r:id="rId15" w:history="1">
+        <w:r>
+          <w:rPr>
+            <w:rStyle w:val="Hipervnculo"/>
+            <w:rFonts w:cstheme="minorHAnsi"/>
+            <w:sz w:val="24"/>
+            <w:szCs w:val="24"/>
+          </w:rPr>
+          <w:t>https://www.instructables.com/Design-and-Implementation-of-a-33V-Power-Supply-Us/</w:t>
+        </w:r>
+      </w:hyperlink>
+      <w:r>
+        <w:rPr>
+          <w:rFonts w:cstheme="minorHAnsi"/>
+          <w:sz w:val="24"/>
+          <w:szCs w:val="24"/>
+        </w:rPr>
+        <w:t>)</w:t>
+      </w:r>
+    </w:p>
+    <w:p>
+      <w:pPr>
+        <w:rPr>
+          <w:rFonts w:cstheme="minorHAnsi"/>
+          <w:sz w:val="24"/>
+          <w:szCs w:val="24"/>
+        </w:rPr>
+      </w:pPr>
+      <w:r>
+        <w:rPr>
+          <w:rFonts w:cstheme="minorHAnsi"/>
+          <w:sz w:val="24"/>
+          <w:szCs w:val="24"/>
+        </w:rPr>
+        <w:t>Conector USB-C</w:t>
+      </w:r>
+      <w:r>
+        <w:rPr>
+          <w:rFonts w:cstheme="minorHAnsi"/>
+          <w:sz w:val="24"/>
+          <w:szCs w:val="24"/>
+        </w:rPr>
+        <w:t xml:space="preserve"> 2.0</w:t>
+      </w:r>
+      <w:r>
+        <w:rPr>
+          <w:rFonts w:cstheme="minorHAnsi"/>
+          <w:sz w:val="24"/>
+          <w:szCs w:val="24"/>
+        </w:rPr>
+        <w:t xml:space="preserve"> -&gt; </w:t>
+      </w:r>
+      <w:r>
+        <w:rPr>
+          <w:rFonts w:cstheme="minorHAnsi"/>
+          <w:sz w:val="24"/>
+          <w:szCs w:val="24"/>
+        </w:rPr>
+        <w:t>GT-USB-7010ASV</w:t>
+      </w:r>
+      <w:r>
+        <w:rPr>
+          <w:rFonts w:cstheme="minorHAnsi"/>
+          <w:sz w:val="24"/>
+          <w:szCs w:val="24"/>
+        </w:rPr>
+        <w:t xml:space="preserve">: </w:t>
+      </w:r>
+      <w:r>
+        <w:rPr>
+          <w:rFonts w:cstheme="minorHAnsi"/>
+          <w:sz w:val="24"/>
+          <w:szCs w:val="24"/>
+        </w:rPr>
+        <w:t>C2988369</w:t>
+      </w:r>
+      <w:r>
+        <w:rPr>
+          <w:rFonts w:cstheme="minorHAnsi"/>
+          <w:sz w:val="24"/>
+          <w:szCs w:val="24"/>
+        </w:rPr>
+        <w:t>.</w:t>
+      </w:r>
+    </w:p>
+    <w:p>
+      <w:pPr>
+        <w:rPr>
+          <w:rFonts w:cstheme="minorHAnsi"/>
+          <w:sz w:val="24"/>
+          <w:szCs w:val="24"/>
+        </w:rPr>
+      </w:pPr>
+      <w:r>
+        <w:rPr>
+          <w:rFonts w:cstheme="minorHAnsi"/>
+          <w:sz w:val="24"/>
+          <w:szCs w:val="24"/>
+        </w:rPr>
+        <w:t>Botón</w:t>
+      </w:r>
+      <w:r>
+        <w:rPr>
+          <w:rFonts w:cstheme="minorHAnsi"/>
+          <w:sz w:val="24"/>
+          <w:szCs w:val="24"/>
+        </w:rPr>
+        <w:t xml:space="preserve"> -&gt; </w:t>
+      </w:r>
+      <w:r>
+        <w:rPr>
+          <w:rFonts w:cstheme="minorHAnsi"/>
+          <w:sz w:val="24"/>
+          <w:szCs w:val="24"/>
+        </w:rPr>
+        <w:t>TSC015A04310A</w:t>
+      </w:r>
+      <w:r>
+        <w:rPr>
+          <w:rFonts w:cstheme="minorHAnsi"/>
+          <w:sz w:val="24"/>
+          <w:szCs w:val="24"/>
+        </w:rPr>
+        <w:t xml:space="preserve">: </w:t>
+      </w:r>
+      <w:r>
+        <w:rPr>
+          <w:rFonts w:cstheme="minorHAnsi"/>
+          <w:sz w:val="24"/>
+          <w:szCs w:val="24"/>
+        </w:rPr>
+        <w:t>C2888974</w:t>
+      </w:r>
+      <w:r>
+        <w:rPr>
+          <w:rFonts w:cstheme="minorHAnsi"/>
+          <w:sz w:val="24"/>
+          <w:szCs w:val="24"/>
+        </w:rPr>
+        <w:t>.</w:t>
+      </w:r>
+    </w:p>
+    <w:p>
+      <w:pPr>
+        <w:rPr>
+          <w:rFonts w:cstheme="minorHAnsi"/>
+          <w:sz w:val="24"/>
+          <w:szCs w:val="24"/>
+          <w:lang w:val="es-ES"/>
+        </w:rPr>
+      </w:pPr>
+      <w:r>
+        <w:rPr>
+          <w:rFonts w:cstheme="minorHAnsi"/>
+          <w:sz w:val="24"/>
+          <w:szCs w:val="24"/>
+        </w:rPr>
+        <w:t xml:space="preserve">Protector ESD-&gt; </w:t>
+      </w:r>
+      <w:r>
+        <w:rPr>
+          <w:rFonts w:cstheme="minorHAnsi"/>
+          <w:sz w:val="24"/>
+          <w:szCs w:val="24"/>
+        </w:rPr>
+        <w:t>USBLC6-2SC6</w:t>
+      </w:r>
+      <w:r>
+        <w:rPr>
+          <w:rFonts w:cstheme="minorHAnsi"/>
+          <w:sz w:val="24"/>
+          <w:szCs w:val="24"/>
+        </w:rPr>
+        <w:t xml:space="preserve">: </w:t>
+      </w:r>
+      <w:r>
+        <w:rPr>
+          <w:rFonts w:cstheme="minorHAnsi"/>
+          <w:sz w:val="24"/>
+          <w:szCs w:val="24"/>
+        </w:rPr>
+        <w:t>C7519</w:t>
+      </w:r>
+      <w:r>
+        <w:rPr>
+          <w:rFonts w:cstheme="minorHAnsi"/>
+          <w:sz w:val="24"/>
+          <w:szCs w:val="24"/>
+        </w:rPr>
+        <w:t>.</w:t>
+      </w:r>
     </w:p>
     <w:p>
       <w:pPr>
@@ -2169,10 +3057,32 @@
       <w:szCs w:val="32"/>
     </w:rPr>
   </w:style>
+  <w:style w:type="paragraph" w:styleId="Ttulo2">
+    <w:name w:val="heading 2"/>
+    <w:basedOn w:val="Normal"/>
+    <w:next w:val="Normal"/>
+    <w:link w:val="Ttulo2Car"/>
+    <w:uiPriority w:val="9"/>
+    <w:semiHidden/>
+    <w:unhideWhenUsed/>
+    <w:qFormat/>
+    <w:rsid w:val="00717F6C"/>
+    <w:pPr>
+      <w:keepNext/>
+      <w:keepLines/>
+      <w:spacing w:before="40" w:after="0"/>
+      <w:outlineLvl w:val="1"/>
+    </w:pPr>
+    <w:rPr>
+      <w:rFonts w:asciiTheme="majorHAnsi" w:eastAsiaTheme="majorEastAsia" w:hAnsiTheme="majorHAnsi" w:cstheme="majorBidi"/>
+      <w:color w:val="2F5496" w:themeColor="accent1" w:themeShade="BF"/>
+      <w:sz w:val="26"/>
+      <w:szCs w:val="26"/>
+    </w:rPr>
+  </w:style>
   <w:style w:type="character" w:default="1" w:styleId="Fuentedeprrafopredeter">
     <w:name w:val="Default Paragraph Font"/>
     <w:uiPriority w:val="1"/>
-    <w:semiHidden/>
     <w:unhideWhenUsed/>
   </w:style>
   <w:style w:type="table" w:default="1" w:styleId="Tablanormal">
@@ -2230,6 +3140,32 @@
     <w:rPr>
       <w:color w:val="605E5C"/>
       <w:shd w:val="clear" w:color="auto" w:fill="E1DFDD"/>
+    </w:rPr>
+  </w:style>
+  <w:style w:type="character" w:customStyle="1" w:styleId="Ttulo2Car">
+    <w:name w:val="Título 2 Car"/>
+    <w:basedOn w:val="Fuentedeprrafopredeter"/>
+    <w:link w:val="Ttulo2"/>
+    <w:uiPriority w:val="9"/>
+    <w:semiHidden/>
+    <w:rsid w:val="00717F6C"/>
+    <w:rPr>
+      <w:rFonts w:asciiTheme="majorHAnsi" w:eastAsiaTheme="majorEastAsia" w:hAnsiTheme="majorHAnsi" w:cstheme="majorBidi"/>
+      <w:color w:val="2F5496" w:themeColor="accent1" w:themeShade="BF"/>
+      <w:sz w:val="26"/>
+      <w:szCs w:val="26"/>
+    </w:rPr>
+  </w:style>
+  <w:style w:type="character" w:styleId="Hipervnculovisitado">
+    <w:name w:val="FollowedHyperlink"/>
+    <w:basedOn w:val="Fuentedeprrafopredeter"/>
+    <w:uiPriority w:val="99"/>
+    <w:semiHidden/>
+    <w:unhideWhenUsed/>
+    <w:rsid w:val="00C5368C"/>
+    <w:rPr>
+      <w:color w:val="954F72" w:themeColor="followedHyperlink"/>
+      <w:u w:val="single"/>
     </w:rPr>
   </w:style>
 </w:styles>

</xml_diff>

<commit_message>
Se desarrollo el esquematico de la ESP32
</commit_message>
<xml_diff>
--- a/Salus IV/Lista Componentes.docx
+++ b/Salus IV/Lista Componentes.docx
@@ -1184,22 +1184,17 @@
         </w:rPr>
         <w:t xml:space="preserve"> </w:t>
       </w:r>
-      <w:r>
-        <w:rPr>
-          <w:rFonts w:cstheme="minorHAnsi" w:hint="eastAsia"/>
-          <w:sz w:val="24"/>
-          <w:szCs w:val="24"/>
-        </w:rPr>
-        <w:t>KT-0603R</w:t>
-      </w:r>
-      <w:r>
-        <w:rPr>
-          <w:rFonts w:cstheme="minorHAnsi"/>
-          <w:sz w:val="24"/>
-          <w:szCs w:val="24"/>
-        </w:rPr>
-        <w:t>.</w:t>
-      </w:r>
+      <w:hyperlink r:id="rId5" w:tgtFrame="_blank" w:tooltip="C2297" w:history="1">
+        <w:r>
+          <w:rPr>
+            <w:rStyle w:val="Hipervnculo"/>
+            <w:rFonts w:cstheme="minorHAnsi"/>
+            <w:sz w:val="24"/>
+            <w:szCs w:val="24"/>
+          </w:rPr>
+          <w:t>C2297</w:t>
+        </w:r>
+      </w:hyperlink>
     </w:p>
     <w:p>
       <w:pPr>
@@ -1328,7 +1323,7 @@
         </w:rPr>
         <w:t xml:space="preserve">Conexiones: </w:t>
       </w:r>
-      <w:hyperlink r:id="rId5" w:history="1">
+      <w:hyperlink r:id="rId6" w:history="1">
         <w:r>
           <w:rPr>
             <w:rStyle w:val="Hipervnculo"/>
@@ -1720,7 +1715,7 @@
         </w:rPr>
         <w:t xml:space="preserve">Video tutorial: </w:t>
       </w:r>
-      <w:hyperlink r:id="rId6" w:history="1">
+      <w:hyperlink r:id="rId7" w:history="1">
         <w:r>
           <w:rPr>
             <w:rStyle w:val="Hipervnculo"/>
@@ -1784,7 +1779,7 @@
         </w:rPr>
         <w:t xml:space="preserve">: </w:t>
       </w:r>
-      <w:hyperlink r:id="rId7" w:history="1">
+      <w:hyperlink r:id="rId8" w:history="1">
         <w:r>
           <w:rPr>
             <w:rStyle w:val="Hipervnculo"/>
@@ -1792,25 +1787,7 @@
             <w:sz w:val="24"/>
             <w:szCs w:val="24"/>
           </w:rPr>
-          <w:t>https://www.yout</w:t>
-        </w:r>
-        <w:r>
-          <w:rPr>
-            <w:rStyle w:val="Hipervnculo"/>
-            <w:rFonts w:cstheme="minorHAnsi"/>
-            <w:sz w:val="24"/>
-            <w:szCs w:val="24"/>
-          </w:rPr>
-          <w:t>u</w:t>
-        </w:r>
-        <w:r>
-          <w:rPr>
-            <w:rStyle w:val="Hipervnculo"/>
-            <w:rFonts w:cstheme="minorHAnsi"/>
-            <w:sz w:val="24"/>
-            <w:szCs w:val="24"/>
-          </w:rPr>
-          <w:t>be.com/watch?v=l0SyRu5H_q8&amp;t=16s</w:t>
+          <w:t>https://www.youtube.com/watch?v=l0SyRu5H_q8&amp;t=16s</w:t>
         </w:r>
       </w:hyperlink>
     </w:p>
@@ -1836,7 +1813,7 @@
                     <pic:cNvPicPr/>
                   </pic:nvPicPr>
                   <pic:blipFill>
-                    <a:blip r:embed="rId8"/>
+                    <a:blip r:embed="rId9"/>
                     <a:stretch>
                       <a:fillRect/>
                     </a:stretch>
@@ -1877,7 +1854,7 @@
       </w:r>
     </w:p>
     <w:p>
-      <w:hyperlink r:id="rId9" w:history="1">
+      <w:hyperlink r:id="rId10" w:history="1">
         <w:r>
           <w:rPr>
             <w:rStyle w:val="Hipervnculo"/>
@@ -1927,24 +1904,6 @@
           <w:bCs/>
         </w:rPr>
       </w:pPr>
-      <w:hyperlink r:id="rId10" w:history="1">
-        <w:r>
-          <w:rPr>
-            <w:rStyle w:val="Hipervnculo"/>
-            <w:b/>
-            <w:bCs/>
-          </w:rPr>
-          <w:t>https://documentation.espressif.com/esp32-s3-wroom-1_wroom-1u_datasheet_en.pdf</w:t>
-        </w:r>
-      </w:hyperlink>
-    </w:p>
-    <w:p>
-      <w:pPr>
-        <w:rPr>
-          <w:b/>
-          <w:bCs/>
-        </w:rPr>
-      </w:pPr>
       <w:hyperlink r:id="rId11" w:history="1">
         <w:r>
           <w:rPr>
@@ -1952,7 +1911,7 @@
             <w:b/>
             <w:bCs/>
           </w:rPr>
-          <w:t>https://www.reddit.com/r/esp32/?f=flair_name%3A%22</w:t>
+          <w:t>https://documentation.espressif.com/esp32-s3-w</w:t>
         </w:r>
         <w:r>
           <w:rPr>
@@ -1960,7 +1919,7 @@
             <w:b/>
             <w:bCs/>
           </w:rPr>
-          <w:t>B</w:t>
+          <w:t>r</w:t>
         </w:r>
         <w:r>
           <w:rPr>
@@ -1968,9 +1927,43 @@
             <w:b/>
             <w:bCs/>
           </w:rPr>
-          <w:t>oard%20Review%22</w:t>
+          <w:t>oom-1_wroom-1u_datasheet_en.pdf</w:t>
         </w:r>
       </w:hyperlink>
+    </w:p>
+    <w:p>
+      <w:pPr>
+        <w:rPr>
+          <w:b/>
+          <w:bCs/>
+        </w:rPr>
+      </w:pPr>
+      <w:hyperlink r:id="rId12" w:history="1">
+        <w:r>
+          <w:rPr>
+            <w:rStyle w:val="Hipervnculo"/>
+            <w:b/>
+            <w:bCs/>
+          </w:rPr>
+          <w:t>https://www.reddit.com</w:t>
+        </w:r>
+        <w:r>
+          <w:rPr>
+            <w:rStyle w:val="Hipervnculo"/>
+            <w:b/>
+            <w:bCs/>
+          </w:rPr>
+          <w:t>/</w:t>
+        </w:r>
+        <w:r>
+          <w:rPr>
+            <w:rStyle w:val="Hipervnculo"/>
+            <w:b/>
+            <w:bCs/>
+          </w:rPr>
+          <w:t>r/esp32/?f=flair_name%3A%22Board%20Review%22</w:t>
+        </w:r>
+      </w:hyperlink>
       <w:r>
         <w:rPr>
           <w:b/>
@@ -2064,7 +2057,7 @@
           <w:bCs/>
         </w:rPr>
       </w:pPr>
-      <w:hyperlink r:id="rId12" w:history="1">
+      <w:hyperlink r:id="rId13" w:history="1">
         <w:r>
           <w:rPr>
             <w:rStyle w:val="Hipervnculo"/>
@@ -2120,7 +2113,7 @@
         </w:rPr>
         <w:lastRenderedPageBreak/>
         <w:drawing>
-          <wp:inline distT="0" distB="0" distL="0" distR="0" wp14:anchorId="0231EAB4" wp14:editId="337A8975">
+          <wp:inline distT="0" distB="0" distL="0" distR="0" wp14:anchorId="0231EAB4" wp14:editId="121320A0">
             <wp:extent cx="5400040" cy="3576955"/>
             <wp:effectExtent l="0" t="0" r="0" b="4445"/>
             <wp:docPr id="1567547339" name="Imagen 1"/>
@@ -2137,7 +2130,7 @@
                     </pic:cNvPicPr>
                   </pic:nvPicPr>
                   <pic:blipFill>
-                    <a:blip r:embed="rId13" cstate="print">
+                    <a:blip r:embed="rId14" cstate="print">
                       <a:extLst>
                         <a:ext uri="{28A0092B-C50C-407E-A947-70E740481C1C}">
                           <a14:useLocalDpi xmlns:a14="http://schemas.microsoft.com/office/drawing/2010/main" val="0"/>
@@ -2209,7 +2202,7 @@
           <w:szCs w:val="24"/>
         </w:rPr>
       </w:pPr>
-      <w:hyperlink r:id="rId14" w:history="1">
+      <w:hyperlink r:id="rId15" w:history="1">
         <w:r>
           <w:rPr>
             <w:rStyle w:val="Hipervnculo"/>
@@ -2395,7 +2388,7 @@
         </w:rPr>
         <w:t xml:space="preserve"> (</w:t>
       </w:r>
-      <w:hyperlink r:id="rId15" w:history="1">
+      <w:hyperlink r:id="rId16" w:history="1">
         <w:r>
           <w:rPr>
             <w:rStyle w:val="Hipervnculo"/>
@@ -2403,7 +2396,25 @@
             <w:sz w:val="24"/>
             <w:szCs w:val="24"/>
           </w:rPr>
-          <w:t>https://www.instructables.com/Design-and-Implementation-of-a-33V-Power-Supply-Us/</w:t>
+          <w:t>https://www</w:t>
+        </w:r>
+        <w:r>
+          <w:rPr>
+            <w:rStyle w:val="Hipervnculo"/>
+            <w:rFonts w:cstheme="minorHAnsi"/>
+            <w:sz w:val="24"/>
+            <w:szCs w:val="24"/>
+          </w:rPr>
+          <w:t>.</w:t>
+        </w:r>
+        <w:r>
+          <w:rPr>
+            <w:rStyle w:val="Hipervnculo"/>
+            <w:rFonts w:cstheme="minorHAnsi"/>
+            <w:sz w:val="24"/>
+            <w:szCs w:val="24"/>
+          </w:rPr>
+          <w:t>instructables.com/Design-and-Implementation-of-a-33V-Power-Supply-Us/</w:t>
         </w:r>
       </w:hyperlink>
       <w:r>
@@ -2543,7 +2554,6 @@
           <w:rFonts w:cstheme="minorHAnsi"/>
           <w:sz w:val="24"/>
           <w:szCs w:val="24"/>
-          <w:lang w:val="es-ES"/>
         </w:rPr>
       </w:pPr>
       <w:r>
@@ -2586,6 +2596,314 @@
         </w:rPr>
         <w:t>.</w:t>
       </w:r>
+    </w:p>
+    <w:p>
+      <w:pPr>
+        <w:rPr>
+          <w:rFonts w:cstheme="minorHAnsi"/>
+          <w:sz w:val="24"/>
+          <w:szCs w:val="24"/>
+        </w:rPr>
+      </w:pPr>
+      <w:r>
+        <w:rPr>
+          <w:rFonts w:cstheme="minorHAnsi"/>
+          <w:sz w:val="24"/>
+          <w:szCs w:val="24"/>
+        </w:rPr>
+        <w:t xml:space="preserve">Resistencia 180 </w:t>
+      </w:r>
+      <w:proofErr w:type="spellStart"/>
+      <w:r>
+        <w:rPr>
+          <w:rFonts w:cstheme="minorHAnsi"/>
+          <w:sz w:val="24"/>
+          <w:szCs w:val="24"/>
+        </w:rPr>
+        <w:t>Ohms</w:t>
+      </w:r>
+      <w:proofErr w:type="spellEnd"/>
+      <w:r>
+        <w:rPr>
+          <w:rFonts w:cstheme="minorHAnsi"/>
+          <w:sz w:val="24"/>
+          <w:szCs w:val="24"/>
+        </w:rPr>
+        <w:t xml:space="preserve"> </w:t>
+      </w:r>
+      <w:proofErr w:type="spellStart"/>
+      <w:r>
+        <w:rPr>
+          <w:rFonts w:cstheme="minorHAnsi"/>
+          <w:sz w:val="24"/>
+          <w:szCs w:val="24"/>
+        </w:rPr>
+        <w:t>LEDs</w:t>
+      </w:r>
+      <w:proofErr w:type="spellEnd"/>
+      <w:r>
+        <w:rPr>
+          <w:rFonts w:cstheme="minorHAnsi"/>
+          <w:sz w:val="24"/>
+          <w:szCs w:val="24"/>
+        </w:rPr>
+        <w:t xml:space="preserve"> -&gt; </w:t>
+      </w:r>
+      <w:r>
+        <w:rPr>
+          <w:rFonts w:cstheme="minorHAnsi"/>
+          <w:sz w:val="24"/>
+          <w:szCs w:val="24"/>
+        </w:rPr>
+        <w:t>1206W4J0181T5E</w:t>
+      </w:r>
+      <w:r>
+        <w:rPr>
+          <w:rFonts w:cstheme="minorHAnsi"/>
+          <w:sz w:val="24"/>
+          <w:szCs w:val="24"/>
+        </w:rPr>
+        <w:t xml:space="preserve"> </w:t>
+      </w:r>
+    </w:p>
+    <w:p>
+      <w:pPr>
+        <w:rPr>
+          <w:rFonts w:cstheme="minorHAnsi"/>
+          <w:sz w:val="24"/>
+          <w:szCs w:val="24"/>
+        </w:rPr>
+      </w:pPr>
+      <w:r>
+        <w:rPr>
+          <w:rFonts w:cstheme="minorHAnsi"/>
+          <w:sz w:val="24"/>
+          <w:szCs w:val="24"/>
+        </w:rPr>
+        <w:t xml:space="preserve">LED Rojo -&gt; </w:t>
+      </w:r>
+      <w:hyperlink r:id="rId17" w:tgtFrame="_blank" w:tooltip="C2286" w:history="1">
+        <w:r>
+          <w:rPr>
+            <w:rStyle w:val="Hipervnculo"/>
+            <w:rFonts w:cstheme="minorHAnsi"/>
+            <w:sz w:val="24"/>
+            <w:szCs w:val="24"/>
+          </w:rPr>
+          <w:t>C2286</w:t>
+        </w:r>
+      </w:hyperlink>
+    </w:p>
+    <w:p>
+      <w:pPr>
+        <w:rPr>
+          <w:rFonts w:cstheme="minorHAnsi"/>
+          <w:sz w:val="24"/>
+          <w:szCs w:val="24"/>
+        </w:rPr>
+      </w:pPr>
+      <w:r>
+        <w:rPr>
+          <w:rFonts w:cstheme="minorHAnsi"/>
+          <w:sz w:val="24"/>
+          <w:szCs w:val="24"/>
+        </w:rPr>
+        <w:t xml:space="preserve">LED Amarillo -&gt; </w:t>
+      </w:r>
+      <w:hyperlink r:id="rId18" w:tgtFrame="_blank" w:tooltip="C2296" w:history="1">
+        <w:r>
+          <w:rPr>
+            <w:rStyle w:val="Hipervnculo"/>
+            <w:rFonts w:cstheme="minorHAnsi"/>
+            <w:sz w:val="24"/>
+            <w:szCs w:val="24"/>
+          </w:rPr>
+          <w:t>C2296</w:t>
+        </w:r>
+      </w:hyperlink>
+    </w:p>
+    <w:p>
+      <w:pPr>
+        <w:rPr>
+          <w:rFonts w:cstheme="minorHAnsi"/>
+          <w:sz w:val="24"/>
+          <w:szCs w:val="24"/>
+        </w:rPr>
+      </w:pPr>
+      <w:r>
+        <w:rPr>
+          <w:rFonts w:cstheme="minorHAnsi"/>
+          <w:sz w:val="24"/>
+          <w:szCs w:val="24"/>
+        </w:rPr>
+        <w:t xml:space="preserve">Resistencia 12K -&gt; </w:t>
+      </w:r>
+      <w:r>
+        <w:rPr>
+          <w:rFonts w:cstheme="minorHAnsi"/>
+          <w:sz w:val="24"/>
+          <w:szCs w:val="24"/>
+        </w:rPr>
+        <w:t>1206W4J0123T5E</w:t>
+      </w:r>
+    </w:p>
+    <w:p>
+      <w:pPr>
+        <w:rPr>
+          <w:rFonts w:cstheme="minorHAnsi"/>
+          <w:sz w:val="24"/>
+          <w:szCs w:val="24"/>
+        </w:rPr>
+      </w:pPr>
+      <w:r>
+        <w:rPr>
+          <w:rFonts w:cstheme="minorHAnsi"/>
+          <w:sz w:val="24"/>
+          <w:szCs w:val="24"/>
+        </w:rPr>
+        <w:t xml:space="preserve">Resistencia 470 -&gt; </w:t>
+      </w:r>
+      <w:r>
+        <w:rPr>
+          <w:rFonts w:cstheme="minorHAnsi"/>
+          <w:sz w:val="24"/>
+          <w:szCs w:val="24"/>
+        </w:rPr>
+        <w:t>1206W4J0471T5E</w:t>
+      </w:r>
+    </w:p>
+    <w:p>
+      <w:pPr>
+        <w:rPr>
+          <w:rFonts w:cstheme="minorHAnsi"/>
+          <w:sz w:val="24"/>
+          <w:szCs w:val="24"/>
+        </w:rPr>
+      </w:pPr>
+      <w:r>
+        <w:rPr>
+          <w:rFonts w:cstheme="minorHAnsi"/>
+          <w:sz w:val="24"/>
+          <w:szCs w:val="24"/>
+        </w:rPr>
+        <w:lastRenderedPageBreak/>
+        <w:t xml:space="preserve">Capacitor </w:t>
+      </w:r>
+      <w:proofErr w:type="spellStart"/>
+      <w:r>
+        <w:rPr>
+          <w:rFonts w:cstheme="minorHAnsi"/>
+          <w:sz w:val="24"/>
+          <w:szCs w:val="24"/>
+        </w:rPr>
+        <w:t>Ceramico</w:t>
+      </w:r>
+      <w:proofErr w:type="spellEnd"/>
+      <w:r>
+        <w:rPr>
+          <w:rFonts w:cstheme="minorHAnsi"/>
+          <w:sz w:val="24"/>
+          <w:szCs w:val="24"/>
+        </w:rPr>
+        <w:t xml:space="preserve"> 100 </w:t>
+      </w:r>
+      <w:proofErr w:type="spellStart"/>
+      <w:r>
+        <w:rPr>
+          <w:rFonts w:cstheme="minorHAnsi"/>
+          <w:sz w:val="24"/>
+          <w:szCs w:val="24"/>
+        </w:rPr>
+        <w:t>nF</w:t>
+      </w:r>
+      <w:proofErr w:type="spellEnd"/>
+      <w:r>
+        <w:rPr>
+          <w:rFonts w:cstheme="minorHAnsi"/>
+          <w:sz w:val="24"/>
+          <w:szCs w:val="24"/>
+        </w:rPr>
+        <w:t xml:space="preserve">: </w:t>
+      </w:r>
+      <w:r>
+        <w:rPr>
+          <w:rFonts w:cstheme="minorHAnsi"/>
+          <w:sz w:val="24"/>
+          <w:szCs w:val="24"/>
+        </w:rPr>
+        <w:t>CL05B104KO5NNNC</w:t>
+      </w:r>
+    </w:p>
+    <w:p>
+      <w:pPr>
+        <w:rPr>
+          <w:rFonts w:cstheme="minorHAnsi"/>
+          <w:sz w:val="24"/>
+          <w:szCs w:val="24"/>
+        </w:rPr>
+      </w:pPr>
+      <w:r>
+        <w:rPr>
+          <w:rFonts w:cstheme="minorHAnsi"/>
+          <w:sz w:val="24"/>
+          <w:szCs w:val="24"/>
+        </w:rPr>
+        <w:t xml:space="preserve">Capacitor </w:t>
+      </w:r>
+      <w:proofErr w:type="spellStart"/>
+      <w:r>
+        <w:rPr>
+          <w:rFonts w:cstheme="minorHAnsi"/>
+          <w:sz w:val="24"/>
+          <w:szCs w:val="24"/>
+        </w:rPr>
+        <w:t>Tantalium</w:t>
+      </w:r>
+      <w:proofErr w:type="spellEnd"/>
+      <w:r>
+        <w:rPr>
+          <w:rFonts w:cstheme="minorHAnsi"/>
+          <w:sz w:val="24"/>
+          <w:szCs w:val="24"/>
+        </w:rPr>
+        <w:t xml:space="preserve"> 22 </w:t>
+      </w:r>
+      <w:proofErr w:type="spellStart"/>
+      <w:r>
+        <w:rPr>
+          <w:rFonts w:cstheme="minorHAnsi"/>
+          <w:sz w:val="24"/>
+          <w:szCs w:val="24"/>
+        </w:rPr>
+        <w:t>uF</w:t>
+      </w:r>
+      <w:proofErr w:type="spellEnd"/>
+      <w:r>
+        <w:rPr>
+          <w:rFonts w:cstheme="minorHAnsi"/>
+          <w:sz w:val="24"/>
+          <w:szCs w:val="24"/>
+        </w:rPr>
+        <w:t xml:space="preserve">: </w:t>
+      </w:r>
+      <w:r>
+        <w:rPr>
+          <w:rFonts w:cstheme="minorHAnsi"/>
+          <w:sz w:val="24"/>
+          <w:szCs w:val="24"/>
+        </w:rPr>
+        <w:t>TAJA226K006RNJ</w:t>
+      </w:r>
+    </w:p>
+    <w:p>
+      <w:pPr>
+        <w:rPr>
+          <w:rFonts w:cstheme="minorHAnsi"/>
+          <w:sz w:val="24"/>
+          <w:szCs w:val="24"/>
+          <w:lang w:val="es-ES"/>
+        </w:rPr>
+      </w:pPr>
     </w:p>
     <w:p>
       <w:pPr>

</xml_diff>

<commit_message>
Se agregan cambios antes de agregar arrays
</commit_message>
<xml_diff>
--- a/Salus IV/Lista Componentes.docx
+++ b/Salus IV/Lista Componentes.docx
@@ -12,21 +12,7 @@
         <w:rPr>
           <w:lang w:val="es-ES"/>
         </w:rPr>
-        <w:t xml:space="preserve">Lista de componentes </w:t>
-      </w:r>
-      <w:proofErr w:type="gramStart"/>
-      <w:r>
-        <w:rPr>
-          <w:lang w:val="es-ES"/>
-        </w:rPr>
-        <w:t>usados</w:t>
-      </w:r>
-      <w:proofErr w:type="gramEnd"/>
-      <w:r>
-        <w:rPr>
-          <w:lang w:val="es-ES"/>
-        </w:rPr>
-        <w:t xml:space="preserve"> en definitiva:</w:t>
+        <w:t>Lista de componentes usados en definitiva:</w:t>
       </w:r>
     </w:p>
     <w:p>
@@ -164,23 +150,7 @@
           <w:b/>
           <w:bCs/>
         </w:rPr>
-        <w:t xml:space="preserve"> (Estas de 1K </w:t>
-      </w:r>
-      <w:proofErr w:type="gramStart"/>
-      <w:r>
-        <w:rPr>
-          <w:b/>
-          <w:bCs/>
-        </w:rPr>
-        <w:t>ohm</w:t>
-      </w:r>
-      <w:proofErr w:type="gramEnd"/>
-      <w:r>
-        <w:rPr>
-          <w:b/>
-          <w:bCs/>
-        </w:rPr>
-        <w:t xml:space="preserve"> pero todas son del mismo empaquetado distinto valor).</w:t>
+        <w:t xml:space="preserve"> (Estas de 1K ohm pero todas son del mismo empaquetado distinto valor).</w:t>
       </w:r>
     </w:p>
     <w:p>
@@ -201,9 +171,8 @@
           <w:u w:val="single"/>
           <w:lang w:val="es-ES"/>
         </w:rPr>
-        <w:t xml:space="preserve">Componentes </w:t>
-      </w:r>
-      <w:proofErr w:type="spellStart"/>
+        <w:t>Componentes Logica Rasp</w:t>
+      </w:r>
       <w:r>
         <w:rPr>
           <w:rFonts w:ascii="Aptos" w:hAnsi="Aptos"/>
@@ -212,10 +181,255 @@
           <w:u w:val="single"/>
           <w:lang w:val="es-ES"/>
         </w:rPr>
-        <w:t>Logica</w:t>
-      </w:r>
-      <w:proofErr w:type="spellEnd"/>
-      <w:r>
+        <w:t xml:space="preserve">: </w:t>
+      </w:r>
+    </w:p>
+    <w:p>
+      <w:pPr>
+        <w:rPr>
+          <w:rFonts w:cstheme="minorHAnsi"/>
+          <w:b/>
+          <w:bCs/>
+          <w:sz w:val="24"/>
+          <w:szCs w:val="24"/>
+        </w:rPr>
+      </w:pPr>
+      <w:r>
+        <w:rPr>
+          <w:rFonts w:cstheme="minorHAnsi"/>
+          <w:sz w:val="24"/>
+          <w:szCs w:val="24"/>
+          <w:lang w:val="es-ES"/>
+        </w:rPr>
+        <w:t>Conectores para Rasp:</w:t>
+      </w:r>
+      <w:r>
+        <w:rPr>
+          <w:rFonts w:cstheme="minorHAnsi"/>
+          <w:sz w:val="24"/>
+          <w:szCs w:val="24"/>
+          <w:lang w:val="es-ES"/>
+        </w:rPr>
+        <w:t xml:space="preserve"> </w:t>
+      </w:r>
+      <w:r>
+        <w:rPr>
+          <w:rFonts w:cstheme="minorHAnsi" w:hint="eastAsia"/>
+          <w:b/>
+          <w:bCs/>
+          <w:sz w:val="24"/>
+          <w:szCs w:val="24"/>
+        </w:rPr>
+        <w:t>2.54-2*20P Straight IDC Header, No Ejector</w:t>
+      </w:r>
+      <w:r>
+        <w:rPr>
+          <w:rFonts w:cstheme="minorHAnsi"/>
+          <w:b/>
+          <w:bCs/>
+          <w:sz w:val="24"/>
+          <w:szCs w:val="24"/>
+        </w:rPr>
+        <w:t>.</w:t>
+      </w:r>
+    </w:p>
+    <w:p>
+      <w:pPr>
+        <w:rPr>
+          <w:rFonts w:cstheme="minorHAnsi"/>
+          <w:b/>
+          <w:bCs/>
+          <w:sz w:val="24"/>
+          <w:szCs w:val="24"/>
+        </w:rPr>
+      </w:pPr>
+      <w:r>
+        <w:rPr>
+          <w:rFonts w:cstheme="minorHAnsi"/>
+          <w:sz w:val="24"/>
+          <w:szCs w:val="24"/>
+        </w:rPr>
+        <w:t>Transistores para la Lógica:</w:t>
+      </w:r>
+      <w:r>
+        <w:rPr>
+          <w:rFonts w:cstheme="minorHAnsi"/>
+          <w:sz w:val="24"/>
+          <w:szCs w:val="24"/>
+        </w:rPr>
+        <w:t xml:space="preserve"> </w:t>
+      </w:r>
+      <w:r>
+        <w:rPr>
+          <w:rFonts w:cstheme="minorHAnsi" w:hint="eastAsia"/>
+          <w:b/>
+          <w:bCs/>
+          <w:sz w:val="24"/>
+          <w:szCs w:val="24"/>
+        </w:rPr>
+        <w:t>IRLML6344PBF-HXY</w:t>
+      </w:r>
+      <w:r>
+        <w:rPr>
+          <w:rFonts w:cstheme="minorHAnsi"/>
+          <w:b/>
+          <w:bCs/>
+          <w:sz w:val="24"/>
+          <w:szCs w:val="24"/>
+        </w:rPr>
+        <w:t>.</w:t>
+      </w:r>
+    </w:p>
+    <w:p>
+      <w:pPr>
+        <w:rPr>
+          <w:rFonts w:cstheme="minorHAnsi"/>
+          <w:b/>
+          <w:bCs/>
+          <w:sz w:val="24"/>
+          <w:szCs w:val="24"/>
+        </w:rPr>
+      </w:pPr>
+      <w:r>
+        <w:rPr>
+          <w:rFonts w:cstheme="minorHAnsi"/>
+          <w:sz w:val="24"/>
+          <w:szCs w:val="24"/>
+        </w:rPr>
+        <w:t xml:space="preserve">Conector Output Señales: </w:t>
+      </w:r>
+      <w:r>
+        <w:rPr>
+          <w:rFonts w:cstheme="minorHAnsi" w:hint="eastAsia"/>
+          <w:b/>
+          <w:bCs/>
+          <w:sz w:val="24"/>
+          <w:szCs w:val="24"/>
+        </w:rPr>
+        <w:t>WJ127-5.0-06P-14-00A</w:t>
+      </w:r>
+    </w:p>
+    <w:p>
+      <w:pPr>
+        <w:rPr>
+          <w:rFonts w:cstheme="minorHAnsi"/>
+          <w:b/>
+          <w:bCs/>
+          <w:sz w:val="24"/>
+          <w:szCs w:val="24"/>
+        </w:rPr>
+      </w:pPr>
+      <w:r>
+        <w:rPr>
+          <w:rFonts w:cstheme="minorHAnsi"/>
+          <w:sz w:val="24"/>
+          <w:szCs w:val="24"/>
+        </w:rPr>
+        <w:t xml:space="preserve">Relay: </w:t>
+      </w:r>
+      <w:r>
+        <w:rPr>
+          <w:rFonts w:cstheme="minorHAnsi"/>
+          <w:sz w:val="24"/>
+          <w:szCs w:val="24"/>
+        </w:rPr>
+        <w:t xml:space="preserve">Este lo cambiamos, </w:t>
+      </w:r>
+      <w:bookmarkStart w:id="0" w:name="_Hlk221796421"/>
+      <w:r>
+        <w:rPr>
+          <w:rFonts w:cstheme="minorHAnsi" w:hint="eastAsia"/>
+          <w:b/>
+          <w:bCs/>
+          <w:sz w:val="24"/>
+          <w:szCs w:val="24"/>
+        </w:rPr>
+        <w:t>SRD-05VDC-SL-C</w:t>
+      </w:r>
+      <w:bookmarkEnd w:id="0"/>
+      <w:r>
+        <w:rPr>
+          <w:rFonts w:cstheme="minorHAnsi"/>
+          <w:b/>
+          <w:bCs/>
+          <w:sz w:val="24"/>
+          <w:szCs w:val="24"/>
+        </w:rPr>
+        <w:t>.</w:t>
+      </w:r>
+      <w:r>
+        <w:rPr>
+          <w:rFonts w:cstheme="minorHAnsi"/>
+          <w:b/>
+          <w:bCs/>
+          <w:sz w:val="24"/>
+          <w:szCs w:val="24"/>
+        </w:rPr>
+        <w:br/>
+      </w:r>
+      <w:r>
+        <w:rPr>
+          <w:rFonts w:cstheme="minorHAnsi"/>
+          <w:b/>
+          <w:bCs/>
+          <w:sz w:val="24"/>
+          <w:szCs w:val="24"/>
+        </w:rPr>
+        <w:br/>
+      </w:r>
+      <w:r>
+        <w:rPr>
+          <w:rFonts w:cstheme="minorHAnsi"/>
+          <w:sz w:val="24"/>
+          <w:szCs w:val="24"/>
+        </w:rPr>
+        <w:t>Diodo TVS</w:t>
+      </w:r>
+      <w:r>
+        <w:rPr>
+          <w:rFonts w:cstheme="minorHAnsi"/>
+          <w:b/>
+          <w:bCs/>
+          <w:sz w:val="24"/>
+          <w:szCs w:val="24"/>
+        </w:rPr>
+        <w:t xml:space="preserve">: </w:t>
+      </w:r>
+      <w:bookmarkStart w:id="1" w:name="_Hlk221796440"/>
+      <w:r>
+        <w:rPr>
+          <w:rFonts w:cstheme="minorHAnsi" w:hint="eastAsia"/>
+          <w:b/>
+          <w:bCs/>
+          <w:sz w:val="24"/>
+          <w:szCs w:val="24"/>
+        </w:rPr>
+        <w:t>1N6267A-E3/54</w:t>
+      </w:r>
+      <w:r>
+        <w:rPr>
+          <w:rFonts w:cstheme="minorHAnsi"/>
+          <w:b/>
+          <w:bCs/>
+          <w:sz w:val="24"/>
+          <w:szCs w:val="24"/>
+        </w:rPr>
+        <w:t>.</w:t>
+      </w:r>
+    </w:p>
+    <w:p>
+      <w:pPr>
+        <w:rPr>
+          <w:rFonts w:cstheme="minorHAnsi"/>
+          <w:b/>
+          <w:bCs/>
+          <w:sz w:val="24"/>
+          <w:szCs w:val="24"/>
+        </w:rPr>
+      </w:pPr>
+    </w:p>
+    <w:p>
+      <w:pPr>
         <w:rPr>
           <w:rFonts w:ascii="Aptos" w:hAnsi="Aptos"/>
           <w:sz w:val="32"/>
@@ -223,9 +437,7 @@
           <w:u w:val="single"/>
           <w:lang w:val="es-ES"/>
         </w:rPr>
-        <w:t xml:space="preserve"> </w:t>
-      </w:r>
-      <w:proofErr w:type="spellStart"/>
+      </w:pPr>
       <w:r>
         <w:rPr>
           <w:rFonts w:ascii="Aptos" w:hAnsi="Aptos"/>
@@ -234,10 +446,169 @@
           <w:u w:val="single"/>
           <w:lang w:val="es-ES"/>
         </w:rPr>
-        <w:t>Rasp</w:t>
-      </w:r>
-      <w:proofErr w:type="spellEnd"/>
-      <w:r>
+        <w:t xml:space="preserve">Conectores que van al Exterior: </w:t>
+      </w:r>
+    </w:p>
+    <w:p>
+      <w:pPr>
+        <w:rPr>
+          <w:rFonts w:cstheme="minorHAnsi"/>
+          <w:b/>
+          <w:bCs/>
+          <w:sz w:val="24"/>
+          <w:szCs w:val="24"/>
+        </w:rPr>
+      </w:pPr>
+    </w:p>
+    <w:bookmarkEnd w:id="1"/>
+    <w:p>
+      <w:pPr>
+        <w:rPr>
+          <w:rFonts w:cstheme="minorHAnsi"/>
+          <w:b/>
+          <w:bCs/>
+          <w:sz w:val="24"/>
+          <w:szCs w:val="24"/>
+        </w:rPr>
+      </w:pPr>
+      <w:r>
+        <w:rPr>
+          <w:rFonts w:cstheme="minorHAnsi"/>
+          <w:sz w:val="24"/>
+          <w:szCs w:val="24"/>
+        </w:rPr>
+        <w:t xml:space="preserve">Conector Servos: </w:t>
+      </w:r>
+      <w:r>
+        <w:rPr>
+          <w:rFonts w:cstheme="minorHAnsi" w:hint="eastAsia"/>
+          <w:b/>
+          <w:bCs/>
+          <w:sz w:val="24"/>
+          <w:szCs w:val="24"/>
+        </w:rPr>
+        <w:t>2.54-2*3PPin</w:t>
+      </w:r>
+      <w:r>
+        <w:rPr>
+          <w:rFonts w:cstheme="minorHAnsi"/>
+          <w:b/>
+          <w:bCs/>
+          <w:sz w:val="24"/>
+          <w:szCs w:val="24"/>
+        </w:rPr>
+        <w:t>.</w:t>
+      </w:r>
+    </w:p>
+    <w:p>
+      <w:pPr>
+        <w:rPr>
+          <w:rFonts w:cstheme="minorHAnsi"/>
+          <w:b/>
+          <w:bCs/>
+          <w:sz w:val="24"/>
+          <w:szCs w:val="24"/>
+        </w:rPr>
+      </w:pPr>
+      <w:r>
+        <w:rPr>
+          <w:rFonts w:cstheme="minorHAnsi"/>
+          <w:sz w:val="24"/>
+          <w:szCs w:val="24"/>
+        </w:rPr>
+        <w:t>Cable</w:t>
+      </w:r>
+      <w:r>
+        <w:rPr>
+          <w:rFonts w:cstheme="minorHAnsi"/>
+          <w:sz w:val="24"/>
+          <w:szCs w:val="24"/>
+        </w:rPr>
+        <w:t xml:space="preserve"> Puente H:</w:t>
+      </w:r>
+      <w:r>
+        <w:rPr>
+          <w:rFonts w:cstheme="minorHAnsi"/>
+          <w:b/>
+          <w:bCs/>
+          <w:sz w:val="24"/>
+          <w:szCs w:val="24"/>
+        </w:rPr>
+        <w:t xml:space="preserve"> </w:t>
+      </w:r>
+      <w:r>
+        <w:rPr>
+          <w:rFonts w:cstheme="minorHAnsi"/>
+          <w:b/>
+          <w:bCs/>
+          <w:sz w:val="24"/>
+          <w:szCs w:val="24"/>
+        </w:rPr>
+        <w:t>hanxia HX PH2.0-4P ST 200mm 24AWG</w:t>
+      </w:r>
+      <w:r>
+        <w:rPr>
+          <w:rFonts w:cstheme="minorHAnsi"/>
+          <w:b/>
+          <w:bCs/>
+          <w:sz w:val="24"/>
+          <w:szCs w:val="24"/>
+        </w:rPr>
+        <w:t>.</w:t>
+      </w:r>
+    </w:p>
+    <w:p>
+      <w:pPr>
+        <w:rPr>
+          <w:rFonts w:cstheme="minorHAnsi"/>
+          <w:b/>
+          <w:bCs/>
+          <w:sz w:val="24"/>
+          <w:szCs w:val="24"/>
+        </w:rPr>
+      </w:pPr>
+      <w:r>
+        <w:rPr>
+          <w:rFonts w:cstheme="minorHAnsi"/>
+          <w:sz w:val="24"/>
+          <w:szCs w:val="24"/>
+        </w:rPr>
+        <w:t>Conector Puente H:</w:t>
+      </w:r>
+      <w:r>
+        <w:rPr>
+          <w:rFonts w:cstheme="minorHAnsi"/>
+          <w:b/>
+          <w:bCs/>
+          <w:sz w:val="24"/>
+          <w:szCs w:val="24"/>
+        </w:rPr>
+        <w:t xml:space="preserve"> </w:t>
+      </w:r>
+      <w:r>
+        <w:rPr>
+          <w:rFonts w:cstheme="minorHAnsi"/>
+          <w:b/>
+          <w:bCs/>
+          <w:sz w:val="24"/>
+          <w:szCs w:val="24"/>
+        </w:rPr>
+        <w:t>S4B-PH-K-S</w:t>
+      </w:r>
+    </w:p>
+    <w:p>
+      <w:pPr>
+        <w:rPr>
+          <w:rFonts w:cstheme="minorHAnsi"/>
+          <w:b/>
+          <w:bCs/>
+          <w:sz w:val="24"/>
+          <w:szCs w:val="24"/>
+        </w:rPr>
+      </w:pPr>
+    </w:p>
+    <w:p>
+      <w:pPr>
         <w:rPr>
           <w:rFonts w:ascii="Aptos" w:hAnsi="Aptos"/>
           <w:sz w:val="32"/>
@@ -245,341 +616,8 @@
           <w:u w:val="single"/>
           <w:lang w:val="es-ES"/>
         </w:rPr>
-        <w:t xml:space="preserve">: </w:t>
-      </w:r>
-    </w:p>
-    <w:p>
-      <w:pPr>
-        <w:rPr>
-          <w:rFonts w:cstheme="minorHAnsi"/>
-          <w:b/>
-          <w:bCs/>
-          <w:sz w:val="24"/>
-          <w:szCs w:val="24"/>
-        </w:rPr>
-      </w:pPr>
-      <w:r>
-        <w:rPr>
-          <w:rFonts w:cstheme="minorHAnsi"/>
-          <w:sz w:val="24"/>
-          <w:szCs w:val="24"/>
-          <w:lang w:val="es-ES"/>
-        </w:rPr>
-        <w:t xml:space="preserve">Conectores para </w:t>
-      </w:r>
-      <w:proofErr w:type="spellStart"/>
-      <w:r>
-        <w:rPr>
-          <w:rFonts w:cstheme="minorHAnsi"/>
-          <w:sz w:val="24"/>
-          <w:szCs w:val="24"/>
-          <w:lang w:val="es-ES"/>
-        </w:rPr>
-        <w:t>Rasp</w:t>
-      </w:r>
-      <w:proofErr w:type="spellEnd"/>
-      <w:r>
-        <w:rPr>
-          <w:rFonts w:cstheme="minorHAnsi"/>
-          <w:sz w:val="24"/>
-          <w:szCs w:val="24"/>
-          <w:lang w:val="es-ES"/>
-        </w:rPr>
-        <w:t>:</w:t>
-      </w:r>
-      <w:r>
-        <w:rPr>
-          <w:rFonts w:cstheme="minorHAnsi"/>
-          <w:sz w:val="24"/>
-          <w:szCs w:val="24"/>
-          <w:lang w:val="es-ES"/>
-        </w:rPr>
-        <w:t xml:space="preserve"> </w:t>
-      </w:r>
-      <w:r>
-        <w:rPr>
-          <w:rFonts w:cstheme="minorHAnsi" w:hint="eastAsia"/>
-          <w:b/>
-          <w:bCs/>
-          <w:sz w:val="24"/>
-          <w:szCs w:val="24"/>
-        </w:rPr>
-        <w:t xml:space="preserve">2.54-2*20P </w:t>
-      </w:r>
-      <w:proofErr w:type="spellStart"/>
-      <w:r>
-        <w:rPr>
-          <w:rFonts w:cstheme="minorHAnsi" w:hint="eastAsia"/>
-          <w:b/>
-          <w:bCs/>
-          <w:sz w:val="24"/>
-          <w:szCs w:val="24"/>
-        </w:rPr>
-        <w:t>Straight</w:t>
-      </w:r>
-      <w:proofErr w:type="spellEnd"/>
-      <w:r>
-        <w:rPr>
-          <w:rFonts w:cstheme="minorHAnsi" w:hint="eastAsia"/>
-          <w:b/>
-          <w:bCs/>
-          <w:sz w:val="24"/>
-          <w:szCs w:val="24"/>
-        </w:rPr>
-        <w:t xml:space="preserve"> IDC </w:t>
-      </w:r>
-      <w:proofErr w:type="spellStart"/>
-      <w:r>
-        <w:rPr>
-          <w:rFonts w:cstheme="minorHAnsi" w:hint="eastAsia"/>
-          <w:b/>
-          <w:bCs/>
-          <w:sz w:val="24"/>
-          <w:szCs w:val="24"/>
-        </w:rPr>
-        <w:t>Header</w:t>
-      </w:r>
-      <w:proofErr w:type="spellEnd"/>
-      <w:r>
-        <w:rPr>
-          <w:rFonts w:cstheme="minorHAnsi" w:hint="eastAsia"/>
-          <w:b/>
-          <w:bCs/>
-          <w:sz w:val="24"/>
-          <w:szCs w:val="24"/>
-        </w:rPr>
-        <w:t xml:space="preserve">, No </w:t>
-      </w:r>
-      <w:proofErr w:type="spellStart"/>
-      <w:r>
-        <w:rPr>
-          <w:rFonts w:cstheme="minorHAnsi" w:hint="eastAsia"/>
-          <w:b/>
-          <w:bCs/>
-          <w:sz w:val="24"/>
-          <w:szCs w:val="24"/>
-        </w:rPr>
-        <w:t>Ejector</w:t>
-      </w:r>
-      <w:proofErr w:type="spellEnd"/>
-      <w:r>
-        <w:rPr>
-          <w:rFonts w:cstheme="minorHAnsi"/>
-          <w:b/>
-          <w:bCs/>
-          <w:sz w:val="24"/>
-          <w:szCs w:val="24"/>
-        </w:rPr>
-        <w:t>.</w:t>
-      </w:r>
-    </w:p>
-    <w:p>
-      <w:pPr>
-        <w:rPr>
-          <w:rFonts w:cstheme="minorHAnsi"/>
-          <w:b/>
-          <w:bCs/>
-          <w:sz w:val="24"/>
-          <w:szCs w:val="24"/>
-        </w:rPr>
-      </w:pPr>
-      <w:r>
-        <w:rPr>
-          <w:rFonts w:cstheme="minorHAnsi"/>
-          <w:sz w:val="24"/>
-          <w:szCs w:val="24"/>
-        </w:rPr>
-        <w:t>Transistores para la Lógica:</w:t>
-      </w:r>
-      <w:r>
-        <w:rPr>
-          <w:rFonts w:cstheme="minorHAnsi"/>
-          <w:sz w:val="24"/>
-          <w:szCs w:val="24"/>
-        </w:rPr>
-        <w:t xml:space="preserve"> </w:t>
-      </w:r>
-      <w:r>
-        <w:rPr>
-          <w:rFonts w:cstheme="minorHAnsi" w:hint="eastAsia"/>
-          <w:b/>
-          <w:bCs/>
-          <w:sz w:val="24"/>
-          <w:szCs w:val="24"/>
-        </w:rPr>
-        <w:t>IRLML6344PBF-HXY</w:t>
-      </w:r>
-      <w:r>
-        <w:rPr>
-          <w:rFonts w:cstheme="minorHAnsi"/>
-          <w:b/>
-          <w:bCs/>
-          <w:sz w:val="24"/>
-          <w:szCs w:val="24"/>
-        </w:rPr>
-        <w:t>.</w:t>
-      </w:r>
-    </w:p>
-    <w:p>
-      <w:pPr>
-        <w:rPr>
-          <w:rFonts w:cstheme="minorHAnsi"/>
-          <w:b/>
-          <w:bCs/>
-          <w:sz w:val="24"/>
-          <w:szCs w:val="24"/>
-        </w:rPr>
-      </w:pPr>
-      <w:r>
-        <w:rPr>
-          <w:rFonts w:cstheme="minorHAnsi"/>
-          <w:sz w:val="24"/>
-          <w:szCs w:val="24"/>
-        </w:rPr>
-        <w:t xml:space="preserve">Conector Output Señales: </w:t>
-      </w:r>
-      <w:r>
-        <w:rPr>
-          <w:rFonts w:cstheme="minorHAnsi" w:hint="eastAsia"/>
-          <w:b/>
-          <w:bCs/>
-          <w:sz w:val="24"/>
-          <w:szCs w:val="24"/>
-        </w:rPr>
-        <w:t>WJ127-5.0-06P-14-00A</w:t>
-      </w:r>
-    </w:p>
-    <w:p>
-      <w:pPr>
-        <w:rPr>
-          <w:rFonts w:cstheme="minorHAnsi"/>
-          <w:b/>
-          <w:bCs/>
-          <w:sz w:val="24"/>
-          <w:szCs w:val="24"/>
-        </w:rPr>
-      </w:pPr>
-      <w:proofErr w:type="spellStart"/>
-      <w:r>
-        <w:rPr>
-          <w:rFonts w:cstheme="minorHAnsi"/>
-          <w:sz w:val="24"/>
-          <w:szCs w:val="24"/>
-        </w:rPr>
-        <w:t>Relay</w:t>
-      </w:r>
-      <w:proofErr w:type="spellEnd"/>
-      <w:r>
-        <w:rPr>
-          <w:rFonts w:cstheme="minorHAnsi"/>
-          <w:sz w:val="24"/>
-          <w:szCs w:val="24"/>
-        </w:rPr>
-        <w:t xml:space="preserve">: </w:t>
-      </w:r>
-      <w:r>
-        <w:rPr>
-          <w:rFonts w:cstheme="minorHAnsi"/>
-          <w:sz w:val="24"/>
-          <w:szCs w:val="24"/>
-        </w:rPr>
-        <w:t xml:space="preserve">Este lo cambiamos, </w:t>
-      </w:r>
-      <w:bookmarkStart w:id="0" w:name="_Hlk221796421"/>
-      <w:r>
-        <w:rPr>
-          <w:rFonts w:cstheme="minorHAnsi" w:hint="eastAsia"/>
-          <w:b/>
-          <w:bCs/>
-          <w:sz w:val="24"/>
-          <w:szCs w:val="24"/>
-        </w:rPr>
-        <w:t>SRD-05VDC-SL-C</w:t>
-      </w:r>
-      <w:bookmarkEnd w:id="0"/>
-      <w:r>
-        <w:rPr>
-          <w:rFonts w:cstheme="minorHAnsi"/>
-          <w:b/>
-          <w:bCs/>
-          <w:sz w:val="24"/>
-          <w:szCs w:val="24"/>
-        </w:rPr>
-        <w:t>.</w:t>
-      </w:r>
-      <w:r>
-        <w:rPr>
-          <w:rFonts w:cstheme="minorHAnsi"/>
-          <w:b/>
-          <w:bCs/>
-          <w:sz w:val="24"/>
-          <w:szCs w:val="24"/>
-        </w:rPr>
-        <w:br/>
-      </w:r>
-      <w:r>
-        <w:rPr>
-          <w:rFonts w:cstheme="minorHAnsi"/>
-          <w:b/>
-          <w:bCs/>
-          <w:sz w:val="24"/>
-          <w:szCs w:val="24"/>
-        </w:rPr>
-        <w:br/>
-      </w:r>
-      <w:r>
-        <w:rPr>
-          <w:rFonts w:cstheme="minorHAnsi"/>
-          <w:sz w:val="24"/>
-          <w:szCs w:val="24"/>
-        </w:rPr>
-        <w:t>Diodo TVS</w:t>
-      </w:r>
-      <w:r>
-        <w:rPr>
-          <w:rFonts w:cstheme="minorHAnsi"/>
-          <w:b/>
-          <w:bCs/>
-          <w:sz w:val="24"/>
-          <w:szCs w:val="24"/>
-        </w:rPr>
-        <w:t xml:space="preserve">: </w:t>
-      </w:r>
-      <w:bookmarkStart w:id="1" w:name="_Hlk221796440"/>
-      <w:r>
-        <w:rPr>
-          <w:rFonts w:cstheme="minorHAnsi" w:hint="eastAsia"/>
-          <w:b/>
-          <w:bCs/>
-          <w:sz w:val="24"/>
-          <w:szCs w:val="24"/>
-        </w:rPr>
-        <w:t>1N6267A-E3/54</w:t>
-      </w:r>
-      <w:r>
-        <w:rPr>
-          <w:rFonts w:cstheme="minorHAnsi"/>
-          <w:b/>
-          <w:bCs/>
-          <w:sz w:val="24"/>
-          <w:szCs w:val="24"/>
-        </w:rPr>
-        <w:t>.</w:t>
-      </w:r>
-    </w:p>
-    <w:p>
-      <w:pPr>
-        <w:rPr>
-          <w:rFonts w:cstheme="minorHAnsi"/>
-          <w:b/>
-          <w:bCs/>
-          <w:sz w:val="24"/>
-          <w:szCs w:val="24"/>
-        </w:rPr>
-      </w:pPr>
-    </w:p>
-    <w:p>
-      <w:pPr>
+      </w:pPr>
+      <w:r>
         <w:rPr>
           <w:rFonts w:ascii="Aptos" w:hAnsi="Aptos"/>
           <w:sz w:val="32"/>
@@ -587,7 +625,26 @@
           <w:u w:val="single"/>
           <w:lang w:val="es-ES"/>
         </w:rPr>
-      </w:pPr>
+        <w:t>Expansor de Gpios:</w:t>
+      </w:r>
+    </w:p>
+    <w:p>
+      <w:pPr>
+        <w:rPr>
+          <w:rFonts w:cstheme="minorHAnsi"/>
+          <w:sz w:val="24"/>
+          <w:szCs w:val="24"/>
+        </w:rPr>
+      </w:pPr>
+      <w:r>
+        <w:rPr>
+          <w:rFonts w:cstheme="minorHAnsi"/>
+          <w:sz w:val="24"/>
+          <w:szCs w:val="24"/>
+          <w:lang w:val="es-ES"/>
+        </w:rPr>
+        <w:t xml:space="preserve">Estoy entre dos expansores, </w:t>
+      </w:r>
       <w:r>
         <w:rPr>
           <w:rFonts w:ascii="Aptos" w:hAnsi="Aptos"/>
@@ -596,38 +653,39 @@
           <w:u w:val="single"/>
           <w:lang w:val="es-ES"/>
         </w:rPr>
-        <w:t xml:space="preserve">Conectores que van al Exterior: </w:t>
-      </w:r>
-    </w:p>
-    <w:p>
-      <w:pPr>
-        <w:rPr>
-          <w:rFonts w:cstheme="minorHAnsi"/>
-          <w:b/>
-          <w:bCs/>
-          <w:sz w:val="24"/>
-          <w:szCs w:val="24"/>
-        </w:rPr>
-      </w:pPr>
-    </w:p>
-    <w:bookmarkEnd w:id="1"/>
-    <w:p>
-      <w:pPr>
-        <w:rPr>
-          <w:rFonts w:cstheme="minorHAnsi"/>
-          <w:b/>
-          <w:bCs/>
-          <w:sz w:val="24"/>
-          <w:szCs w:val="24"/>
-        </w:rPr>
-      </w:pPr>
-      <w:r>
-        <w:rPr>
-          <w:rFonts w:cstheme="minorHAnsi"/>
-          <w:sz w:val="24"/>
-          <w:szCs w:val="24"/>
-        </w:rPr>
-        <w:t xml:space="preserve">Conector Servos: </w:t>
+        <w:t xml:space="preserve"> </w:t>
+      </w:r>
+      <w:r>
+        <w:rPr>
+          <w:rFonts w:cstheme="minorHAnsi"/>
+          <w:b/>
+          <w:bCs/>
+          <w:sz w:val="24"/>
+          <w:szCs w:val="24"/>
+          <w:lang w:val="es-ES"/>
+        </w:rPr>
+        <w:t>MCP23008T-E/SS</w:t>
+      </w:r>
+      <w:r>
+        <w:rPr>
+          <w:rFonts w:cstheme="minorHAnsi"/>
+          <w:b/>
+          <w:bCs/>
+          <w:sz w:val="24"/>
+          <w:szCs w:val="24"/>
+          <w:lang w:val="es-ES"/>
+        </w:rPr>
+        <w:t xml:space="preserve"> y</w:t>
+      </w:r>
+      <w:r>
+        <w:rPr>
+          <w:rFonts w:cstheme="minorHAnsi"/>
+          <w:b/>
+          <w:bCs/>
+          <w:sz w:val="24"/>
+          <w:szCs w:val="24"/>
+        </w:rPr>
+        <w:t xml:space="preserve"> </w:t>
       </w:r>
       <w:r>
         <w:rPr>
@@ -637,270 +695,6 @@
           <w:sz w:val="24"/>
           <w:szCs w:val="24"/>
         </w:rPr>
-        <w:t>2.54-2*3PPin</w:t>
-      </w:r>
-      <w:r>
-        <w:rPr>
-          <w:rFonts w:cstheme="minorHAnsi"/>
-          <w:b/>
-          <w:bCs/>
-          <w:sz w:val="24"/>
-          <w:szCs w:val="24"/>
-        </w:rPr>
-        <w:t>.</w:t>
-      </w:r>
-    </w:p>
-    <w:p>
-      <w:pPr>
-        <w:rPr>
-          <w:rFonts w:cstheme="minorHAnsi"/>
-          <w:b/>
-          <w:bCs/>
-          <w:sz w:val="24"/>
-          <w:szCs w:val="24"/>
-        </w:rPr>
-      </w:pPr>
-      <w:r>
-        <w:rPr>
-          <w:rFonts w:cstheme="minorHAnsi"/>
-          <w:sz w:val="24"/>
-          <w:szCs w:val="24"/>
-        </w:rPr>
-        <w:t>Cable</w:t>
-      </w:r>
-      <w:r>
-        <w:rPr>
-          <w:rFonts w:cstheme="minorHAnsi"/>
-          <w:sz w:val="24"/>
-          <w:szCs w:val="24"/>
-        </w:rPr>
-        <w:t xml:space="preserve"> Puente H:</w:t>
-      </w:r>
-      <w:r>
-        <w:rPr>
-          <w:rFonts w:cstheme="minorHAnsi"/>
-          <w:b/>
-          <w:bCs/>
-          <w:sz w:val="24"/>
-          <w:szCs w:val="24"/>
-        </w:rPr>
-        <w:t xml:space="preserve"> </w:t>
-      </w:r>
-      <w:proofErr w:type="spellStart"/>
-      <w:r>
-        <w:rPr>
-          <w:rFonts w:cstheme="minorHAnsi"/>
-          <w:b/>
-          <w:bCs/>
-          <w:sz w:val="24"/>
-          <w:szCs w:val="24"/>
-        </w:rPr>
-        <w:t>hanxia</w:t>
-      </w:r>
-      <w:proofErr w:type="spellEnd"/>
-      <w:r>
-        <w:rPr>
-          <w:rFonts w:cstheme="minorHAnsi"/>
-          <w:b/>
-          <w:bCs/>
-          <w:sz w:val="24"/>
-          <w:szCs w:val="24"/>
-        </w:rPr>
-        <w:t xml:space="preserve"> HX PH2.0-4P ST 200mm 24AWG</w:t>
-      </w:r>
-      <w:r>
-        <w:rPr>
-          <w:rFonts w:cstheme="minorHAnsi"/>
-          <w:b/>
-          <w:bCs/>
-          <w:sz w:val="24"/>
-          <w:szCs w:val="24"/>
-        </w:rPr>
-        <w:t>.</w:t>
-      </w:r>
-    </w:p>
-    <w:p>
-      <w:pPr>
-        <w:rPr>
-          <w:rFonts w:cstheme="minorHAnsi"/>
-          <w:b/>
-          <w:bCs/>
-          <w:sz w:val="24"/>
-          <w:szCs w:val="24"/>
-        </w:rPr>
-      </w:pPr>
-      <w:r>
-        <w:rPr>
-          <w:rFonts w:cstheme="minorHAnsi"/>
-          <w:sz w:val="24"/>
-          <w:szCs w:val="24"/>
-        </w:rPr>
-        <w:t>Conector Puente H:</w:t>
-      </w:r>
-      <w:r>
-        <w:rPr>
-          <w:rFonts w:cstheme="minorHAnsi"/>
-          <w:b/>
-          <w:bCs/>
-          <w:sz w:val="24"/>
-          <w:szCs w:val="24"/>
-        </w:rPr>
-        <w:t xml:space="preserve"> </w:t>
-      </w:r>
-      <w:r>
-        <w:rPr>
-          <w:rFonts w:cstheme="minorHAnsi"/>
-          <w:b/>
-          <w:bCs/>
-          <w:sz w:val="24"/>
-          <w:szCs w:val="24"/>
-        </w:rPr>
-        <w:t>S4B-PH-K-S</w:t>
-      </w:r>
-    </w:p>
-    <w:p>
-      <w:pPr>
-        <w:rPr>
-          <w:rFonts w:cstheme="minorHAnsi"/>
-          <w:b/>
-          <w:bCs/>
-          <w:sz w:val="24"/>
-          <w:szCs w:val="24"/>
-        </w:rPr>
-      </w:pPr>
-    </w:p>
-    <w:p>
-      <w:pPr>
-        <w:rPr>
-          <w:rFonts w:ascii="Aptos" w:hAnsi="Aptos"/>
-          <w:sz w:val="32"/>
-          <w:szCs w:val="32"/>
-          <w:u w:val="single"/>
-          <w:lang w:val="es-ES"/>
-        </w:rPr>
-      </w:pPr>
-      <w:r>
-        <w:rPr>
-          <w:rFonts w:ascii="Aptos" w:hAnsi="Aptos"/>
-          <w:sz w:val="32"/>
-          <w:szCs w:val="32"/>
-          <w:u w:val="single"/>
-          <w:lang w:val="es-ES"/>
-        </w:rPr>
-        <w:t xml:space="preserve">Expansor de </w:t>
-      </w:r>
-      <w:proofErr w:type="spellStart"/>
-      <w:r>
-        <w:rPr>
-          <w:rFonts w:ascii="Aptos" w:hAnsi="Aptos"/>
-          <w:sz w:val="32"/>
-          <w:szCs w:val="32"/>
-          <w:u w:val="single"/>
-          <w:lang w:val="es-ES"/>
-        </w:rPr>
-        <w:t>Gpios</w:t>
-      </w:r>
-      <w:proofErr w:type="spellEnd"/>
-      <w:r>
-        <w:rPr>
-          <w:rFonts w:ascii="Aptos" w:hAnsi="Aptos"/>
-          <w:sz w:val="32"/>
-          <w:szCs w:val="32"/>
-          <w:u w:val="single"/>
-          <w:lang w:val="es-ES"/>
-        </w:rPr>
-        <w:t>:</w:t>
-      </w:r>
-    </w:p>
-    <w:p>
-      <w:pPr>
-        <w:rPr>
-          <w:rFonts w:cstheme="minorHAnsi"/>
-          <w:sz w:val="24"/>
-          <w:szCs w:val="24"/>
-        </w:rPr>
-      </w:pPr>
-      <w:r>
-        <w:rPr>
-          <w:rFonts w:cstheme="minorHAnsi"/>
-          <w:sz w:val="24"/>
-          <w:szCs w:val="24"/>
-          <w:lang w:val="es-ES"/>
-        </w:rPr>
-        <w:t xml:space="preserve">Estoy entre dos </w:t>
-      </w:r>
-      <w:proofErr w:type="gramStart"/>
-      <w:r>
-        <w:rPr>
-          <w:rFonts w:cstheme="minorHAnsi"/>
-          <w:sz w:val="24"/>
-          <w:szCs w:val="24"/>
-          <w:lang w:val="es-ES"/>
-        </w:rPr>
-        <w:t xml:space="preserve">expansores, </w:t>
-      </w:r>
-      <w:r>
-        <w:rPr>
-          <w:rFonts w:ascii="Aptos" w:hAnsi="Aptos"/>
-          <w:sz w:val="32"/>
-          <w:szCs w:val="32"/>
-          <w:u w:val="single"/>
-          <w:lang w:val="es-ES"/>
-        </w:rPr>
-        <w:t xml:space="preserve"> </w:t>
-      </w:r>
-      <w:r>
-        <w:rPr>
-          <w:rFonts w:cstheme="minorHAnsi"/>
-          <w:b/>
-          <w:bCs/>
-          <w:sz w:val="24"/>
-          <w:szCs w:val="24"/>
-          <w:lang w:val="es-ES"/>
-        </w:rPr>
-        <w:t>MCP</w:t>
-      </w:r>
-      <w:proofErr w:type="gramEnd"/>
-      <w:r>
-        <w:rPr>
-          <w:rFonts w:cstheme="minorHAnsi"/>
-          <w:b/>
-          <w:bCs/>
-          <w:sz w:val="24"/>
-          <w:szCs w:val="24"/>
-          <w:lang w:val="es-ES"/>
-        </w:rPr>
-        <w:t>23008T-E/SS</w:t>
-      </w:r>
-      <w:r>
-        <w:rPr>
-          <w:rFonts w:cstheme="minorHAnsi"/>
-          <w:b/>
-          <w:bCs/>
-          <w:sz w:val="24"/>
-          <w:szCs w:val="24"/>
-          <w:lang w:val="es-ES"/>
-        </w:rPr>
-        <w:t xml:space="preserve"> y</w:t>
-      </w:r>
-      <w:r>
-        <w:rPr>
-          <w:rFonts w:cstheme="minorHAnsi"/>
-          <w:b/>
-          <w:bCs/>
-          <w:sz w:val="24"/>
-          <w:szCs w:val="24"/>
-        </w:rPr>
-        <w:t xml:space="preserve"> </w:t>
-      </w:r>
-      <w:r>
-        <w:rPr>
-          <w:rFonts w:cstheme="minorHAnsi" w:hint="eastAsia"/>
-          <w:b/>
-          <w:bCs/>
-          <w:sz w:val="24"/>
-          <w:szCs w:val="24"/>
-        </w:rPr>
         <w:t>MCP23017T-E/SS</w:t>
       </w:r>
       <w:r>
@@ -909,61 +703,7 @@
           <w:sz w:val="24"/>
           <w:szCs w:val="24"/>
         </w:rPr>
-        <w:t xml:space="preserve">, la principal diferencia entre los dos es el empaquetado, esto me jode en el tamaño, voy a empezar con el MCP23017 porque es el </w:t>
-      </w:r>
-      <w:proofErr w:type="spellStart"/>
-      <w:r>
-        <w:rPr>
-          <w:rFonts w:cstheme="minorHAnsi"/>
-          <w:sz w:val="24"/>
-          <w:szCs w:val="24"/>
-        </w:rPr>
-        <w:t>mas</w:t>
-      </w:r>
-      <w:proofErr w:type="spellEnd"/>
-      <w:r>
-        <w:rPr>
-          <w:rFonts w:cstheme="minorHAnsi"/>
-          <w:sz w:val="24"/>
-          <w:szCs w:val="24"/>
-        </w:rPr>
-        <w:t xml:space="preserve"> comercial y el que </w:t>
-      </w:r>
-      <w:proofErr w:type="spellStart"/>
-      <w:r>
-        <w:rPr>
-          <w:rFonts w:cstheme="minorHAnsi"/>
-          <w:sz w:val="24"/>
-          <w:szCs w:val="24"/>
-        </w:rPr>
-        <w:t>mas</w:t>
-      </w:r>
-      <w:proofErr w:type="spellEnd"/>
-      <w:r>
-        <w:rPr>
-          <w:rFonts w:cstheme="minorHAnsi"/>
-          <w:sz w:val="24"/>
-          <w:szCs w:val="24"/>
-        </w:rPr>
-        <w:t xml:space="preserve"> </w:t>
-      </w:r>
-      <w:proofErr w:type="spellStart"/>
-      <w:r>
-        <w:rPr>
-          <w:rFonts w:cstheme="minorHAnsi"/>
-          <w:sz w:val="24"/>
-          <w:szCs w:val="24"/>
-        </w:rPr>
-        <w:t>datasheets</w:t>
-      </w:r>
-      <w:proofErr w:type="spellEnd"/>
-      <w:r>
-        <w:rPr>
-          <w:rFonts w:cstheme="minorHAnsi"/>
-          <w:sz w:val="24"/>
-          <w:szCs w:val="24"/>
-        </w:rPr>
-        <w:t xml:space="preserve"> tiene pero si veo que estoy jugado de espacio.</w:t>
+        <w:t>, la principal diferencia entre los dos es el empaquetado, esto me jode en el tamaño, voy a empezar con el MCP23017 porque es el mas comercial y el que mas datasheets tiene pero si veo que estoy jugado de espacio.</w:t>
       </w:r>
     </w:p>
     <w:p>
@@ -1210,25 +950,7 @@
           <w:sz w:val="24"/>
           <w:szCs w:val="24"/>
         </w:rPr>
-        <w:t xml:space="preserve">Le agregamos una resistencia de 390 </w:t>
-      </w:r>
-      <w:proofErr w:type="spellStart"/>
-      <w:r>
-        <w:rPr>
-          <w:rFonts w:cstheme="minorHAnsi"/>
-          <w:sz w:val="24"/>
-          <w:szCs w:val="24"/>
-        </w:rPr>
-        <w:t>Ohms</w:t>
-      </w:r>
-      <w:proofErr w:type="spellEnd"/>
-      <w:r>
-        <w:rPr>
-          <w:rFonts w:cstheme="minorHAnsi"/>
-          <w:sz w:val="24"/>
-          <w:szCs w:val="24"/>
-        </w:rPr>
-        <w:t xml:space="preserve">: </w:t>
+        <w:t xml:space="preserve">Le agregamos una resistencia de 390 Ohms: </w:t>
       </w:r>
       <w:r>
         <w:rPr>
@@ -1504,41 +1226,13 @@
           <w:szCs w:val="24"/>
         </w:rPr>
       </w:pPr>
-      <w:proofErr w:type="spellStart"/>
-      <w:r>
-        <w:rPr>
-          <w:rFonts w:cstheme="minorHAnsi"/>
-          <w:sz w:val="24"/>
-          <w:szCs w:val="24"/>
-        </w:rPr>
-        <w:t>Rele</w:t>
-      </w:r>
-      <w:proofErr w:type="spellEnd"/>
-      <w:r>
-        <w:rPr>
-          <w:rFonts w:cstheme="minorHAnsi"/>
-          <w:sz w:val="24"/>
-          <w:szCs w:val="24"/>
-        </w:rPr>
-        <w:t xml:space="preserve"> usado para lógica </w:t>
-      </w:r>
-      <w:proofErr w:type="spellStart"/>
-      <w:r>
-        <w:rPr>
-          <w:rFonts w:cstheme="minorHAnsi"/>
-          <w:sz w:val="24"/>
-          <w:szCs w:val="24"/>
-        </w:rPr>
-        <w:t>Rasp</w:t>
-      </w:r>
-      <w:proofErr w:type="spellEnd"/>
-      <w:r>
-        <w:rPr>
-          <w:rFonts w:cstheme="minorHAnsi"/>
-          <w:sz w:val="24"/>
-          <w:szCs w:val="24"/>
-        </w:rPr>
-        <w:t xml:space="preserve">: </w:t>
+      <w:r>
+        <w:rPr>
+          <w:rFonts w:cstheme="minorHAnsi"/>
+          <w:sz w:val="24"/>
+          <w:szCs w:val="24"/>
+        </w:rPr>
+        <w:t xml:space="preserve">Rele usado para lógica Rasp: </w:t>
       </w:r>
       <w:r>
         <w:rPr>
@@ -1600,18 +1294,8 @@
           <w:sz w:val="24"/>
           <w:szCs w:val="24"/>
         </w:rPr>
-        <w:t xml:space="preserve">Transistor usado en lógica </w:t>
-      </w:r>
-      <w:proofErr w:type="spellStart"/>
-      <w:r>
-        <w:rPr>
-          <w:rFonts w:cstheme="minorHAnsi"/>
-          <w:sz w:val="24"/>
-          <w:szCs w:val="24"/>
-        </w:rPr>
-        <w:t>Rasp</w:t>
-      </w:r>
-      <w:proofErr w:type="spellEnd"/>
+        <w:t>Transistor usado en lógica Rasp</w:t>
+      </w:r>
       <w:r>
         <w:rPr>
           <w:rFonts w:cstheme="minorHAnsi"/>
@@ -1741,43 +1425,7 @@
           <w:sz w:val="24"/>
           <w:szCs w:val="24"/>
         </w:rPr>
-        <w:t xml:space="preserve">Video de </w:t>
-      </w:r>
-      <w:proofErr w:type="spellStart"/>
-      <w:r>
-        <w:rPr>
-          <w:rFonts w:cstheme="minorHAnsi"/>
-          <w:sz w:val="24"/>
-          <w:szCs w:val="24"/>
-        </w:rPr>
-        <w:t>Guia</w:t>
-      </w:r>
-      <w:proofErr w:type="spellEnd"/>
-      <w:r>
-        <w:rPr>
-          <w:rFonts w:cstheme="minorHAnsi"/>
-          <w:sz w:val="24"/>
-          <w:szCs w:val="24"/>
-        </w:rPr>
-        <w:t xml:space="preserve"> </w:t>
-      </w:r>
-      <w:proofErr w:type="spellStart"/>
-      <w:r>
-        <w:rPr>
-          <w:rFonts w:cstheme="minorHAnsi"/>
-          <w:sz w:val="24"/>
-          <w:szCs w:val="24"/>
-        </w:rPr>
-        <w:t>Esquematica</w:t>
-      </w:r>
-      <w:proofErr w:type="spellEnd"/>
-      <w:r>
-        <w:rPr>
-          <w:rFonts w:cstheme="minorHAnsi"/>
-          <w:sz w:val="24"/>
-          <w:szCs w:val="24"/>
-        </w:rPr>
-        <w:t xml:space="preserve">: </w:t>
+        <w:t xml:space="preserve">Video de Guia Esquematica: </w:t>
       </w:r>
       <w:hyperlink r:id="rId8" w:history="1">
         <w:r>
@@ -1842,15 +1490,7 @@
         <w:t>la resistencia</w:t>
       </w:r>
       <w:r>
-        <w:t xml:space="preserve"> </w:t>
-      </w:r>
-      <w:proofErr w:type="spellStart"/>
-      <w:r>
-        <w:t>pull</w:t>
-      </w:r>
-      <w:proofErr w:type="spellEnd"/>
-      <w:r>
-        <w:t>-up para I2C, además de las conexiones de USB-C como lo hace en el video, igualmente es una buena guía.</w:t>
+        <w:t xml:space="preserve"> pull-up para I2C, además de las conexiones de USB-C como lo hace en el video, igualmente es una buena guía.</w:t>
       </w:r>
     </w:p>
     <w:p>
@@ -1911,23 +1551,7 @@
             <w:b/>
             <w:bCs/>
           </w:rPr>
-          <w:t>https://documentation.espressif.com/esp32-s3-w</w:t>
-        </w:r>
-        <w:r>
-          <w:rPr>
-            <w:rStyle w:val="Hipervnculo"/>
-            <w:b/>
-            <w:bCs/>
-          </w:rPr>
-          <w:t>r</w:t>
-        </w:r>
-        <w:r>
-          <w:rPr>
-            <w:rStyle w:val="Hipervnculo"/>
-            <w:b/>
-            <w:bCs/>
-          </w:rPr>
-          <w:t>oom-1_wroom-1u_datasheet_en.pdf</w:t>
+          <w:t>https://documentation.espressif.com/esp32-s3-wroom-1_wroom-1u_datasheet_en.pdf</w:t>
         </w:r>
       </w:hyperlink>
     </w:p>
@@ -1945,23 +1569,7 @@
             <w:b/>
             <w:bCs/>
           </w:rPr>
-          <w:t>https://www.reddit.com</w:t>
-        </w:r>
-        <w:r>
-          <w:rPr>
-            <w:rStyle w:val="Hipervnculo"/>
-            <w:b/>
-            <w:bCs/>
-          </w:rPr>
-          <w:t>/</w:t>
-        </w:r>
-        <w:r>
-          <w:rPr>
-            <w:rStyle w:val="Hipervnculo"/>
-            <w:b/>
-            <w:bCs/>
-          </w:rPr>
-          <w:t>r/esp32/?f=flair_name%3A%22Board%20Review%22</w:t>
+          <w:t>https://www.reddit.com/r/esp32/?f=flair_name%3A%22Board%20Review%22</w:t>
         </w:r>
       </w:hyperlink>
       <w:r>
@@ -1992,62 +1600,14 @@
           <w:b/>
           <w:bCs/>
         </w:rPr>
-        <w:t xml:space="preserve">Para el </w:t>
-      </w:r>
-      <w:proofErr w:type="spellStart"/>
-      <w:r>
-        <w:rPr>
-          <w:b/>
-          <w:bCs/>
-        </w:rPr>
-        <w:t>reincio</w:t>
-      </w:r>
-      <w:proofErr w:type="spellEnd"/>
-      <w:r>
-        <w:rPr>
-          <w:b/>
-          <w:bCs/>
-        </w:rPr>
-        <w:t xml:space="preserve"> del Chip: </w:t>
-      </w:r>
-      <w:r>
-        <w:rPr>
-          <w:b/>
-          <w:bCs/>
-        </w:rPr>
-        <w:t xml:space="preserve">El ajuste recomendado para el circuito de retardo RC suele ser R = 10 </w:t>
-      </w:r>
-      <w:proofErr w:type="spellStart"/>
-      <w:r>
-        <w:rPr>
-          <w:b/>
-          <w:bCs/>
-        </w:rPr>
-        <w:t>kΩ</w:t>
-      </w:r>
-      <w:proofErr w:type="spellEnd"/>
-      <w:r>
-        <w:rPr>
-          <w:b/>
-          <w:bCs/>
-        </w:rPr>
-        <w:t xml:space="preserve"> y C = 1 </w:t>
-      </w:r>
-      <w:proofErr w:type="spellStart"/>
-      <w:r>
-        <w:rPr>
-          <w:b/>
-          <w:bCs/>
-        </w:rPr>
-        <w:t>μF</w:t>
-      </w:r>
-      <w:proofErr w:type="spellEnd"/>
-      <w:r>
-        <w:rPr>
-          <w:b/>
-          <w:bCs/>
-        </w:rPr>
-        <w:t>. Sin embargo, se deben ajustar parámetros específicos según las características de la fuente de alimentación y la sincronización de encendido y reinicio del chip.</w:t>
+        <w:t xml:space="preserve">Para el reincio del Chip: </w:t>
+      </w:r>
+      <w:r>
+        <w:rPr>
+          <w:b/>
+          <w:bCs/>
+        </w:rPr>
+        <w:t>El ajuste recomendado para el circuito de retardo RC suele ser R = 10 kΩ y C = 1 μF. Sin embargo, se deben ajustar parámetros específicos según las características de la fuente de alimentación y la sincronización de encendido y reinicio del chip.</w:t>
       </w:r>
     </w:p>
     <w:p>
@@ -2072,33 +1632,8 @@
           <w:b/>
           <w:bCs/>
         </w:rPr>
-        <w:t xml:space="preserve"> Para </w:t>
-      </w:r>
-      <w:proofErr w:type="spellStart"/>
-      <w:r>
-        <w:rPr>
-          <w:b/>
-          <w:bCs/>
-        </w:rPr>
-        <w:t>guia</w:t>
-      </w:r>
-      <w:proofErr w:type="spellEnd"/>
-      <w:r>
-        <w:rPr>
-          <w:b/>
-          <w:bCs/>
-        </w:rPr>
-        <w:t xml:space="preserve"> de conexiones y </w:t>
-      </w:r>
-      <w:proofErr w:type="spellStart"/>
-      <w:r>
-        <w:rPr>
-          <w:b/>
-          <w:bCs/>
-        </w:rPr>
-        <w:t>esquematico</w:t>
-      </w:r>
-      <w:proofErr w:type="spellEnd"/>
+        <w:t xml:space="preserve"> Para guia de conexiones y esquematico</w:t>
+      </w:r>
     </w:p>
     <w:p>
       <w:pPr>
@@ -2113,7 +1648,7 @@
         </w:rPr>
         <w:lastRenderedPageBreak/>
         <w:drawing>
-          <wp:inline distT="0" distB="0" distL="0" distR="0" wp14:anchorId="0231EAB4" wp14:editId="121320A0">
+          <wp:inline distT="0" distB="0" distL="0" distR="0" wp14:anchorId="0231EAB4" wp14:editId="2B0F3D40">
             <wp:extent cx="5400040" cy="3576955"/>
             <wp:effectExtent l="0" t="0" r="0" b="4445"/>
             <wp:docPr id="1567547339" name="Imagen 1"/>
@@ -2174,17 +1709,8 @@
           <w:b/>
           <w:bCs/>
         </w:rPr>
-        <w:t xml:space="preserve">Placa usada por </w:t>
-      </w:r>
-      <w:proofErr w:type="spellStart"/>
-      <w:r>
-        <w:rPr>
-          <w:b/>
-          <w:bCs/>
-        </w:rPr>
-        <w:t>NodeMCU</w:t>
-      </w:r>
-      <w:proofErr w:type="spellEnd"/>
+        <w:t>Placa usada por NodeMCU</w:t>
+      </w:r>
     </w:p>
     <w:p>
       <w:pPr>
@@ -2396,25 +1922,7 @@
             <w:sz w:val="24"/>
             <w:szCs w:val="24"/>
           </w:rPr>
-          <w:t>https://www</w:t>
-        </w:r>
-        <w:r>
-          <w:rPr>
-            <w:rStyle w:val="Hipervnculo"/>
-            <w:rFonts w:cstheme="minorHAnsi"/>
-            <w:sz w:val="24"/>
-            <w:szCs w:val="24"/>
-          </w:rPr>
-          <w:t>.</w:t>
-        </w:r>
-        <w:r>
-          <w:rPr>
-            <w:rStyle w:val="Hipervnculo"/>
-            <w:rFonts w:cstheme="minorHAnsi"/>
-            <w:sz w:val="24"/>
-            <w:szCs w:val="24"/>
-          </w:rPr>
-          <w:t>instructables.com/Design-and-Implementation-of-a-33V-Power-Supply-Us/</w:t>
+          <w:t>https://www.instructables.com/Design-and-Implementation-of-a-33V-Power-Supply-Us/</w:t>
         </w:r>
       </w:hyperlink>
       <w:r>
@@ -2611,43 +2119,7 @@
           <w:sz w:val="24"/>
           <w:szCs w:val="24"/>
         </w:rPr>
-        <w:t xml:space="preserve">Resistencia 180 </w:t>
-      </w:r>
-      <w:proofErr w:type="spellStart"/>
-      <w:r>
-        <w:rPr>
-          <w:rFonts w:cstheme="minorHAnsi"/>
-          <w:sz w:val="24"/>
-          <w:szCs w:val="24"/>
-        </w:rPr>
-        <w:t>Ohms</w:t>
-      </w:r>
-      <w:proofErr w:type="spellEnd"/>
-      <w:r>
-        <w:rPr>
-          <w:rFonts w:cstheme="minorHAnsi"/>
-          <w:sz w:val="24"/>
-          <w:szCs w:val="24"/>
-        </w:rPr>
-        <w:t xml:space="preserve"> </w:t>
-      </w:r>
-      <w:proofErr w:type="spellStart"/>
-      <w:r>
-        <w:rPr>
-          <w:rFonts w:cstheme="minorHAnsi"/>
-          <w:sz w:val="24"/>
-          <w:szCs w:val="24"/>
-        </w:rPr>
-        <w:t>LEDs</w:t>
-      </w:r>
-      <w:proofErr w:type="spellEnd"/>
-      <w:r>
-        <w:rPr>
-          <w:rFonts w:cstheme="minorHAnsi"/>
-          <w:sz w:val="24"/>
-          <w:szCs w:val="24"/>
-        </w:rPr>
-        <w:t xml:space="preserve"> -&gt; </w:t>
+        <w:t xml:space="preserve">Resistencia 180 Ohms LEDs -&gt; </w:t>
       </w:r>
       <w:r>
         <w:rPr>
@@ -2787,43 +2259,7 @@
           <w:szCs w:val="24"/>
         </w:rPr>
         <w:lastRenderedPageBreak/>
-        <w:t xml:space="preserve">Capacitor </w:t>
-      </w:r>
-      <w:proofErr w:type="spellStart"/>
-      <w:r>
-        <w:rPr>
-          <w:rFonts w:cstheme="minorHAnsi"/>
-          <w:sz w:val="24"/>
-          <w:szCs w:val="24"/>
-        </w:rPr>
-        <w:t>Ceramico</w:t>
-      </w:r>
-      <w:proofErr w:type="spellEnd"/>
-      <w:r>
-        <w:rPr>
-          <w:rFonts w:cstheme="minorHAnsi"/>
-          <w:sz w:val="24"/>
-          <w:szCs w:val="24"/>
-        </w:rPr>
-        <w:t xml:space="preserve"> 100 </w:t>
-      </w:r>
-      <w:proofErr w:type="spellStart"/>
-      <w:r>
-        <w:rPr>
-          <w:rFonts w:cstheme="minorHAnsi"/>
-          <w:sz w:val="24"/>
-          <w:szCs w:val="24"/>
-        </w:rPr>
-        <w:t>nF</w:t>
-      </w:r>
-      <w:proofErr w:type="spellEnd"/>
-      <w:r>
-        <w:rPr>
-          <w:rFonts w:cstheme="minorHAnsi"/>
-          <w:sz w:val="24"/>
-          <w:szCs w:val="24"/>
-        </w:rPr>
-        <w:t xml:space="preserve">: </w:t>
+        <w:t xml:space="preserve">Capacitor Ceramico 100 nF: </w:t>
       </w:r>
       <w:r>
         <w:rPr>
@@ -2848,43 +2284,7 @@
           <w:sz w:val="24"/>
           <w:szCs w:val="24"/>
         </w:rPr>
-        <w:t xml:space="preserve">Capacitor </w:t>
-      </w:r>
-      <w:proofErr w:type="spellStart"/>
-      <w:r>
-        <w:rPr>
-          <w:rFonts w:cstheme="minorHAnsi"/>
-          <w:sz w:val="24"/>
-          <w:szCs w:val="24"/>
-        </w:rPr>
-        <w:t>Tantalium</w:t>
-      </w:r>
-      <w:proofErr w:type="spellEnd"/>
-      <w:r>
-        <w:rPr>
-          <w:rFonts w:cstheme="minorHAnsi"/>
-          <w:sz w:val="24"/>
-          <w:szCs w:val="24"/>
-        </w:rPr>
-        <w:t xml:space="preserve"> 22 </w:t>
-      </w:r>
-      <w:proofErr w:type="spellStart"/>
-      <w:r>
-        <w:rPr>
-          <w:rFonts w:cstheme="minorHAnsi"/>
-          <w:sz w:val="24"/>
-          <w:szCs w:val="24"/>
-        </w:rPr>
-        <w:t>uF</w:t>
-      </w:r>
-      <w:proofErr w:type="spellEnd"/>
-      <w:r>
-        <w:rPr>
-          <w:rFonts w:cstheme="minorHAnsi"/>
-          <w:sz w:val="24"/>
-          <w:szCs w:val="24"/>
-        </w:rPr>
-        <w:t xml:space="preserve">: </w:t>
+        <w:t xml:space="preserve">Capacitor Tantalium 22 uF: </w:t>
       </w:r>
       <w:r>
         <w:rPr>
@@ -2901,17 +2301,277 @@
           <w:rFonts w:cstheme="minorHAnsi"/>
           <w:sz w:val="24"/>
           <w:szCs w:val="24"/>
-          <w:lang w:val="es-ES"/>
-        </w:rPr>
-      </w:pPr>
-    </w:p>
-    <w:p>
-      <w:pPr>
-        <w:rPr>
-          <w:rFonts w:ascii="Aptos" w:hAnsi="Aptos"/>
+        </w:rPr>
+      </w:pPr>
+      <w:r>
+        <w:rPr>
+          <w:rFonts w:cstheme="minorHAnsi"/>
+          <w:sz w:val="24"/>
+          <w:szCs w:val="24"/>
+        </w:rPr>
+        <w:t xml:space="preserve">Resistencia 5.1K para USB: </w:t>
+      </w:r>
+      <w:r>
+        <w:rPr>
+          <w:rFonts w:cstheme="minorHAnsi"/>
+          <w:sz w:val="24"/>
+          <w:szCs w:val="24"/>
+        </w:rPr>
+        <w:t>1206W4J0512T5E</w:t>
+      </w:r>
+    </w:p>
+    <w:p>
+      <w:pPr>
+        <w:rPr>
+          <w:rFonts w:cstheme="minorHAnsi"/>
+          <w:sz w:val="24"/>
+          <w:szCs w:val="24"/>
+        </w:rPr>
+      </w:pPr>
+      <w:r>
+        <w:rPr>
+          <w:rFonts w:cstheme="minorHAnsi"/>
+          <w:sz w:val="24"/>
+          <w:szCs w:val="24"/>
+        </w:rPr>
+        <w:t>LISTO LAS CONEXIONES DE GPIOS.</w:t>
+      </w:r>
+    </w:p>
+    <w:p>
+      <w:pPr>
+        <w:rPr>
+          <w:rFonts w:cstheme="minorHAnsi"/>
+          <w:sz w:val="24"/>
+          <w:szCs w:val="24"/>
+          <w:lang w:val="es-ES"/>
+        </w:rPr>
+      </w:pPr>
+      <w:r>
+        <w:rPr>
+          <w:rFonts w:cstheme="minorHAnsi"/>
           <w:sz w:val="32"/>
           <w:szCs w:val="32"/>
           <w:u w:val="single"/>
+        </w:rPr>
+        <w:t>LISTA DE C</w:t>
+      </w:r>
+      <w:r>
+        <w:rPr>
+          <w:rFonts w:cstheme="minorHAnsi"/>
+          <w:sz w:val="32"/>
+          <w:szCs w:val="32"/>
+          <w:u w:val="single"/>
+        </w:rPr>
+        <w:t>ONECTORES</w:t>
+      </w:r>
+      <w:r>
+        <w:rPr>
+          <w:rFonts w:cstheme="minorHAnsi"/>
+          <w:sz w:val="32"/>
+          <w:szCs w:val="32"/>
+          <w:u w:val="single"/>
+        </w:rPr>
+        <w:t>:</w:t>
+      </w:r>
+    </w:p>
+    <w:p>
+      <w:pPr>
+        <w:rPr>
+          <w:rFonts w:cstheme="minorHAnsi"/>
+          <w:sz w:val="24"/>
+          <w:szCs w:val="24"/>
+          <w:lang w:val="es-ES"/>
+        </w:rPr>
+      </w:pPr>
+      <w:r>
+        <w:rPr>
+          <w:rFonts w:cstheme="minorHAnsi"/>
+          <w:sz w:val="24"/>
+          <w:szCs w:val="24"/>
+          <w:lang w:val="es-ES"/>
+        </w:rPr>
+        <w:t xml:space="preserve">Conector de </w:t>
+      </w:r>
+      <w:r>
+        <w:rPr>
+          <w:rFonts w:cstheme="minorHAnsi"/>
+          <w:sz w:val="24"/>
+          <w:szCs w:val="24"/>
+          <w:lang w:val="es-ES"/>
+        </w:rPr>
+        <w:t>16</w:t>
+      </w:r>
+      <w:r>
+        <w:rPr>
+          <w:rFonts w:cstheme="minorHAnsi"/>
+          <w:sz w:val="24"/>
+          <w:szCs w:val="24"/>
+          <w:lang w:val="es-ES"/>
+        </w:rPr>
+        <w:t xml:space="preserve"> pines para alimentación de Ultrasonidos: </w:t>
+      </w:r>
+      <w:hyperlink r:id="rId19" w:tgtFrame="_blank" w:tooltip="2.54-2*8P" w:history="1">
+        <w:r>
+          <w:rPr>
+            <w:rStyle w:val="Hipervnculo"/>
+            <w:rFonts w:cstheme="minorHAnsi"/>
+            <w:sz w:val="24"/>
+            <w:szCs w:val="24"/>
+          </w:rPr>
+          <w:t>2.54-2*8P</w:t>
+        </w:r>
+      </w:hyperlink>
+    </w:p>
+    <w:p>
+      <w:pPr>
+        <w:rPr>
+          <w:rFonts w:cstheme="minorHAnsi"/>
+          <w:sz w:val="24"/>
+          <w:szCs w:val="24"/>
+          <w:lang w:val="es-ES"/>
+        </w:rPr>
+      </w:pPr>
+      <w:r>
+        <w:rPr>
+          <w:rFonts w:cstheme="minorHAnsi"/>
+          <w:sz w:val="24"/>
+          <w:szCs w:val="24"/>
+          <w:lang w:val="es-ES"/>
+        </w:rPr>
+        <w:t xml:space="preserve">Bornera de 2 pines: </w:t>
+      </w:r>
+      <w:hyperlink r:id="rId20" w:tgtFrame="_blank" w:tooltip="WJ127-5.0-02P-14-00A" w:history="1">
+        <w:r>
+          <w:rPr>
+            <w:rStyle w:val="Hipervnculo"/>
+            <w:rFonts w:cstheme="minorHAnsi"/>
+            <w:sz w:val="24"/>
+            <w:szCs w:val="24"/>
+          </w:rPr>
+          <w:t>WJ127-5.0-02P-14-00A</w:t>
+        </w:r>
+      </w:hyperlink>
+    </w:p>
+    <w:p>
+      <w:pPr>
+        <w:rPr>
+          <w:rFonts w:cstheme="minorHAnsi"/>
+          <w:sz w:val="24"/>
+          <w:szCs w:val="24"/>
+          <w:lang w:val="es-ES"/>
+        </w:rPr>
+      </w:pPr>
+      <w:r>
+        <w:rPr>
+          <w:rFonts w:cstheme="minorHAnsi"/>
+          <w:sz w:val="24"/>
+          <w:szCs w:val="24"/>
+          <w:lang w:val="es-ES"/>
+        </w:rPr>
+        <w:t xml:space="preserve">Header de 3 Pines: </w:t>
+      </w:r>
+      <w:r>
+        <w:rPr>
+          <w:rFonts w:cstheme="minorHAnsi"/>
+          <w:sz w:val="24"/>
+          <w:szCs w:val="24"/>
+          <w:lang w:val="es-ES"/>
+        </w:rPr>
+        <w:t xml:space="preserve">HX PH254-01-03-Z-L11.5 </w:t>
+      </w:r>
+    </w:p>
+    <w:p>
+      <w:pPr>
+        <w:rPr>
+          <w:rFonts w:cstheme="minorHAnsi"/>
+          <w:sz w:val="24"/>
+          <w:szCs w:val="24"/>
+          <w:lang w:val="es-ES"/>
+        </w:rPr>
+      </w:pPr>
+      <w:r>
+        <w:rPr>
+          <w:rFonts w:cstheme="minorHAnsi"/>
+          <w:sz w:val="24"/>
+          <w:szCs w:val="24"/>
+          <w:lang w:val="es-ES"/>
+        </w:rPr>
+        <w:t xml:space="preserve">Conector de 6 Pines para Servos y Puente H: </w:t>
+      </w:r>
+      <w:hyperlink r:id="rId21" w:tgtFrame="_blank" w:tooltip="2.54-2*3P" w:history="1">
+        <w:r>
+          <w:rPr>
+            <w:rStyle w:val="Hipervnculo"/>
+            <w:rFonts w:cstheme="minorHAnsi"/>
+            <w:sz w:val="24"/>
+            <w:szCs w:val="24"/>
+          </w:rPr>
+          <w:t>2.54-2*3P</w:t>
+        </w:r>
+      </w:hyperlink>
+    </w:p>
+    <w:p>
+      <w:pPr>
+        <w:rPr>
+          <w:rFonts w:cstheme="minorHAnsi"/>
+          <w:sz w:val="24"/>
+          <w:szCs w:val="24"/>
+          <w:lang w:val="es-ES"/>
+        </w:rPr>
+      </w:pPr>
+      <w:r>
+        <w:rPr>
+          <w:rFonts w:cstheme="minorHAnsi"/>
+          <w:sz w:val="24"/>
+          <w:szCs w:val="24"/>
+          <w:lang w:val="es-ES"/>
+        </w:rPr>
+        <w:t xml:space="preserve">Conector de 4 Pines para Sensor Giro y Finales de Carrera: </w:t>
+      </w:r>
+      <w:r>
+        <w:rPr>
+          <w:rFonts w:cstheme="minorHAnsi"/>
+          <w:sz w:val="24"/>
+          <w:szCs w:val="24"/>
+          <w:lang w:val="es-ES"/>
+        </w:rPr>
+        <w:t>S4B-XH-A(LF)(SN)</w:t>
+      </w:r>
+    </w:p>
+    <w:p>
+      <w:pPr>
+        <w:rPr>
+          <w:rFonts w:cstheme="minorHAnsi"/>
+          <w:sz w:val="24"/>
+          <w:szCs w:val="24"/>
+          <w:lang w:val="es-ES"/>
+        </w:rPr>
+      </w:pPr>
+      <w:r>
+        <w:rPr>
+          <w:rFonts w:cstheme="minorHAnsi"/>
+          <w:sz w:val="24"/>
+          <w:szCs w:val="24"/>
+          <w:lang w:val="es-ES"/>
+        </w:rPr>
+        <w:t xml:space="preserve">Conector Efecto Hall de 3 pines: </w:t>
+      </w:r>
+      <w:r>
+        <w:rPr>
+          <w:rFonts w:cstheme="minorHAnsi"/>
+          <w:sz w:val="24"/>
+          <w:szCs w:val="24"/>
+          <w:lang w:val="es-ES"/>
+        </w:rPr>
+        <w:t>S3B-XH-A(LF)(SN)</w:t>
+      </w:r>
+    </w:p>
+    <w:p>
+      <w:pPr>
+        <w:rPr>
+          <w:rFonts w:cstheme="minorHAnsi"/>
+          <w:sz w:val="24"/>
+          <w:szCs w:val="24"/>
           <w:lang w:val="es-ES"/>
         </w:rPr>
       </w:pPr>

</xml_diff>

<commit_message>
Se agrega terminada antes de modificaciones de mejora
</commit_message>
<xml_diff>
--- a/Salus IV/Lista Componentes.docx
+++ b/Salus IV/Lista Componentes.docx
@@ -171,8 +171,9 @@
           <w:u w:val="single"/>
           <w:lang w:val="es-ES"/>
         </w:rPr>
-        <w:t>Componentes Logica Rasp</w:t>
-      </w:r>
+        <w:t xml:space="preserve">Componentes </w:t>
+      </w:r>
+      <w:proofErr w:type="spellStart"/>
       <w:r>
         <w:rPr>
           <w:rFonts w:ascii="Aptos" w:hAnsi="Aptos"/>
@@ -181,255 +182,10 @@
           <w:u w:val="single"/>
           <w:lang w:val="es-ES"/>
         </w:rPr>
-        <w:t xml:space="preserve">: </w:t>
-      </w:r>
-    </w:p>
-    <w:p>
-      <w:pPr>
-        <w:rPr>
-          <w:rFonts w:cstheme="minorHAnsi"/>
-          <w:b/>
-          <w:bCs/>
-          <w:sz w:val="24"/>
-          <w:szCs w:val="24"/>
-        </w:rPr>
-      </w:pPr>
-      <w:r>
-        <w:rPr>
-          <w:rFonts w:cstheme="minorHAnsi"/>
-          <w:sz w:val="24"/>
-          <w:szCs w:val="24"/>
-          <w:lang w:val="es-ES"/>
-        </w:rPr>
-        <w:t>Conectores para Rasp:</w:t>
-      </w:r>
-      <w:r>
-        <w:rPr>
-          <w:rFonts w:cstheme="minorHAnsi"/>
-          <w:sz w:val="24"/>
-          <w:szCs w:val="24"/>
-          <w:lang w:val="es-ES"/>
-        </w:rPr>
-        <w:t xml:space="preserve"> </w:t>
-      </w:r>
-      <w:r>
-        <w:rPr>
-          <w:rFonts w:cstheme="minorHAnsi" w:hint="eastAsia"/>
-          <w:b/>
-          <w:bCs/>
-          <w:sz w:val="24"/>
-          <w:szCs w:val="24"/>
-        </w:rPr>
-        <w:t>2.54-2*20P Straight IDC Header, No Ejector</w:t>
-      </w:r>
-      <w:r>
-        <w:rPr>
-          <w:rFonts w:cstheme="minorHAnsi"/>
-          <w:b/>
-          <w:bCs/>
-          <w:sz w:val="24"/>
-          <w:szCs w:val="24"/>
-        </w:rPr>
-        <w:t>.</w:t>
-      </w:r>
-    </w:p>
-    <w:p>
-      <w:pPr>
-        <w:rPr>
-          <w:rFonts w:cstheme="minorHAnsi"/>
-          <w:b/>
-          <w:bCs/>
-          <w:sz w:val="24"/>
-          <w:szCs w:val="24"/>
-        </w:rPr>
-      </w:pPr>
-      <w:r>
-        <w:rPr>
-          <w:rFonts w:cstheme="minorHAnsi"/>
-          <w:sz w:val="24"/>
-          <w:szCs w:val="24"/>
-        </w:rPr>
-        <w:t>Transistores para la Lógica:</w:t>
-      </w:r>
-      <w:r>
-        <w:rPr>
-          <w:rFonts w:cstheme="minorHAnsi"/>
-          <w:sz w:val="24"/>
-          <w:szCs w:val="24"/>
-        </w:rPr>
-        <w:t xml:space="preserve"> </w:t>
-      </w:r>
-      <w:r>
-        <w:rPr>
-          <w:rFonts w:cstheme="minorHAnsi" w:hint="eastAsia"/>
-          <w:b/>
-          <w:bCs/>
-          <w:sz w:val="24"/>
-          <w:szCs w:val="24"/>
-        </w:rPr>
-        <w:t>IRLML6344PBF-HXY</w:t>
-      </w:r>
-      <w:r>
-        <w:rPr>
-          <w:rFonts w:cstheme="minorHAnsi"/>
-          <w:b/>
-          <w:bCs/>
-          <w:sz w:val="24"/>
-          <w:szCs w:val="24"/>
-        </w:rPr>
-        <w:t>.</w:t>
-      </w:r>
-    </w:p>
-    <w:p>
-      <w:pPr>
-        <w:rPr>
-          <w:rFonts w:cstheme="minorHAnsi"/>
-          <w:b/>
-          <w:bCs/>
-          <w:sz w:val="24"/>
-          <w:szCs w:val="24"/>
-        </w:rPr>
-      </w:pPr>
-      <w:r>
-        <w:rPr>
-          <w:rFonts w:cstheme="minorHAnsi"/>
-          <w:sz w:val="24"/>
-          <w:szCs w:val="24"/>
-        </w:rPr>
-        <w:t xml:space="preserve">Conector Output Señales: </w:t>
-      </w:r>
-      <w:r>
-        <w:rPr>
-          <w:rFonts w:cstheme="minorHAnsi" w:hint="eastAsia"/>
-          <w:b/>
-          <w:bCs/>
-          <w:sz w:val="24"/>
-          <w:szCs w:val="24"/>
-        </w:rPr>
-        <w:t>WJ127-5.0-06P-14-00A</w:t>
-      </w:r>
-    </w:p>
-    <w:p>
-      <w:pPr>
-        <w:rPr>
-          <w:rFonts w:cstheme="minorHAnsi"/>
-          <w:b/>
-          <w:bCs/>
-          <w:sz w:val="24"/>
-          <w:szCs w:val="24"/>
-        </w:rPr>
-      </w:pPr>
-      <w:r>
-        <w:rPr>
-          <w:rFonts w:cstheme="minorHAnsi"/>
-          <w:sz w:val="24"/>
-          <w:szCs w:val="24"/>
-        </w:rPr>
-        <w:t xml:space="preserve">Relay: </w:t>
-      </w:r>
-      <w:r>
-        <w:rPr>
-          <w:rFonts w:cstheme="minorHAnsi"/>
-          <w:sz w:val="24"/>
-          <w:szCs w:val="24"/>
-        </w:rPr>
-        <w:t xml:space="preserve">Este lo cambiamos, </w:t>
-      </w:r>
-      <w:bookmarkStart w:id="0" w:name="_Hlk221796421"/>
-      <w:r>
-        <w:rPr>
-          <w:rFonts w:cstheme="minorHAnsi" w:hint="eastAsia"/>
-          <w:b/>
-          <w:bCs/>
-          <w:sz w:val="24"/>
-          <w:szCs w:val="24"/>
-        </w:rPr>
-        <w:t>SRD-05VDC-SL-C</w:t>
-      </w:r>
-      <w:bookmarkEnd w:id="0"/>
-      <w:r>
-        <w:rPr>
-          <w:rFonts w:cstheme="minorHAnsi"/>
-          <w:b/>
-          <w:bCs/>
-          <w:sz w:val="24"/>
-          <w:szCs w:val="24"/>
-        </w:rPr>
-        <w:t>.</w:t>
-      </w:r>
-      <w:r>
-        <w:rPr>
-          <w:rFonts w:cstheme="minorHAnsi"/>
-          <w:b/>
-          <w:bCs/>
-          <w:sz w:val="24"/>
-          <w:szCs w:val="24"/>
-        </w:rPr>
-        <w:br/>
-      </w:r>
-      <w:r>
-        <w:rPr>
-          <w:rFonts w:cstheme="minorHAnsi"/>
-          <w:b/>
-          <w:bCs/>
-          <w:sz w:val="24"/>
-          <w:szCs w:val="24"/>
-        </w:rPr>
-        <w:br/>
-      </w:r>
-      <w:r>
-        <w:rPr>
-          <w:rFonts w:cstheme="minorHAnsi"/>
-          <w:sz w:val="24"/>
-          <w:szCs w:val="24"/>
-        </w:rPr>
-        <w:t>Diodo TVS</w:t>
-      </w:r>
-      <w:r>
-        <w:rPr>
-          <w:rFonts w:cstheme="minorHAnsi"/>
-          <w:b/>
-          <w:bCs/>
-          <w:sz w:val="24"/>
-          <w:szCs w:val="24"/>
-        </w:rPr>
-        <w:t xml:space="preserve">: </w:t>
-      </w:r>
-      <w:bookmarkStart w:id="1" w:name="_Hlk221796440"/>
-      <w:r>
-        <w:rPr>
-          <w:rFonts w:cstheme="minorHAnsi" w:hint="eastAsia"/>
-          <w:b/>
-          <w:bCs/>
-          <w:sz w:val="24"/>
-          <w:szCs w:val="24"/>
-        </w:rPr>
-        <w:t>1N6267A-E3/54</w:t>
-      </w:r>
-      <w:r>
-        <w:rPr>
-          <w:rFonts w:cstheme="minorHAnsi"/>
-          <w:b/>
-          <w:bCs/>
-          <w:sz w:val="24"/>
-          <w:szCs w:val="24"/>
-        </w:rPr>
-        <w:t>.</w:t>
-      </w:r>
-    </w:p>
-    <w:p>
-      <w:pPr>
-        <w:rPr>
-          <w:rFonts w:cstheme="minorHAnsi"/>
-          <w:b/>
-          <w:bCs/>
-          <w:sz w:val="24"/>
-          <w:szCs w:val="24"/>
-        </w:rPr>
-      </w:pPr>
-    </w:p>
-    <w:p>
-      <w:pPr>
+        <w:t>Logica</w:t>
+      </w:r>
+      <w:proofErr w:type="spellEnd"/>
+      <w:r>
         <w:rPr>
           <w:rFonts w:ascii="Aptos" w:hAnsi="Aptos"/>
           <w:sz w:val="32"/>
@@ -437,7 +193,9 @@
           <w:u w:val="single"/>
           <w:lang w:val="es-ES"/>
         </w:rPr>
-      </w:pPr>
+        <w:t xml:space="preserve"> </w:t>
+      </w:r>
+      <w:proofErr w:type="spellStart"/>
       <w:r>
         <w:rPr>
           <w:rFonts w:ascii="Aptos" w:hAnsi="Aptos"/>
@@ -446,169 +204,10 @@
           <w:u w:val="single"/>
           <w:lang w:val="es-ES"/>
         </w:rPr>
-        <w:t xml:space="preserve">Conectores que van al Exterior: </w:t>
-      </w:r>
-    </w:p>
-    <w:p>
-      <w:pPr>
-        <w:rPr>
-          <w:rFonts w:cstheme="minorHAnsi"/>
-          <w:b/>
-          <w:bCs/>
-          <w:sz w:val="24"/>
-          <w:szCs w:val="24"/>
-        </w:rPr>
-      </w:pPr>
-    </w:p>
-    <w:bookmarkEnd w:id="1"/>
-    <w:p>
-      <w:pPr>
-        <w:rPr>
-          <w:rFonts w:cstheme="minorHAnsi"/>
-          <w:b/>
-          <w:bCs/>
-          <w:sz w:val="24"/>
-          <w:szCs w:val="24"/>
-        </w:rPr>
-      </w:pPr>
-      <w:r>
-        <w:rPr>
-          <w:rFonts w:cstheme="minorHAnsi"/>
-          <w:sz w:val="24"/>
-          <w:szCs w:val="24"/>
-        </w:rPr>
-        <w:t xml:space="preserve">Conector Servos: </w:t>
-      </w:r>
-      <w:r>
-        <w:rPr>
-          <w:rFonts w:cstheme="minorHAnsi" w:hint="eastAsia"/>
-          <w:b/>
-          <w:bCs/>
-          <w:sz w:val="24"/>
-          <w:szCs w:val="24"/>
-        </w:rPr>
-        <w:t>2.54-2*3PPin</w:t>
-      </w:r>
-      <w:r>
-        <w:rPr>
-          <w:rFonts w:cstheme="minorHAnsi"/>
-          <w:b/>
-          <w:bCs/>
-          <w:sz w:val="24"/>
-          <w:szCs w:val="24"/>
-        </w:rPr>
-        <w:t>.</w:t>
-      </w:r>
-    </w:p>
-    <w:p>
-      <w:pPr>
-        <w:rPr>
-          <w:rFonts w:cstheme="minorHAnsi"/>
-          <w:b/>
-          <w:bCs/>
-          <w:sz w:val="24"/>
-          <w:szCs w:val="24"/>
-        </w:rPr>
-      </w:pPr>
-      <w:r>
-        <w:rPr>
-          <w:rFonts w:cstheme="minorHAnsi"/>
-          <w:sz w:val="24"/>
-          <w:szCs w:val="24"/>
-        </w:rPr>
-        <w:t>Cable</w:t>
-      </w:r>
-      <w:r>
-        <w:rPr>
-          <w:rFonts w:cstheme="minorHAnsi"/>
-          <w:sz w:val="24"/>
-          <w:szCs w:val="24"/>
-        </w:rPr>
-        <w:t xml:space="preserve"> Puente H:</w:t>
-      </w:r>
-      <w:r>
-        <w:rPr>
-          <w:rFonts w:cstheme="minorHAnsi"/>
-          <w:b/>
-          <w:bCs/>
-          <w:sz w:val="24"/>
-          <w:szCs w:val="24"/>
-        </w:rPr>
-        <w:t xml:space="preserve"> </w:t>
-      </w:r>
-      <w:r>
-        <w:rPr>
-          <w:rFonts w:cstheme="minorHAnsi"/>
-          <w:b/>
-          <w:bCs/>
-          <w:sz w:val="24"/>
-          <w:szCs w:val="24"/>
-        </w:rPr>
-        <w:t>hanxia HX PH2.0-4P ST 200mm 24AWG</w:t>
-      </w:r>
-      <w:r>
-        <w:rPr>
-          <w:rFonts w:cstheme="minorHAnsi"/>
-          <w:b/>
-          <w:bCs/>
-          <w:sz w:val="24"/>
-          <w:szCs w:val="24"/>
-        </w:rPr>
-        <w:t>.</w:t>
-      </w:r>
-    </w:p>
-    <w:p>
-      <w:pPr>
-        <w:rPr>
-          <w:rFonts w:cstheme="minorHAnsi"/>
-          <w:b/>
-          <w:bCs/>
-          <w:sz w:val="24"/>
-          <w:szCs w:val="24"/>
-        </w:rPr>
-      </w:pPr>
-      <w:r>
-        <w:rPr>
-          <w:rFonts w:cstheme="minorHAnsi"/>
-          <w:sz w:val="24"/>
-          <w:szCs w:val="24"/>
-        </w:rPr>
-        <w:t>Conector Puente H:</w:t>
-      </w:r>
-      <w:r>
-        <w:rPr>
-          <w:rFonts w:cstheme="minorHAnsi"/>
-          <w:b/>
-          <w:bCs/>
-          <w:sz w:val="24"/>
-          <w:szCs w:val="24"/>
-        </w:rPr>
-        <w:t xml:space="preserve"> </w:t>
-      </w:r>
-      <w:r>
-        <w:rPr>
-          <w:rFonts w:cstheme="minorHAnsi"/>
-          <w:b/>
-          <w:bCs/>
-          <w:sz w:val="24"/>
-          <w:szCs w:val="24"/>
-        </w:rPr>
-        <w:t>S4B-PH-K-S</w:t>
-      </w:r>
-    </w:p>
-    <w:p>
-      <w:pPr>
-        <w:rPr>
-          <w:rFonts w:cstheme="minorHAnsi"/>
-          <w:b/>
-          <w:bCs/>
-          <w:sz w:val="24"/>
-          <w:szCs w:val="24"/>
-        </w:rPr>
-      </w:pPr>
-    </w:p>
-    <w:p>
-      <w:pPr>
+        <w:t>Rasp</w:t>
+      </w:r>
+      <w:proofErr w:type="spellEnd"/>
+      <w:r>
         <w:rPr>
           <w:rFonts w:ascii="Aptos" w:hAnsi="Aptos"/>
           <w:sz w:val="32"/>
@@ -616,8 +215,341 @@
           <w:u w:val="single"/>
           <w:lang w:val="es-ES"/>
         </w:rPr>
-      </w:pPr>
-      <w:r>
+        <w:t xml:space="preserve">: </w:t>
+      </w:r>
+    </w:p>
+    <w:p>
+      <w:pPr>
+        <w:rPr>
+          <w:rFonts w:cstheme="minorHAnsi"/>
+          <w:b/>
+          <w:bCs/>
+          <w:sz w:val="24"/>
+          <w:szCs w:val="24"/>
+        </w:rPr>
+      </w:pPr>
+      <w:r>
+        <w:rPr>
+          <w:rFonts w:cstheme="minorHAnsi"/>
+          <w:sz w:val="24"/>
+          <w:szCs w:val="24"/>
+          <w:lang w:val="es-ES"/>
+        </w:rPr>
+        <w:t xml:space="preserve">Conectores para </w:t>
+      </w:r>
+      <w:proofErr w:type="spellStart"/>
+      <w:r>
+        <w:rPr>
+          <w:rFonts w:cstheme="minorHAnsi"/>
+          <w:sz w:val="24"/>
+          <w:szCs w:val="24"/>
+          <w:lang w:val="es-ES"/>
+        </w:rPr>
+        <w:t>Rasp</w:t>
+      </w:r>
+      <w:proofErr w:type="spellEnd"/>
+      <w:r>
+        <w:rPr>
+          <w:rFonts w:cstheme="minorHAnsi"/>
+          <w:sz w:val="24"/>
+          <w:szCs w:val="24"/>
+          <w:lang w:val="es-ES"/>
+        </w:rPr>
+        <w:t>:</w:t>
+      </w:r>
+      <w:r>
+        <w:rPr>
+          <w:rFonts w:cstheme="minorHAnsi"/>
+          <w:sz w:val="24"/>
+          <w:szCs w:val="24"/>
+          <w:lang w:val="es-ES"/>
+        </w:rPr>
+        <w:t xml:space="preserve"> </w:t>
+      </w:r>
+      <w:r>
+        <w:rPr>
+          <w:rFonts w:cstheme="minorHAnsi" w:hint="eastAsia"/>
+          <w:b/>
+          <w:bCs/>
+          <w:sz w:val="24"/>
+          <w:szCs w:val="24"/>
+        </w:rPr>
+        <w:t xml:space="preserve">2.54-2*20P </w:t>
+      </w:r>
+      <w:proofErr w:type="spellStart"/>
+      <w:r>
+        <w:rPr>
+          <w:rFonts w:cstheme="minorHAnsi" w:hint="eastAsia"/>
+          <w:b/>
+          <w:bCs/>
+          <w:sz w:val="24"/>
+          <w:szCs w:val="24"/>
+        </w:rPr>
+        <w:t>Straight</w:t>
+      </w:r>
+      <w:proofErr w:type="spellEnd"/>
+      <w:r>
+        <w:rPr>
+          <w:rFonts w:cstheme="minorHAnsi" w:hint="eastAsia"/>
+          <w:b/>
+          <w:bCs/>
+          <w:sz w:val="24"/>
+          <w:szCs w:val="24"/>
+        </w:rPr>
+        <w:t xml:space="preserve"> IDC </w:t>
+      </w:r>
+      <w:proofErr w:type="spellStart"/>
+      <w:r>
+        <w:rPr>
+          <w:rFonts w:cstheme="minorHAnsi" w:hint="eastAsia"/>
+          <w:b/>
+          <w:bCs/>
+          <w:sz w:val="24"/>
+          <w:szCs w:val="24"/>
+        </w:rPr>
+        <w:t>Header</w:t>
+      </w:r>
+      <w:proofErr w:type="spellEnd"/>
+      <w:r>
+        <w:rPr>
+          <w:rFonts w:cstheme="minorHAnsi" w:hint="eastAsia"/>
+          <w:b/>
+          <w:bCs/>
+          <w:sz w:val="24"/>
+          <w:szCs w:val="24"/>
+        </w:rPr>
+        <w:t xml:space="preserve">, No </w:t>
+      </w:r>
+      <w:proofErr w:type="spellStart"/>
+      <w:r>
+        <w:rPr>
+          <w:rFonts w:cstheme="minorHAnsi" w:hint="eastAsia"/>
+          <w:b/>
+          <w:bCs/>
+          <w:sz w:val="24"/>
+          <w:szCs w:val="24"/>
+        </w:rPr>
+        <w:t>Ejector</w:t>
+      </w:r>
+      <w:proofErr w:type="spellEnd"/>
+      <w:r>
+        <w:rPr>
+          <w:rFonts w:cstheme="minorHAnsi"/>
+          <w:b/>
+          <w:bCs/>
+          <w:sz w:val="24"/>
+          <w:szCs w:val="24"/>
+        </w:rPr>
+        <w:t>.</w:t>
+      </w:r>
+    </w:p>
+    <w:p>
+      <w:pPr>
+        <w:rPr>
+          <w:rFonts w:cstheme="minorHAnsi"/>
+          <w:b/>
+          <w:bCs/>
+          <w:sz w:val="24"/>
+          <w:szCs w:val="24"/>
+        </w:rPr>
+      </w:pPr>
+      <w:r>
+        <w:rPr>
+          <w:rFonts w:cstheme="minorHAnsi"/>
+          <w:sz w:val="24"/>
+          <w:szCs w:val="24"/>
+        </w:rPr>
+        <w:t>Transistores para la Lógica:</w:t>
+      </w:r>
+      <w:r>
+        <w:rPr>
+          <w:rFonts w:cstheme="minorHAnsi"/>
+          <w:sz w:val="24"/>
+          <w:szCs w:val="24"/>
+        </w:rPr>
+        <w:t xml:space="preserve"> </w:t>
+      </w:r>
+      <w:r>
+        <w:rPr>
+          <w:rFonts w:cstheme="minorHAnsi" w:hint="eastAsia"/>
+          <w:b/>
+          <w:bCs/>
+          <w:sz w:val="24"/>
+          <w:szCs w:val="24"/>
+        </w:rPr>
+        <w:t>IRLML6344PBF-HXY</w:t>
+      </w:r>
+      <w:r>
+        <w:rPr>
+          <w:rFonts w:cstheme="minorHAnsi"/>
+          <w:b/>
+          <w:bCs/>
+          <w:sz w:val="24"/>
+          <w:szCs w:val="24"/>
+        </w:rPr>
+        <w:t>.</w:t>
+      </w:r>
+    </w:p>
+    <w:p>
+      <w:pPr>
+        <w:rPr>
+          <w:rFonts w:cstheme="minorHAnsi"/>
+          <w:b/>
+          <w:bCs/>
+          <w:sz w:val="24"/>
+          <w:szCs w:val="24"/>
+        </w:rPr>
+      </w:pPr>
+      <w:r>
+        <w:rPr>
+          <w:rFonts w:cstheme="minorHAnsi"/>
+          <w:sz w:val="24"/>
+          <w:szCs w:val="24"/>
+        </w:rPr>
+        <w:t xml:space="preserve">Conector Output Señales: </w:t>
+      </w:r>
+      <w:r>
+        <w:rPr>
+          <w:rFonts w:cstheme="minorHAnsi" w:hint="eastAsia"/>
+          <w:b/>
+          <w:bCs/>
+          <w:sz w:val="24"/>
+          <w:szCs w:val="24"/>
+        </w:rPr>
+        <w:t>WJ127-5.0-06P-14-00A</w:t>
+      </w:r>
+    </w:p>
+    <w:p>
+      <w:pPr>
+        <w:rPr>
+          <w:rFonts w:cstheme="minorHAnsi"/>
+          <w:b/>
+          <w:bCs/>
+          <w:sz w:val="24"/>
+          <w:szCs w:val="24"/>
+        </w:rPr>
+      </w:pPr>
+      <w:proofErr w:type="spellStart"/>
+      <w:r>
+        <w:rPr>
+          <w:rFonts w:cstheme="minorHAnsi"/>
+          <w:sz w:val="24"/>
+          <w:szCs w:val="24"/>
+        </w:rPr>
+        <w:t>Relay</w:t>
+      </w:r>
+      <w:proofErr w:type="spellEnd"/>
+      <w:r>
+        <w:rPr>
+          <w:rFonts w:cstheme="minorHAnsi"/>
+          <w:sz w:val="24"/>
+          <w:szCs w:val="24"/>
+        </w:rPr>
+        <w:t xml:space="preserve">: </w:t>
+      </w:r>
+      <w:r>
+        <w:rPr>
+          <w:rFonts w:cstheme="minorHAnsi"/>
+          <w:sz w:val="24"/>
+          <w:szCs w:val="24"/>
+        </w:rPr>
+        <w:t xml:space="preserve">Este lo cambiamos, </w:t>
+      </w:r>
+      <w:bookmarkStart w:id="0" w:name="_Hlk221796421"/>
+      <w:r>
+        <w:rPr>
+          <w:rFonts w:cstheme="minorHAnsi" w:hint="eastAsia"/>
+          <w:b/>
+          <w:bCs/>
+          <w:sz w:val="24"/>
+          <w:szCs w:val="24"/>
+        </w:rPr>
+        <w:t>SRD-05VDC-SL-C</w:t>
+      </w:r>
+      <w:bookmarkEnd w:id="0"/>
+      <w:r>
+        <w:rPr>
+          <w:rFonts w:cstheme="minorHAnsi"/>
+          <w:b/>
+          <w:bCs/>
+          <w:sz w:val="24"/>
+          <w:szCs w:val="24"/>
+        </w:rPr>
+        <w:t>.</w:t>
+      </w:r>
+      <w:r>
+        <w:rPr>
+          <w:rFonts w:cstheme="minorHAnsi"/>
+          <w:b/>
+          <w:bCs/>
+          <w:sz w:val="24"/>
+          <w:szCs w:val="24"/>
+        </w:rPr>
+        <w:br/>
+      </w:r>
+      <w:r>
+        <w:rPr>
+          <w:rFonts w:cstheme="minorHAnsi"/>
+          <w:b/>
+          <w:bCs/>
+          <w:sz w:val="24"/>
+          <w:szCs w:val="24"/>
+        </w:rPr>
+        <w:br/>
+      </w:r>
+      <w:r>
+        <w:rPr>
+          <w:rFonts w:cstheme="minorHAnsi"/>
+          <w:sz w:val="24"/>
+          <w:szCs w:val="24"/>
+        </w:rPr>
+        <w:t>Diodo TVS</w:t>
+      </w:r>
+      <w:r>
+        <w:rPr>
+          <w:rFonts w:cstheme="minorHAnsi"/>
+          <w:b/>
+          <w:bCs/>
+          <w:sz w:val="24"/>
+          <w:szCs w:val="24"/>
+        </w:rPr>
+        <w:t xml:space="preserve">: </w:t>
+      </w:r>
+      <w:bookmarkStart w:id="1" w:name="_Hlk221796440"/>
+      <w:r>
+        <w:rPr>
+          <w:rFonts w:cstheme="minorHAnsi" w:hint="eastAsia"/>
+          <w:b/>
+          <w:bCs/>
+          <w:sz w:val="24"/>
+          <w:szCs w:val="24"/>
+        </w:rPr>
+        <w:t>1N6267A-E3/54</w:t>
+      </w:r>
+      <w:r>
+        <w:rPr>
+          <w:rFonts w:cstheme="minorHAnsi"/>
+          <w:b/>
+          <w:bCs/>
+          <w:sz w:val="24"/>
+          <w:szCs w:val="24"/>
+        </w:rPr>
+        <w:t>.</w:t>
+      </w:r>
+    </w:p>
+    <w:p>
+      <w:pPr>
+        <w:rPr>
+          <w:rFonts w:cstheme="minorHAnsi"/>
+          <w:b/>
+          <w:bCs/>
+          <w:sz w:val="24"/>
+          <w:szCs w:val="24"/>
+        </w:rPr>
+      </w:pPr>
+    </w:p>
+    <w:p>
+      <w:pPr>
         <w:rPr>
           <w:rFonts w:ascii="Aptos" w:hAnsi="Aptos"/>
           <w:sz w:val="32"/>
@@ -625,26 +557,7 @@
           <w:u w:val="single"/>
           <w:lang w:val="es-ES"/>
         </w:rPr>
-        <w:t>Expansor de Gpios:</w:t>
-      </w:r>
-    </w:p>
-    <w:p>
-      <w:pPr>
-        <w:rPr>
-          <w:rFonts w:cstheme="minorHAnsi"/>
-          <w:sz w:val="24"/>
-          <w:szCs w:val="24"/>
-        </w:rPr>
-      </w:pPr>
-      <w:r>
-        <w:rPr>
-          <w:rFonts w:cstheme="minorHAnsi"/>
-          <w:sz w:val="24"/>
-          <w:szCs w:val="24"/>
-          <w:lang w:val="es-ES"/>
-        </w:rPr>
-        <w:t xml:space="preserve">Estoy entre dos expansores, </w:t>
-      </w:r>
+      </w:pPr>
       <w:r>
         <w:rPr>
           <w:rFonts w:ascii="Aptos" w:hAnsi="Aptos"/>
@@ -653,8 +566,249 @@
           <w:u w:val="single"/>
           <w:lang w:val="es-ES"/>
         </w:rPr>
+        <w:t xml:space="preserve">Conectores que van al Exterior: </w:t>
+      </w:r>
+    </w:p>
+    <w:p>
+      <w:pPr>
+        <w:rPr>
+          <w:rFonts w:cstheme="minorHAnsi"/>
+          <w:b/>
+          <w:bCs/>
+          <w:sz w:val="24"/>
+          <w:szCs w:val="24"/>
+        </w:rPr>
+      </w:pPr>
+    </w:p>
+    <w:bookmarkEnd w:id="1"/>
+    <w:p>
+      <w:pPr>
+        <w:rPr>
+          <w:rFonts w:cstheme="minorHAnsi"/>
+          <w:b/>
+          <w:bCs/>
+          <w:sz w:val="24"/>
+          <w:szCs w:val="24"/>
+        </w:rPr>
+      </w:pPr>
+      <w:r>
+        <w:rPr>
+          <w:rFonts w:cstheme="minorHAnsi"/>
+          <w:sz w:val="24"/>
+          <w:szCs w:val="24"/>
+        </w:rPr>
+        <w:t xml:space="preserve">Conector Servos: </w:t>
+      </w:r>
+      <w:r>
+        <w:rPr>
+          <w:rFonts w:cstheme="minorHAnsi" w:hint="eastAsia"/>
+          <w:b/>
+          <w:bCs/>
+          <w:sz w:val="24"/>
+          <w:szCs w:val="24"/>
+        </w:rPr>
+        <w:t>2.54-2*3PPin</w:t>
+      </w:r>
+      <w:r>
+        <w:rPr>
+          <w:rFonts w:cstheme="minorHAnsi"/>
+          <w:b/>
+          <w:bCs/>
+          <w:sz w:val="24"/>
+          <w:szCs w:val="24"/>
+        </w:rPr>
+        <w:t>.</w:t>
+      </w:r>
+    </w:p>
+    <w:p>
+      <w:pPr>
+        <w:rPr>
+          <w:rFonts w:cstheme="minorHAnsi"/>
+          <w:b/>
+          <w:bCs/>
+          <w:sz w:val="24"/>
+          <w:szCs w:val="24"/>
+        </w:rPr>
+      </w:pPr>
+      <w:r>
+        <w:rPr>
+          <w:rFonts w:cstheme="minorHAnsi"/>
+          <w:sz w:val="24"/>
+          <w:szCs w:val="24"/>
+        </w:rPr>
+        <w:t>Cable</w:t>
+      </w:r>
+      <w:r>
+        <w:rPr>
+          <w:rFonts w:cstheme="minorHAnsi"/>
+          <w:sz w:val="24"/>
+          <w:szCs w:val="24"/>
+        </w:rPr>
+        <w:t xml:space="preserve"> Puente H:</w:t>
+      </w:r>
+      <w:r>
+        <w:rPr>
+          <w:rFonts w:cstheme="minorHAnsi"/>
+          <w:b/>
+          <w:bCs/>
+          <w:sz w:val="24"/>
+          <w:szCs w:val="24"/>
+        </w:rPr>
         <w:t xml:space="preserve"> </w:t>
       </w:r>
+      <w:proofErr w:type="spellStart"/>
+      <w:r>
+        <w:rPr>
+          <w:rFonts w:cstheme="minorHAnsi"/>
+          <w:b/>
+          <w:bCs/>
+          <w:sz w:val="24"/>
+          <w:szCs w:val="24"/>
+        </w:rPr>
+        <w:t>hanxia</w:t>
+      </w:r>
+      <w:proofErr w:type="spellEnd"/>
+      <w:r>
+        <w:rPr>
+          <w:rFonts w:cstheme="minorHAnsi"/>
+          <w:b/>
+          <w:bCs/>
+          <w:sz w:val="24"/>
+          <w:szCs w:val="24"/>
+        </w:rPr>
+        <w:t xml:space="preserve"> HX PH2.0-4P ST 200mm 24AWG</w:t>
+      </w:r>
+      <w:r>
+        <w:rPr>
+          <w:rFonts w:cstheme="minorHAnsi"/>
+          <w:b/>
+          <w:bCs/>
+          <w:sz w:val="24"/>
+          <w:szCs w:val="24"/>
+        </w:rPr>
+        <w:t>.</w:t>
+      </w:r>
+    </w:p>
+    <w:p>
+      <w:pPr>
+        <w:rPr>
+          <w:rFonts w:cstheme="minorHAnsi"/>
+          <w:b/>
+          <w:bCs/>
+          <w:sz w:val="24"/>
+          <w:szCs w:val="24"/>
+        </w:rPr>
+      </w:pPr>
+      <w:r>
+        <w:rPr>
+          <w:rFonts w:cstheme="minorHAnsi"/>
+          <w:sz w:val="24"/>
+          <w:szCs w:val="24"/>
+        </w:rPr>
+        <w:t>Conector Puente H:</w:t>
+      </w:r>
+      <w:r>
+        <w:rPr>
+          <w:rFonts w:cstheme="minorHAnsi"/>
+          <w:b/>
+          <w:bCs/>
+          <w:sz w:val="24"/>
+          <w:szCs w:val="24"/>
+        </w:rPr>
+        <w:t xml:space="preserve"> </w:t>
+      </w:r>
+      <w:r>
+        <w:rPr>
+          <w:rFonts w:cstheme="minorHAnsi"/>
+          <w:b/>
+          <w:bCs/>
+          <w:sz w:val="24"/>
+          <w:szCs w:val="24"/>
+        </w:rPr>
+        <w:t>S4B-PH-K-S</w:t>
+      </w:r>
+    </w:p>
+    <w:p>
+      <w:pPr>
+        <w:rPr>
+          <w:rFonts w:cstheme="minorHAnsi"/>
+          <w:b/>
+          <w:bCs/>
+          <w:sz w:val="24"/>
+          <w:szCs w:val="24"/>
+        </w:rPr>
+      </w:pPr>
+    </w:p>
+    <w:p>
+      <w:pPr>
+        <w:rPr>
+          <w:rFonts w:ascii="Aptos" w:hAnsi="Aptos"/>
+          <w:sz w:val="32"/>
+          <w:szCs w:val="32"/>
+          <w:u w:val="single"/>
+          <w:lang w:val="es-ES"/>
+        </w:rPr>
+      </w:pPr>
+      <w:r>
+        <w:rPr>
+          <w:rFonts w:ascii="Aptos" w:hAnsi="Aptos"/>
+          <w:sz w:val="32"/>
+          <w:szCs w:val="32"/>
+          <w:u w:val="single"/>
+          <w:lang w:val="es-ES"/>
+        </w:rPr>
+        <w:t xml:space="preserve">Expansor de </w:t>
+      </w:r>
+      <w:proofErr w:type="spellStart"/>
+      <w:r>
+        <w:rPr>
+          <w:rFonts w:ascii="Aptos" w:hAnsi="Aptos"/>
+          <w:sz w:val="32"/>
+          <w:szCs w:val="32"/>
+          <w:u w:val="single"/>
+          <w:lang w:val="es-ES"/>
+        </w:rPr>
+        <w:t>Gpios</w:t>
+      </w:r>
+      <w:proofErr w:type="spellEnd"/>
+      <w:r>
+        <w:rPr>
+          <w:rFonts w:ascii="Aptos" w:hAnsi="Aptos"/>
+          <w:sz w:val="32"/>
+          <w:szCs w:val="32"/>
+          <w:u w:val="single"/>
+          <w:lang w:val="es-ES"/>
+        </w:rPr>
+        <w:t>:</w:t>
+      </w:r>
+    </w:p>
+    <w:p>
+      <w:pPr>
+        <w:rPr>
+          <w:rFonts w:cstheme="minorHAnsi"/>
+          <w:sz w:val="24"/>
+          <w:szCs w:val="24"/>
+        </w:rPr>
+      </w:pPr>
+      <w:r>
+        <w:rPr>
+          <w:rFonts w:cstheme="minorHAnsi"/>
+          <w:sz w:val="24"/>
+          <w:szCs w:val="24"/>
+          <w:lang w:val="es-ES"/>
+        </w:rPr>
+        <w:t xml:space="preserve">Estoy entre dos expansores, </w:t>
+      </w:r>
+      <w:r>
+        <w:rPr>
+          <w:rFonts w:ascii="Aptos" w:hAnsi="Aptos"/>
+          <w:sz w:val="32"/>
+          <w:szCs w:val="32"/>
+          <w:u w:val="single"/>
+          <w:lang w:val="es-ES"/>
+        </w:rPr>
+        <w:t xml:space="preserve"> </w:t>
+      </w:r>
       <w:r>
         <w:rPr>
           <w:rFonts w:cstheme="minorHAnsi"/>
@@ -703,7 +857,57 @@
           <w:sz w:val="24"/>
           <w:szCs w:val="24"/>
         </w:rPr>
-        <w:t>, la principal diferencia entre los dos es el empaquetado, esto me jode en el tamaño, voy a empezar con el MCP23017 porque es el mas comercial y el que mas datasheets tiene pero si veo que estoy jugado de espacio.</w:t>
+        <w:t xml:space="preserve">, la principal diferencia entre los dos es el empaquetado, esto me jode en el tamaño, voy a empezar con el MCP23017 porque es el </w:t>
+      </w:r>
+      <w:r>
+        <w:rPr>
+          <w:rFonts w:cstheme="minorHAnsi"/>
+          <w:sz w:val="24"/>
+          <w:szCs w:val="24"/>
+        </w:rPr>
+        <w:t>más</w:t>
+      </w:r>
+      <w:r>
+        <w:rPr>
+          <w:rFonts w:cstheme="minorHAnsi"/>
+          <w:sz w:val="24"/>
+          <w:szCs w:val="24"/>
+        </w:rPr>
+        <w:t xml:space="preserve"> comercial y el que </w:t>
+      </w:r>
+      <w:r>
+        <w:rPr>
+          <w:rFonts w:cstheme="minorHAnsi"/>
+          <w:sz w:val="24"/>
+          <w:szCs w:val="24"/>
+        </w:rPr>
+        <w:t>más</w:t>
+      </w:r>
+      <w:r>
+        <w:rPr>
+          <w:rFonts w:cstheme="minorHAnsi"/>
+          <w:sz w:val="24"/>
+          <w:szCs w:val="24"/>
+        </w:rPr>
+        <w:t xml:space="preserve"> </w:t>
+      </w:r>
+      <w:proofErr w:type="spellStart"/>
+      <w:r>
+        <w:rPr>
+          <w:rFonts w:cstheme="minorHAnsi"/>
+          <w:sz w:val="24"/>
+          <w:szCs w:val="24"/>
+        </w:rPr>
+        <w:t>datasheets</w:t>
+      </w:r>
+      <w:proofErr w:type="spellEnd"/>
+      <w:r>
+        <w:rPr>
+          <w:rFonts w:cstheme="minorHAnsi"/>
+          <w:sz w:val="24"/>
+          <w:szCs w:val="24"/>
+        </w:rPr>
+        <w:t xml:space="preserve"> tiene pero si veo que estoy jugado de espacio.</w:t>
       </w:r>
     </w:p>
     <w:p>
@@ -950,7 +1154,25 @@
           <w:sz w:val="24"/>
           <w:szCs w:val="24"/>
         </w:rPr>
-        <w:t xml:space="preserve">Le agregamos una resistencia de 390 Ohms: </w:t>
+        <w:t xml:space="preserve">Le agregamos una resistencia de 390 </w:t>
+      </w:r>
+      <w:proofErr w:type="spellStart"/>
+      <w:r>
+        <w:rPr>
+          <w:rFonts w:cstheme="minorHAnsi"/>
+          <w:sz w:val="24"/>
+          <w:szCs w:val="24"/>
+        </w:rPr>
+        <w:t>Ohms</w:t>
+      </w:r>
+      <w:proofErr w:type="spellEnd"/>
+      <w:r>
+        <w:rPr>
+          <w:rFonts w:cstheme="minorHAnsi"/>
+          <w:sz w:val="24"/>
+          <w:szCs w:val="24"/>
+        </w:rPr>
+        <w:t xml:space="preserve">: </w:t>
       </w:r>
       <w:r>
         <w:rPr>
@@ -1131,6 +1353,74 @@
           <w:rFonts w:cstheme="minorHAnsi"/>
           <w:sz w:val="24"/>
           <w:szCs w:val="24"/>
+        </w:rPr>
+      </w:pPr>
+      <w:r>
+        <w:rPr>
+          <w:rFonts w:cstheme="minorHAnsi"/>
+          <w:sz w:val="24"/>
+          <w:szCs w:val="24"/>
+        </w:rPr>
+        <w:t xml:space="preserve">Cambie las resistencias por dos </w:t>
+      </w:r>
+      <w:proofErr w:type="spellStart"/>
+      <w:r>
+        <w:rPr>
+          <w:rFonts w:cstheme="minorHAnsi"/>
+          <w:sz w:val="24"/>
+          <w:szCs w:val="24"/>
+        </w:rPr>
+        <w:t>arrays</w:t>
+      </w:r>
+      <w:proofErr w:type="spellEnd"/>
+      <w:r>
+        <w:rPr>
+          <w:rFonts w:cstheme="minorHAnsi"/>
+          <w:sz w:val="24"/>
+          <w:szCs w:val="24"/>
+        </w:rPr>
+        <w:t xml:space="preserve"> de ellas: </w:t>
+      </w:r>
+      <w:r>
+        <w:rPr>
+          <w:rFonts w:cstheme="minorHAnsi"/>
+          <w:sz w:val="24"/>
+          <w:szCs w:val="24"/>
+        </w:rPr>
+        <w:t>YC248-JR-074K7L</w:t>
+      </w:r>
+      <w:r>
+        <w:rPr>
+          <w:rFonts w:cstheme="minorHAnsi"/>
+          <w:sz w:val="24"/>
+          <w:szCs w:val="24"/>
+        </w:rPr>
+        <w:t xml:space="preserve">. </w:t>
+      </w:r>
+    </w:p>
+    <w:p>
+      <w:pPr>
+        <w:rPr>
+          <w:rFonts w:cstheme="minorHAnsi"/>
+          <w:sz w:val="24"/>
+          <w:szCs w:val="24"/>
+        </w:rPr>
+      </w:pPr>
+      <w:r>
+        <w:rPr>
+          <w:rFonts w:cstheme="minorHAnsi"/>
+          <w:sz w:val="24"/>
+          <w:szCs w:val="24"/>
+        </w:rPr>
+        <w:t>Agrego un capacitor de 100nF entre VCC y GND</w:t>
+      </w:r>
+    </w:p>
+    <w:p>
+      <w:pPr>
+        <w:rPr>
+          <w:rFonts w:cstheme="minorHAnsi"/>
+          <w:sz w:val="24"/>
+          <w:szCs w:val="24"/>
           <w:lang w:val="es-ES"/>
         </w:rPr>
       </w:pPr>
@@ -1226,13 +1516,41 @@
           <w:szCs w:val="24"/>
         </w:rPr>
       </w:pPr>
-      <w:r>
-        <w:rPr>
-          <w:rFonts w:cstheme="minorHAnsi"/>
-          <w:sz w:val="24"/>
-          <w:szCs w:val="24"/>
-        </w:rPr>
-        <w:t xml:space="preserve">Rele usado para lógica Rasp: </w:t>
+      <w:proofErr w:type="spellStart"/>
+      <w:r>
+        <w:rPr>
+          <w:rFonts w:cstheme="minorHAnsi"/>
+          <w:sz w:val="24"/>
+          <w:szCs w:val="24"/>
+        </w:rPr>
+        <w:t>Rele</w:t>
+      </w:r>
+      <w:proofErr w:type="spellEnd"/>
+      <w:r>
+        <w:rPr>
+          <w:rFonts w:cstheme="minorHAnsi"/>
+          <w:sz w:val="24"/>
+          <w:szCs w:val="24"/>
+        </w:rPr>
+        <w:t xml:space="preserve"> usado para lógica </w:t>
+      </w:r>
+      <w:proofErr w:type="spellStart"/>
+      <w:r>
+        <w:rPr>
+          <w:rFonts w:cstheme="minorHAnsi"/>
+          <w:sz w:val="24"/>
+          <w:szCs w:val="24"/>
+        </w:rPr>
+        <w:t>Rasp</w:t>
+      </w:r>
+      <w:proofErr w:type="spellEnd"/>
+      <w:r>
+        <w:rPr>
+          <w:rFonts w:cstheme="minorHAnsi"/>
+          <w:sz w:val="24"/>
+          <w:szCs w:val="24"/>
+        </w:rPr>
+        <w:t xml:space="preserve">: </w:t>
       </w:r>
       <w:r>
         <w:rPr>
@@ -1294,8 +1612,18 @@
           <w:sz w:val="24"/>
           <w:szCs w:val="24"/>
         </w:rPr>
-        <w:t>Transistor usado en lógica Rasp</w:t>
-      </w:r>
+        <w:t xml:space="preserve">Transistor usado en lógica </w:t>
+      </w:r>
+      <w:proofErr w:type="spellStart"/>
+      <w:r>
+        <w:rPr>
+          <w:rFonts w:cstheme="minorHAnsi"/>
+          <w:sz w:val="24"/>
+          <w:szCs w:val="24"/>
+        </w:rPr>
+        <w:t>Rasp</w:t>
+      </w:r>
+      <w:proofErr w:type="spellEnd"/>
       <w:r>
         <w:rPr>
           <w:rFonts w:cstheme="minorHAnsi"/>
@@ -1425,7 +1753,43 @@
           <w:sz w:val="24"/>
           <w:szCs w:val="24"/>
         </w:rPr>
-        <w:t xml:space="preserve">Video de Guia Esquematica: </w:t>
+        <w:t xml:space="preserve">Video de </w:t>
+      </w:r>
+      <w:proofErr w:type="spellStart"/>
+      <w:r>
+        <w:rPr>
+          <w:rFonts w:cstheme="minorHAnsi"/>
+          <w:sz w:val="24"/>
+          <w:szCs w:val="24"/>
+        </w:rPr>
+        <w:t>Guia</w:t>
+      </w:r>
+      <w:proofErr w:type="spellEnd"/>
+      <w:r>
+        <w:rPr>
+          <w:rFonts w:cstheme="minorHAnsi"/>
+          <w:sz w:val="24"/>
+          <w:szCs w:val="24"/>
+        </w:rPr>
+        <w:t xml:space="preserve"> </w:t>
+      </w:r>
+      <w:proofErr w:type="spellStart"/>
+      <w:r>
+        <w:rPr>
+          <w:rFonts w:cstheme="minorHAnsi"/>
+          <w:sz w:val="24"/>
+          <w:szCs w:val="24"/>
+        </w:rPr>
+        <w:t>Esquematica</w:t>
+      </w:r>
+      <w:proofErr w:type="spellEnd"/>
+      <w:r>
+        <w:rPr>
+          <w:rFonts w:cstheme="minorHAnsi"/>
+          <w:sz w:val="24"/>
+          <w:szCs w:val="24"/>
+        </w:rPr>
+        <w:t xml:space="preserve">: </w:t>
       </w:r>
       <w:hyperlink r:id="rId8" w:history="1">
         <w:r>
@@ -1490,7 +1854,15 @@
         <w:t>la resistencia</w:t>
       </w:r>
       <w:r>
-        <w:t xml:space="preserve"> pull-up para I2C, además de las conexiones de USB-C como lo hace en el video, igualmente es una buena guía.</w:t>
+        <w:t xml:space="preserve"> </w:t>
+      </w:r>
+      <w:proofErr w:type="spellStart"/>
+      <w:r>
+        <w:t>pull</w:t>
+      </w:r>
+      <w:proofErr w:type="spellEnd"/>
+      <w:r>
+        <w:t>-up para I2C, además de las conexiones de USB-C como lo hace en el video, igualmente es una buena guía.</w:t>
       </w:r>
     </w:p>
     <w:p>
@@ -1600,14 +1972,62 @@
           <w:b/>
           <w:bCs/>
         </w:rPr>
-        <w:t xml:space="preserve">Para el reincio del Chip: </w:t>
-      </w:r>
-      <w:r>
-        <w:rPr>
-          <w:b/>
-          <w:bCs/>
-        </w:rPr>
-        <w:t>El ajuste recomendado para el circuito de retardo RC suele ser R = 10 kΩ y C = 1 μF. Sin embargo, se deben ajustar parámetros específicos según las características de la fuente de alimentación y la sincronización de encendido y reinicio del chip.</w:t>
+        <w:t xml:space="preserve">Para el </w:t>
+      </w:r>
+      <w:proofErr w:type="spellStart"/>
+      <w:r>
+        <w:rPr>
+          <w:b/>
+          <w:bCs/>
+        </w:rPr>
+        <w:t>reincio</w:t>
+      </w:r>
+      <w:proofErr w:type="spellEnd"/>
+      <w:r>
+        <w:rPr>
+          <w:b/>
+          <w:bCs/>
+        </w:rPr>
+        <w:t xml:space="preserve"> del Chip: </w:t>
+      </w:r>
+      <w:r>
+        <w:rPr>
+          <w:b/>
+          <w:bCs/>
+        </w:rPr>
+        <w:t xml:space="preserve">El ajuste recomendado para el circuito de retardo RC suele ser R = 10 </w:t>
+      </w:r>
+      <w:proofErr w:type="spellStart"/>
+      <w:r>
+        <w:rPr>
+          <w:b/>
+          <w:bCs/>
+        </w:rPr>
+        <w:t>kΩ</w:t>
+      </w:r>
+      <w:proofErr w:type="spellEnd"/>
+      <w:r>
+        <w:rPr>
+          <w:b/>
+          <w:bCs/>
+        </w:rPr>
+        <w:t xml:space="preserve"> y C = 1 </w:t>
+      </w:r>
+      <w:proofErr w:type="spellStart"/>
+      <w:r>
+        <w:rPr>
+          <w:b/>
+          <w:bCs/>
+        </w:rPr>
+        <w:t>μF</w:t>
+      </w:r>
+      <w:proofErr w:type="spellEnd"/>
+      <w:r>
+        <w:rPr>
+          <w:b/>
+          <w:bCs/>
+        </w:rPr>
+        <w:t>. Sin embargo, se deben ajustar parámetros específicos según las características de la fuente de alimentación y la sincronización de encendido y reinicio del chip.</w:t>
       </w:r>
     </w:p>
     <w:p>
@@ -1632,8 +2052,33 @@
           <w:b/>
           <w:bCs/>
         </w:rPr>
-        <w:t xml:space="preserve"> Para guia de conexiones y esquematico</w:t>
-      </w:r>
+        <w:t xml:space="preserve"> Para </w:t>
+      </w:r>
+      <w:proofErr w:type="spellStart"/>
+      <w:r>
+        <w:rPr>
+          <w:b/>
+          <w:bCs/>
+        </w:rPr>
+        <w:t>guia</w:t>
+      </w:r>
+      <w:proofErr w:type="spellEnd"/>
+      <w:r>
+        <w:rPr>
+          <w:b/>
+          <w:bCs/>
+        </w:rPr>
+        <w:t xml:space="preserve"> de conexiones y </w:t>
+      </w:r>
+      <w:proofErr w:type="spellStart"/>
+      <w:r>
+        <w:rPr>
+          <w:b/>
+          <w:bCs/>
+        </w:rPr>
+        <w:t>esquematico</w:t>
+      </w:r>
+      <w:proofErr w:type="spellEnd"/>
     </w:p>
     <w:p>
       <w:pPr>
@@ -1648,7 +2093,7 @@
         </w:rPr>
         <w:lastRenderedPageBreak/>
         <w:drawing>
-          <wp:inline distT="0" distB="0" distL="0" distR="0" wp14:anchorId="0231EAB4" wp14:editId="2B0F3D40">
+          <wp:inline distT="0" distB="0" distL="0" distR="0" wp14:anchorId="0231EAB4" wp14:editId="4EFD0E9F">
             <wp:extent cx="5400040" cy="3576955"/>
             <wp:effectExtent l="0" t="0" r="0" b="4445"/>
             <wp:docPr id="1567547339" name="Imagen 1"/>
@@ -1709,8 +2154,17 @@
           <w:b/>
           <w:bCs/>
         </w:rPr>
-        <w:t>Placa usada por NodeMCU</w:t>
-      </w:r>
+        <w:t xml:space="preserve">Placa usada por </w:t>
+      </w:r>
+      <w:proofErr w:type="spellStart"/>
+      <w:r>
+        <w:rPr>
+          <w:b/>
+          <w:bCs/>
+        </w:rPr>
+        <w:t>NodeMCU</w:t>
+      </w:r>
+      <w:proofErr w:type="spellEnd"/>
     </w:p>
     <w:p>
       <w:pPr>
@@ -2119,7 +2573,43 @@
           <w:sz w:val="24"/>
           <w:szCs w:val="24"/>
         </w:rPr>
-        <w:t xml:space="preserve">Resistencia 180 Ohms LEDs -&gt; </w:t>
+        <w:t xml:space="preserve">Resistencia 180 </w:t>
+      </w:r>
+      <w:proofErr w:type="spellStart"/>
+      <w:r>
+        <w:rPr>
+          <w:rFonts w:cstheme="minorHAnsi"/>
+          <w:sz w:val="24"/>
+          <w:szCs w:val="24"/>
+        </w:rPr>
+        <w:t>Ohms</w:t>
+      </w:r>
+      <w:proofErr w:type="spellEnd"/>
+      <w:r>
+        <w:rPr>
+          <w:rFonts w:cstheme="minorHAnsi"/>
+          <w:sz w:val="24"/>
+          <w:szCs w:val="24"/>
+        </w:rPr>
+        <w:t xml:space="preserve"> </w:t>
+      </w:r>
+      <w:proofErr w:type="spellStart"/>
+      <w:r>
+        <w:rPr>
+          <w:rFonts w:cstheme="minorHAnsi"/>
+          <w:sz w:val="24"/>
+          <w:szCs w:val="24"/>
+        </w:rPr>
+        <w:t>LEDs</w:t>
+      </w:r>
+      <w:proofErr w:type="spellEnd"/>
+      <w:r>
+        <w:rPr>
+          <w:rFonts w:cstheme="minorHAnsi"/>
+          <w:sz w:val="24"/>
+          <w:szCs w:val="24"/>
+        </w:rPr>
+        <w:t xml:space="preserve"> -&gt; </w:t>
       </w:r>
       <w:r>
         <w:rPr>
@@ -2259,7 +2749,43 @@
           <w:szCs w:val="24"/>
         </w:rPr>
         <w:lastRenderedPageBreak/>
-        <w:t xml:space="preserve">Capacitor Ceramico 100 nF: </w:t>
+        <w:t xml:space="preserve">Capacitor </w:t>
+      </w:r>
+      <w:proofErr w:type="spellStart"/>
+      <w:r>
+        <w:rPr>
+          <w:rFonts w:cstheme="minorHAnsi"/>
+          <w:sz w:val="24"/>
+          <w:szCs w:val="24"/>
+        </w:rPr>
+        <w:t>Ceramico</w:t>
+      </w:r>
+      <w:proofErr w:type="spellEnd"/>
+      <w:r>
+        <w:rPr>
+          <w:rFonts w:cstheme="minorHAnsi"/>
+          <w:sz w:val="24"/>
+          <w:szCs w:val="24"/>
+        </w:rPr>
+        <w:t xml:space="preserve"> 100 </w:t>
+      </w:r>
+      <w:proofErr w:type="spellStart"/>
+      <w:r>
+        <w:rPr>
+          <w:rFonts w:cstheme="minorHAnsi"/>
+          <w:sz w:val="24"/>
+          <w:szCs w:val="24"/>
+        </w:rPr>
+        <w:t>nF</w:t>
+      </w:r>
+      <w:proofErr w:type="spellEnd"/>
+      <w:r>
+        <w:rPr>
+          <w:rFonts w:cstheme="minorHAnsi"/>
+          <w:sz w:val="24"/>
+          <w:szCs w:val="24"/>
+        </w:rPr>
+        <w:t xml:space="preserve">: </w:t>
       </w:r>
       <w:r>
         <w:rPr>
@@ -2284,7 +2810,43 @@
           <w:sz w:val="24"/>
           <w:szCs w:val="24"/>
         </w:rPr>
-        <w:t xml:space="preserve">Capacitor Tantalium 22 uF: </w:t>
+        <w:t xml:space="preserve">Capacitor </w:t>
+      </w:r>
+      <w:proofErr w:type="spellStart"/>
+      <w:r>
+        <w:rPr>
+          <w:rFonts w:cstheme="minorHAnsi"/>
+          <w:sz w:val="24"/>
+          <w:szCs w:val="24"/>
+        </w:rPr>
+        <w:t>Tantalium</w:t>
+      </w:r>
+      <w:proofErr w:type="spellEnd"/>
+      <w:r>
+        <w:rPr>
+          <w:rFonts w:cstheme="minorHAnsi"/>
+          <w:sz w:val="24"/>
+          <w:szCs w:val="24"/>
+        </w:rPr>
+        <w:t xml:space="preserve"> 22 </w:t>
+      </w:r>
+      <w:proofErr w:type="spellStart"/>
+      <w:r>
+        <w:rPr>
+          <w:rFonts w:cstheme="minorHAnsi"/>
+          <w:sz w:val="24"/>
+          <w:szCs w:val="24"/>
+        </w:rPr>
+        <w:t>uF</w:t>
+      </w:r>
+      <w:proofErr w:type="spellEnd"/>
+      <w:r>
+        <w:rPr>
+          <w:rFonts w:cstheme="minorHAnsi"/>
+          <w:sz w:val="24"/>
+          <w:szCs w:val="24"/>
+        </w:rPr>
+        <w:t xml:space="preserve">: </w:t>
       </w:r>
       <w:r>
         <w:rPr>
@@ -2461,14 +3023,25 @@
           <w:lang w:val="es-ES"/>
         </w:rPr>
       </w:pPr>
-      <w:r>
-        <w:rPr>
-          <w:rFonts w:cstheme="minorHAnsi"/>
-          <w:sz w:val="24"/>
-          <w:szCs w:val="24"/>
-          <w:lang w:val="es-ES"/>
-        </w:rPr>
-        <w:t xml:space="preserve">Header de 3 Pines: </w:t>
+      <w:proofErr w:type="spellStart"/>
+      <w:r>
+        <w:rPr>
+          <w:rFonts w:cstheme="minorHAnsi"/>
+          <w:sz w:val="24"/>
+          <w:szCs w:val="24"/>
+          <w:lang w:val="es-ES"/>
+        </w:rPr>
+        <w:t>Header</w:t>
+      </w:r>
+      <w:proofErr w:type="spellEnd"/>
+      <w:r>
+        <w:rPr>
+          <w:rFonts w:cstheme="minorHAnsi"/>
+          <w:sz w:val="24"/>
+          <w:szCs w:val="24"/>
+          <w:lang w:val="es-ES"/>
+        </w:rPr>
+        <w:t xml:space="preserve"> de 3 Pines: </w:t>
       </w:r>
       <w:r>
         <w:rPr>
@@ -2586,14 +3159,183 @@
           <w:lang w:val="es-ES"/>
         </w:rPr>
       </w:pPr>
-    </w:p>
-    <w:p>
-      <w:pPr>
-        <w:rPr>
-          <w:b/>
-          <w:bCs/>
-        </w:rPr>
-      </w:pPr>
+      <w:r>
+        <w:rPr>
+          <w:rFonts w:ascii="Aptos" w:hAnsi="Aptos"/>
+          <w:sz w:val="32"/>
+          <w:szCs w:val="32"/>
+          <w:u w:val="single"/>
+          <w:lang w:val="es-ES"/>
+        </w:rPr>
+        <w:t>OPCION PARA CAMBIAR RELE</w:t>
+      </w:r>
+      <w:r>
+        <w:rPr>
+          <w:rFonts w:ascii="Aptos" w:hAnsi="Aptos"/>
+          <w:sz w:val="32"/>
+          <w:szCs w:val="32"/>
+          <w:u w:val="single"/>
+          <w:lang w:val="es-ES"/>
+        </w:rPr>
+        <w:t xml:space="preserve"> DEL CONTROL DE BATERIA</w:t>
+      </w:r>
+      <w:r>
+        <w:rPr>
+          <w:rFonts w:ascii="Aptos" w:hAnsi="Aptos"/>
+          <w:sz w:val="32"/>
+          <w:szCs w:val="32"/>
+          <w:u w:val="single"/>
+          <w:lang w:val="es-ES"/>
+        </w:rPr>
+        <w:t>:</w:t>
+      </w:r>
+    </w:p>
+    <w:p>
+      <w:pPr>
+        <w:rPr>
+          <w:rFonts w:cstheme="minorHAnsi"/>
+          <w:sz w:val="24"/>
+          <w:szCs w:val="24"/>
+          <w:u w:val="single"/>
+          <w:lang w:val="es-ES"/>
+        </w:rPr>
+      </w:pPr>
+      <w:r>
+        <w:rPr>
+          <w:rFonts w:cstheme="minorHAnsi"/>
+          <w:noProof/>
+          <w:sz w:val="24"/>
+          <w:szCs w:val="24"/>
+          <w:u w:val="single"/>
+          <w:lang w:val="es-ES"/>
+        </w:rPr>
+        <w:drawing>
+          <wp:inline distT="0" distB="0" distL="0" distR="0" wp14:anchorId="43EB49E1" wp14:editId="525F45C8">
+            <wp:extent cx="5400040" cy="3183255"/>
+            <wp:effectExtent l="0" t="0" r="0" b="0"/>
+            <wp:docPr id="768289810" name="Imagen 1"/>
+            <wp:cNvGraphicFramePr>
+              <a:graphicFrameLocks xmlns:a="http://schemas.openxmlformats.org/drawingml/2006/main" noChangeAspect="1"/>
+            </wp:cNvGraphicFramePr>
+            <a:graphic xmlns:a="http://schemas.openxmlformats.org/drawingml/2006/main">
+              <a:graphicData uri="http://schemas.openxmlformats.org/drawingml/2006/picture">
+                <pic:pic xmlns:pic="http://schemas.openxmlformats.org/drawingml/2006/picture">
+                  <pic:nvPicPr>
+                    <pic:cNvPr id="768289810" name=""/>
+                    <pic:cNvPicPr/>
+                  </pic:nvPicPr>
+                  <pic:blipFill>
+                    <a:blip r:embed="rId22"/>
+                    <a:stretch>
+                      <a:fillRect/>
+                    </a:stretch>
+                  </pic:blipFill>
+                  <pic:spPr>
+                    <a:xfrm>
+                      <a:off x="0" y="0"/>
+                      <a:ext cx="5400040" cy="3183255"/>
+                    </a:xfrm>
+                    <a:prstGeom prst="rect">
+                      <a:avLst/>
+                    </a:prstGeom>
+                  </pic:spPr>
+                </pic:pic>
+              </a:graphicData>
+            </a:graphic>
+          </wp:inline>
+        </w:drawing>
+      </w:r>
+    </w:p>
+    <w:p>
+      <w:pPr>
+        <w:rPr>
+          <w:rFonts w:cstheme="minorHAnsi"/>
+          <w:sz w:val="24"/>
+          <w:szCs w:val="24"/>
+          <w:u w:val="single"/>
+          <w:lang w:val="es-ES"/>
+        </w:rPr>
+      </w:pPr>
+    </w:p>
+    <w:p>
+      <w:pPr>
+        <w:rPr>
+          <w:rFonts w:cstheme="minorHAnsi"/>
+          <w:sz w:val="24"/>
+          <w:szCs w:val="24"/>
+          <w:u w:val="single"/>
+          <w:lang w:val="es-ES"/>
+        </w:rPr>
+      </w:pPr>
+    </w:p>
+    <w:p>
+      <w:pPr>
+        <w:rPr>
+          <w:rFonts w:cstheme="minorHAnsi"/>
+          <w:sz w:val="24"/>
+          <w:szCs w:val="24"/>
+          <w:u w:val="single"/>
+          <w:lang w:val="es-ES"/>
+        </w:rPr>
+      </w:pPr>
+      <w:r>
+        <w:rPr>
+          <w:rFonts w:cstheme="minorHAnsi"/>
+          <w:sz w:val="24"/>
+          <w:szCs w:val="24"/>
+          <w:u w:val="single"/>
+          <w:lang w:val="es-ES"/>
+        </w:rPr>
+        <w:t>XP233P1501TR-G</w:t>
+      </w:r>
+      <w:r>
+        <w:rPr>
+          <w:rFonts w:cstheme="minorHAnsi"/>
+          <w:sz w:val="24"/>
+          <w:szCs w:val="24"/>
+          <w:u w:val="single"/>
+          <w:lang w:val="es-ES"/>
+        </w:rPr>
+        <w:t xml:space="preserve"> (PARA EL MOSFET-P)</w:t>
+      </w:r>
+    </w:p>
+    <w:p>
+      <w:pPr>
+        <w:rPr>
+          <w:rFonts w:cstheme="minorHAnsi"/>
+          <w:sz w:val="24"/>
+          <w:szCs w:val="24"/>
+          <w:u w:val="single"/>
+          <w:lang w:val="es-ES"/>
+        </w:rPr>
+      </w:pPr>
+    </w:p>
+    <w:p>
+      <w:pPr>
+        <w:rPr>
+          <w:rFonts w:cstheme="minorHAnsi"/>
+          <w:sz w:val="24"/>
+          <w:szCs w:val="24"/>
+          <w:u w:val="single"/>
+          <w:lang w:val="es-ES"/>
+        </w:rPr>
+      </w:pPr>
+    </w:p>
+    <w:p>
+      <w:pPr>
+        <w:rPr>
+          <w:b/>
+          <w:bCs/>
+        </w:rPr>
+      </w:pPr>
+      <w:r>
+        <w:rPr>
+          <w:b/>
+          <w:bCs/>
+        </w:rPr>
+        <w:lastRenderedPageBreak/>
+        <w:t>&lt;</w:t>
+      </w:r>
     </w:p>
     <w:p/>
     <w:p>
@@ -3061,6 +3803,7 @@
   <w:style w:type="character" w:default="1" w:styleId="Fuentedeprrafopredeter">
     <w:name w:val="Default Paragraph Font"/>
     <w:uiPriority w:val="1"/>
+    <w:semiHidden/>
     <w:unhideWhenUsed/>
   </w:style>
   <w:style w:type="table" w:default="1" w:styleId="Tablanormal">

</xml_diff>

<commit_message>
Se guarda la PCB Salus IV ya terminada, queda revision final antes de envio
</commit_message>
<xml_diff>
--- a/Salus IV/Lista Componentes.docx
+++ b/Salus IV/Lista Componentes.docx
@@ -171,9 +171,8 @@
           <w:u w:val="single"/>
           <w:lang w:val="es-ES"/>
         </w:rPr>
-        <w:t xml:space="preserve">Componentes </w:t>
-      </w:r>
-      <w:proofErr w:type="spellStart"/>
+        <w:t>Componentes Logica Rasp</w:t>
+      </w:r>
       <w:r>
         <w:rPr>
           <w:rFonts w:ascii="Aptos" w:hAnsi="Aptos"/>
@@ -182,10 +181,255 @@
           <w:u w:val="single"/>
           <w:lang w:val="es-ES"/>
         </w:rPr>
-        <w:t>Logica</w:t>
-      </w:r>
-      <w:proofErr w:type="spellEnd"/>
-      <w:r>
+        <w:t xml:space="preserve">: </w:t>
+      </w:r>
+    </w:p>
+    <w:p>
+      <w:pPr>
+        <w:rPr>
+          <w:rFonts w:cstheme="minorHAnsi"/>
+          <w:b/>
+          <w:bCs/>
+          <w:sz w:val="24"/>
+          <w:szCs w:val="24"/>
+        </w:rPr>
+      </w:pPr>
+      <w:r>
+        <w:rPr>
+          <w:rFonts w:cstheme="minorHAnsi"/>
+          <w:sz w:val="24"/>
+          <w:szCs w:val="24"/>
+          <w:lang w:val="es-ES"/>
+        </w:rPr>
+        <w:t>Conectores para Rasp:</w:t>
+      </w:r>
+      <w:r>
+        <w:rPr>
+          <w:rFonts w:cstheme="minorHAnsi"/>
+          <w:sz w:val="24"/>
+          <w:szCs w:val="24"/>
+          <w:lang w:val="es-ES"/>
+        </w:rPr>
+        <w:t xml:space="preserve"> </w:t>
+      </w:r>
+      <w:r>
+        <w:rPr>
+          <w:rFonts w:cstheme="minorHAnsi" w:hint="eastAsia"/>
+          <w:b/>
+          <w:bCs/>
+          <w:sz w:val="24"/>
+          <w:szCs w:val="24"/>
+        </w:rPr>
+        <w:t>2.54-2*20P Straight IDC Header, No Ejector</w:t>
+      </w:r>
+      <w:r>
+        <w:rPr>
+          <w:rFonts w:cstheme="minorHAnsi"/>
+          <w:b/>
+          <w:bCs/>
+          <w:sz w:val="24"/>
+          <w:szCs w:val="24"/>
+        </w:rPr>
+        <w:t>.</w:t>
+      </w:r>
+    </w:p>
+    <w:p>
+      <w:pPr>
+        <w:rPr>
+          <w:rFonts w:cstheme="minorHAnsi"/>
+          <w:b/>
+          <w:bCs/>
+          <w:sz w:val="24"/>
+          <w:szCs w:val="24"/>
+        </w:rPr>
+      </w:pPr>
+      <w:r>
+        <w:rPr>
+          <w:rFonts w:cstheme="minorHAnsi"/>
+          <w:sz w:val="24"/>
+          <w:szCs w:val="24"/>
+        </w:rPr>
+        <w:t>Transistores para la Lógica:</w:t>
+      </w:r>
+      <w:r>
+        <w:rPr>
+          <w:rFonts w:cstheme="minorHAnsi"/>
+          <w:sz w:val="24"/>
+          <w:szCs w:val="24"/>
+        </w:rPr>
+        <w:t xml:space="preserve"> </w:t>
+      </w:r>
+      <w:r>
+        <w:rPr>
+          <w:rFonts w:cstheme="minorHAnsi" w:hint="eastAsia"/>
+          <w:b/>
+          <w:bCs/>
+          <w:sz w:val="24"/>
+          <w:szCs w:val="24"/>
+        </w:rPr>
+        <w:t>IRLML6344PBF-HXY</w:t>
+      </w:r>
+      <w:r>
+        <w:rPr>
+          <w:rFonts w:cstheme="minorHAnsi"/>
+          <w:b/>
+          <w:bCs/>
+          <w:sz w:val="24"/>
+          <w:szCs w:val="24"/>
+        </w:rPr>
+        <w:t>.</w:t>
+      </w:r>
+    </w:p>
+    <w:p>
+      <w:pPr>
+        <w:rPr>
+          <w:rFonts w:cstheme="minorHAnsi"/>
+          <w:b/>
+          <w:bCs/>
+          <w:sz w:val="24"/>
+          <w:szCs w:val="24"/>
+        </w:rPr>
+      </w:pPr>
+      <w:r>
+        <w:rPr>
+          <w:rFonts w:cstheme="minorHAnsi"/>
+          <w:sz w:val="24"/>
+          <w:szCs w:val="24"/>
+        </w:rPr>
+        <w:t xml:space="preserve">Conector Output Señales: </w:t>
+      </w:r>
+      <w:r>
+        <w:rPr>
+          <w:rFonts w:cstheme="minorHAnsi" w:hint="eastAsia"/>
+          <w:b/>
+          <w:bCs/>
+          <w:sz w:val="24"/>
+          <w:szCs w:val="24"/>
+        </w:rPr>
+        <w:t>WJ127-5.0-06P-14-00A</w:t>
+      </w:r>
+    </w:p>
+    <w:p>
+      <w:pPr>
+        <w:rPr>
+          <w:rFonts w:cstheme="minorHAnsi"/>
+          <w:b/>
+          <w:bCs/>
+          <w:sz w:val="24"/>
+          <w:szCs w:val="24"/>
+        </w:rPr>
+      </w:pPr>
+      <w:r>
+        <w:rPr>
+          <w:rFonts w:cstheme="minorHAnsi"/>
+          <w:sz w:val="24"/>
+          <w:szCs w:val="24"/>
+        </w:rPr>
+        <w:t xml:space="preserve">Relay: </w:t>
+      </w:r>
+      <w:r>
+        <w:rPr>
+          <w:rFonts w:cstheme="minorHAnsi"/>
+          <w:sz w:val="24"/>
+          <w:szCs w:val="24"/>
+        </w:rPr>
+        <w:t xml:space="preserve">Este lo cambiamos, </w:t>
+      </w:r>
+      <w:bookmarkStart w:id="0" w:name="_Hlk221796421"/>
+      <w:r>
+        <w:rPr>
+          <w:rFonts w:cstheme="minorHAnsi" w:hint="eastAsia"/>
+          <w:b/>
+          <w:bCs/>
+          <w:sz w:val="24"/>
+          <w:szCs w:val="24"/>
+        </w:rPr>
+        <w:t>SRD-05VDC-SL-C</w:t>
+      </w:r>
+      <w:bookmarkEnd w:id="0"/>
+      <w:r>
+        <w:rPr>
+          <w:rFonts w:cstheme="minorHAnsi"/>
+          <w:b/>
+          <w:bCs/>
+          <w:sz w:val="24"/>
+          <w:szCs w:val="24"/>
+        </w:rPr>
+        <w:t>.</w:t>
+      </w:r>
+      <w:r>
+        <w:rPr>
+          <w:rFonts w:cstheme="minorHAnsi"/>
+          <w:b/>
+          <w:bCs/>
+          <w:sz w:val="24"/>
+          <w:szCs w:val="24"/>
+        </w:rPr>
+        <w:br/>
+      </w:r>
+      <w:r>
+        <w:rPr>
+          <w:rFonts w:cstheme="minorHAnsi"/>
+          <w:b/>
+          <w:bCs/>
+          <w:sz w:val="24"/>
+          <w:szCs w:val="24"/>
+        </w:rPr>
+        <w:br/>
+      </w:r>
+      <w:r>
+        <w:rPr>
+          <w:rFonts w:cstheme="minorHAnsi"/>
+          <w:sz w:val="24"/>
+          <w:szCs w:val="24"/>
+        </w:rPr>
+        <w:t>Diodo TVS</w:t>
+      </w:r>
+      <w:r>
+        <w:rPr>
+          <w:rFonts w:cstheme="minorHAnsi"/>
+          <w:b/>
+          <w:bCs/>
+          <w:sz w:val="24"/>
+          <w:szCs w:val="24"/>
+        </w:rPr>
+        <w:t xml:space="preserve">: </w:t>
+      </w:r>
+      <w:bookmarkStart w:id="1" w:name="_Hlk221796440"/>
+      <w:r>
+        <w:rPr>
+          <w:rFonts w:cstheme="minorHAnsi" w:hint="eastAsia"/>
+          <w:b/>
+          <w:bCs/>
+          <w:sz w:val="24"/>
+          <w:szCs w:val="24"/>
+        </w:rPr>
+        <w:t>1N6267A-E3/54</w:t>
+      </w:r>
+      <w:r>
+        <w:rPr>
+          <w:rFonts w:cstheme="minorHAnsi"/>
+          <w:b/>
+          <w:bCs/>
+          <w:sz w:val="24"/>
+          <w:szCs w:val="24"/>
+        </w:rPr>
+        <w:t>.</w:t>
+      </w:r>
+    </w:p>
+    <w:p>
+      <w:pPr>
+        <w:rPr>
+          <w:rFonts w:cstheme="minorHAnsi"/>
+          <w:b/>
+          <w:bCs/>
+          <w:sz w:val="24"/>
+          <w:szCs w:val="24"/>
+        </w:rPr>
+      </w:pPr>
+    </w:p>
+    <w:p>
+      <w:pPr>
         <w:rPr>
           <w:rFonts w:ascii="Aptos" w:hAnsi="Aptos"/>
           <w:sz w:val="32"/>
@@ -193,9 +437,7 @@
           <w:u w:val="single"/>
           <w:lang w:val="es-ES"/>
         </w:rPr>
-        <w:t xml:space="preserve"> </w:t>
-      </w:r>
-      <w:proofErr w:type="spellStart"/>
+      </w:pPr>
       <w:r>
         <w:rPr>
           <w:rFonts w:ascii="Aptos" w:hAnsi="Aptos"/>
@@ -204,10 +446,169 @@
           <w:u w:val="single"/>
           <w:lang w:val="es-ES"/>
         </w:rPr>
-        <w:t>Rasp</w:t>
-      </w:r>
-      <w:proofErr w:type="spellEnd"/>
-      <w:r>
+        <w:t xml:space="preserve">Conectores que van al Exterior: </w:t>
+      </w:r>
+    </w:p>
+    <w:p>
+      <w:pPr>
+        <w:rPr>
+          <w:rFonts w:cstheme="minorHAnsi"/>
+          <w:b/>
+          <w:bCs/>
+          <w:sz w:val="24"/>
+          <w:szCs w:val="24"/>
+        </w:rPr>
+      </w:pPr>
+    </w:p>
+    <w:bookmarkEnd w:id="1"/>
+    <w:p>
+      <w:pPr>
+        <w:rPr>
+          <w:rFonts w:cstheme="minorHAnsi"/>
+          <w:b/>
+          <w:bCs/>
+          <w:sz w:val="24"/>
+          <w:szCs w:val="24"/>
+        </w:rPr>
+      </w:pPr>
+      <w:r>
+        <w:rPr>
+          <w:rFonts w:cstheme="minorHAnsi"/>
+          <w:sz w:val="24"/>
+          <w:szCs w:val="24"/>
+        </w:rPr>
+        <w:t xml:space="preserve">Conector Servos: </w:t>
+      </w:r>
+      <w:r>
+        <w:rPr>
+          <w:rFonts w:cstheme="minorHAnsi" w:hint="eastAsia"/>
+          <w:b/>
+          <w:bCs/>
+          <w:sz w:val="24"/>
+          <w:szCs w:val="24"/>
+        </w:rPr>
+        <w:t>2.54-2*3PPin</w:t>
+      </w:r>
+      <w:r>
+        <w:rPr>
+          <w:rFonts w:cstheme="minorHAnsi"/>
+          <w:b/>
+          <w:bCs/>
+          <w:sz w:val="24"/>
+          <w:szCs w:val="24"/>
+        </w:rPr>
+        <w:t>.</w:t>
+      </w:r>
+    </w:p>
+    <w:p>
+      <w:pPr>
+        <w:rPr>
+          <w:rFonts w:cstheme="minorHAnsi"/>
+          <w:b/>
+          <w:bCs/>
+          <w:sz w:val="24"/>
+          <w:szCs w:val="24"/>
+        </w:rPr>
+      </w:pPr>
+      <w:r>
+        <w:rPr>
+          <w:rFonts w:cstheme="minorHAnsi"/>
+          <w:sz w:val="24"/>
+          <w:szCs w:val="24"/>
+        </w:rPr>
+        <w:t>Cable</w:t>
+      </w:r>
+      <w:r>
+        <w:rPr>
+          <w:rFonts w:cstheme="minorHAnsi"/>
+          <w:sz w:val="24"/>
+          <w:szCs w:val="24"/>
+        </w:rPr>
+        <w:t xml:space="preserve"> Puente H:</w:t>
+      </w:r>
+      <w:r>
+        <w:rPr>
+          <w:rFonts w:cstheme="minorHAnsi"/>
+          <w:b/>
+          <w:bCs/>
+          <w:sz w:val="24"/>
+          <w:szCs w:val="24"/>
+        </w:rPr>
+        <w:t xml:space="preserve"> </w:t>
+      </w:r>
+      <w:r>
+        <w:rPr>
+          <w:rFonts w:cstheme="minorHAnsi"/>
+          <w:b/>
+          <w:bCs/>
+          <w:sz w:val="24"/>
+          <w:szCs w:val="24"/>
+        </w:rPr>
+        <w:t>hanxia HX PH2.0-4P ST 200mm 24AWG</w:t>
+      </w:r>
+      <w:r>
+        <w:rPr>
+          <w:rFonts w:cstheme="minorHAnsi"/>
+          <w:b/>
+          <w:bCs/>
+          <w:sz w:val="24"/>
+          <w:szCs w:val="24"/>
+        </w:rPr>
+        <w:t>.</w:t>
+      </w:r>
+    </w:p>
+    <w:p>
+      <w:pPr>
+        <w:rPr>
+          <w:rFonts w:cstheme="minorHAnsi"/>
+          <w:b/>
+          <w:bCs/>
+          <w:sz w:val="24"/>
+          <w:szCs w:val="24"/>
+        </w:rPr>
+      </w:pPr>
+      <w:r>
+        <w:rPr>
+          <w:rFonts w:cstheme="minorHAnsi"/>
+          <w:sz w:val="24"/>
+          <w:szCs w:val="24"/>
+        </w:rPr>
+        <w:t>Conector Puente H:</w:t>
+      </w:r>
+      <w:r>
+        <w:rPr>
+          <w:rFonts w:cstheme="minorHAnsi"/>
+          <w:b/>
+          <w:bCs/>
+          <w:sz w:val="24"/>
+          <w:szCs w:val="24"/>
+        </w:rPr>
+        <w:t xml:space="preserve"> </w:t>
+      </w:r>
+      <w:r>
+        <w:rPr>
+          <w:rFonts w:cstheme="minorHAnsi"/>
+          <w:b/>
+          <w:bCs/>
+          <w:sz w:val="24"/>
+          <w:szCs w:val="24"/>
+        </w:rPr>
+        <w:t>S4B-PH-K-S</w:t>
+      </w:r>
+    </w:p>
+    <w:p>
+      <w:pPr>
+        <w:rPr>
+          <w:rFonts w:cstheme="minorHAnsi"/>
+          <w:b/>
+          <w:bCs/>
+          <w:sz w:val="24"/>
+          <w:szCs w:val="24"/>
+        </w:rPr>
+      </w:pPr>
+    </w:p>
+    <w:p>
+      <w:pPr>
         <w:rPr>
           <w:rFonts w:ascii="Aptos" w:hAnsi="Aptos"/>
           <w:sz w:val="32"/>
@@ -215,341 +616,8 @@
           <w:u w:val="single"/>
           <w:lang w:val="es-ES"/>
         </w:rPr>
-        <w:t xml:space="preserve">: </w:t>
-      </w:r>
-    </w:p>
-    <w:p>
-      <w:pPr>
-        <w:rPr>
-          <w:rFonts w:cstheme="minorHAnsi"/>
-          <w:b/>
-          <w:bCs/>
-          <w:sz w:val="24"/>
-          <w:szCs w:val="24"/>
-        </w:rPr>
-      </w:pPr>
-      <w:r>
-        <w:rPr>
-          <w:rFonts w:cstheme="minorHAnsi"/>
-          <w:sz w:val="24"/>
-          <w:szCs w:val="24"/>
-          <w:lang w:val="es-ES"/>
-        </w:rPr>
-        <w:t xml:space="preserve">Conectores para </w:t>
-      </w:r>
-      <w:proofErr w:type="spellStart"/>
-      <w:r>
-        <w:rPr>
-          <w:rFonts w:cstheme="minorHAnsi"/>
-          <w:sz w:val="24"/>
-          <w:szCs w:val="24"/>
-          <w:lang w:val="es-ES"/>
-        </w:rPr>
-        <w:t>Rasp</w:t>
-      </w:r>
-      <w:proofErr w:type="spellEnd"/>
-      <w:r>
-        <w:rPr>
-          <w:rFonts w:cstheme="minorHAnsi"/>
-          <w:sz w:val="24"/>
-          <w:szCs w:val="24"/>
-          <w:lang w:val="es-ES"/>
-        </w:rPr>
-        <w:t>:</w:t>
-      </w:r>
-      <w:r>
-        <w:rPr>
-          <w:rFonts w:cstheme="minorHAnsi"/>
-          <w:sz w:val="24"/>
-          <w:szCs w:val="24"/>
-          <w:lang w:val="es-ES"/>
-        </w:rPr>
-        <w:t xml:space="preserve"> </w:t>
-      </w:r>
-      <w:r>
-        <w:rPr>
-          <w:rFonts w:cstheme="minorHAnsi" w:hint="eastAsia"/>
-          <w:b/>
-          <w:bCs/>
-          <w:sz w:val="24"/>
-          <w:szCs w:val="24"/>
-        </w:rPr>
-        <w:t xml:space="preserve">2.54-2*20P </w:t>
-      </w:r>
-      <w:proofErr w:type="spellStart"/>
-      <w:r>
-        <w:rPr>
-          <w:rFonts w:cstheme="minorHAnsi" w:hint="eastAsia"/>
-          <w:b/>
-          <w:bCs/>
-          <w:sz w:val="24"/>
-          <w:szCs w:val="24"/>
-        </w:rPr>
-        <w:t>Straight</w:t>
-      </w:r>
-      <w:proofErr w:type="spellEnd"/>
-      <w:r>
-        <w:rPr>
-          <w:rFonts w:cstheme="minorHAnsi" w:hint="eastAsia"/>
-          <w:b/>
-          <w:bCs/>
-          <w:sz w:val="24"/>
-          <w:szCs w:val="24"/>
-        </w:rPr>
-        <w:t xml:space="preserve"> IDC </w:t>
-      </w:r>
-      <w:proofErr w:type="spellStart"/>
-      <w:r>
-        <w:rPr>
-          <w:rFonts w:cstheme="minorHAnsi" w:hint="eastAsia"/>
-          <w:b/>
-          <w:bCs/>
-          <w:sz w:val="24"/>
-          <w:szCs w:val="24"/>
-        </w:rPr>
-        <w:t>Header</w:t>
-      </w:r>
-      <w:proofErr w:type="spellEnd"/>
-      <w:r>
-        <w:rPr>
-          <w:rFonts w:cstheme="minorHAnsi" w:hint="eastAsia"/>
-          <w:b/>
-          <w:bCs/>
-          <w:sz w:val="24"/>
-          <w:szCs w:val="24"/>
-        </w:rPr>
-        <w:t xml:space="preserve">, No </w:t>
-      </w:r>
-      <w:proofErr w:type="spellStart"/>
-      <w:r>
-        <w:rPr>
-          <w:rFonts w:cstheme="minorHAnsi" w:hint="eastAsia"/>
-          <w:b/>
-          <w:bCs/>
-          <w:sz w:val="24"/>
-          <w:szCs w:val="24"/>
-        </w:rPr>
-        <w:t>Ejector</w:t>
-      </w:r>
-      <w:proofErr w:type="spellEnd"/>
-      <w:r>
-        <w:rPr>
-          <w:rFonts w:cstheme="minorHAnsi"/>
-          <w:b/>
-          <w:bCs/>
-          <w:sz w:val="24"/>
-          <w:szCs w:val="24"/>
-        </w:rPr>
-        <w:t>.</w:t>
-      </w:r>
-    </w:p>
-    <w:p>
-      <w:pPr>
-        <w:rPr>
-          <w:rFonts w:cstheme="minorHAnsi"/>
-          <w:b/>
-          <w:bCs/>
-          <w:sz w:val="24"/>
-          <w:szCs w:val="24"/>
-        </w:rPr>
-      </w:pPr>
-      <w:r>
-        <w:rPr>
-          <w:rFonts w:cstheme="minorHAnsi"/>
-          <w:sz w:val="24"/>
-          <w:szCs w:val="24"/>
-        </w:rPr>
-        <w:t>Transistores para la Lógica:</w:t>
-      </w:r>
-      <w:r>
-        <w:rPr>
-          <w:rFonts w:cstheme="minorHAnsi"/>
-          <w:sz w:val="24"/>
-          <w:szCs w:val="24"/>
-        </w:rPr>
-        <w:t xml:space="preserve"> </w:t>
-      </w:r>
-      <w:r>
-        <w:rPr>
-          <w:rFonts w:cstheme="minorHAnsi" w:hint="eastAsia"/>
-          <w:b/>
-          <w:bCs/>
-          <w:sz w:val="24"/>
-          <w:szCs w:val="24"/>
-        </w:rPr>
-        <w:t>IRLML6344PBF-HXY</w:t>
-      </w:r>
-      <w:r>
-        <w:rPr>
-          <w:rFonts w:cstheme="minorHAnsi"/>
-          <w:b/>
-          <w:bCs/>
-          <w:sz w:val="24"/>
-          <w:szCs w:val="24"/>
-        </w:rPr>
-        <w:t>.</w:t>
-      </w:r>
-    </w:p>
-    <w:p>
-      <w:pPr>
-        <w:rPr>
-          <w:rFonts w:cstheme="minorHAnsi"/>
-          <w:b/>
-          <w:bCs/>
-          <w:sz w:val="24"/>
-          <w:szCs w:val="24"/>
-        </w:rPr>
-      </w:pPr>
-      <w:r>
-        <w:rPr>
-          <w:rFonts w:cstheme="minorHAnsi"/>
-          <w:sz w:val="24"/>
-          <w:szCs w:val="24"/>
-        </w:rPr>
-        <w:t xml:space="preserve">Conector Output Señales: </w:t>
-      </w:r>
-      <w:r>
-        <w:rPr>
-          <w:rFonts w:cstheme="minorHAnsi" w:hint="eastAsia"/>
-          <w:b/>
-          <w:bCs/>
-          <w:sz w:val="24"/>
-          <w:szCs w:val="24"/>
-        </w:rPr>
-        <w:t>WJ127-5.0-06P-14-00A</w:t>
-      </w:r>
-    </w:p>
-    <w:p>
-      <w:pPr>
-        <w:rPr>
-          <w:rFonts w:cstheme="minorHAnsi"/>
-          <w:b/>
-          <w:bCs/>
-          <w:sz w:val="24"/>
-          <w:szCs w:val="24"/>
-        </w:rPr>
-      </w:pPr>
-      <w:proofErr w:type="spellStart"/>
-      <w:r>
-        <w:rPr>
-          <w:rFonts w:cstheme="minorHAnsi"/>
-          <w:sz w:val="24"/>
-          <w:szCs w:val="24"/>
-        </w:rPr>
-        <w:t>Relay</w:t>
-      </w:r>
-      <w:proofErr w:type="spellEnd"/>
-      <w:r>
-        <w:rPr>
-          <w:rFonts w:cstheme="minorHAnsi"/>
-          <w:sz w:val="24"/>
-          <w:szCs w:val="24"/>
-        </w:rPr>
-        <w:t xml:space="preserve">: </w:t>
-      </w:r>
-      <w:r>
-        <w:rPr>
-          <w:rFonts w:cstheme="minorHAnsi"/>
-          <w:sz w:val="24"/>
-          <w:szCs w:val="24"/>
-        </w:rPr>
-        <w:t xml:space="preserve">Este lo cambiamos, </w:t>
-      </w:r>
-      <w:bookmarkStart w:id="0" w:name="_Hlk221796421"/>
-      <w:r>
-        <w:rPr>
-          <w:rFonts w:cstheme="minorHAnsi" w:hint="eastAsia"/>
-          <w:b/>
-          <w:bCs/>
-          <w:sz w:val="24"/>
-          <w:szCs w:val="24"/>
-        </w:rPr>
-        <w:t>SRD-05VDC-SL-C</w:t>
-      </w:r>
-      <w:bookmarkEnd w:id="0"/>
-      <w:r>
-        <w:rPr>
-          <w:rFonts w:cstheme="minorHAnsi"/>
-          <w:b/>
-          <w:bCs/>
-          <w:sz w:val="24"/>
-          <w:szCs w:val="24"/>
-        </w:rPr>
-        <w:t>.</w:t>
-      </w:r>
-      <w:r>
-        <w:rPr>
-          <w:rFonts w:cstheme="minorHAnsi"/>
-          <w:b/>
-          <w:bCs/>
-          <w:sz w:val="24"/>
-          <w:szCs w:val="24"/>
-        </w:rPr>
-        <w:br/>
-      </w:r>
-      <w:r>
-        <w:rPr>
-          <w:rFonts w:cstheme="minorHAnsi"/>
-          <w:b/>
-          <w:bCs/>
-          <w:sz w:val="24"/>
-          <w:szCs w:val="24"/>
-        </w:rPr>
-        <w:br/>
-      </w:r>
-      <w:r>
-        <w:rPr>
-          <w:rFonts w:cstheme="minorHAnsi"/>
-          <w:sz w:val="24"/>
-          <w:szCs w:val="24"/>
-        </w:rPr>
-        <w:t>Diodo TVS</w:t>
-      </w:r>
-      <w:r>
-        <w:rPr>
-          <w:rFonts w:cstheme="minorHAnsi"/>
-          <w:b/>
-          <w:bCs/>
-          <w:sz w:val="24"/>
-          <w:szCs w:val="24"/>
-        </w:rPr>
-        <w:t xml:space="preserve">: </w:t>
-      </w:r>
-      <w:bookmarkStart w:id="1" w:name="_Hlk221796440"/>
-      <w:r>
-        <w:rPr>
-          <w:rFonts w:cstheme="minorHAnsi" w:hint="eastAsia"/>
-          <w:b/>
-          <w:bCs/>
-          <w:sz w:val="24"/>
-          <w:szCs w:val="24"/>
-        </w:rPr>
-        <w:t>1N6267A-E3/54</w:t>
-      </w:r>
-      <w:r>
-        <w:rPr>
-          <w:rFonts w:cstheme="minorHAnsi"/>
-          <w:b/>
-          <w:bCs/>
-          <w:sz w:val="24"/>
-          <w:szCs w:val="24"/>
-        </w:rPr>
-        <w:t>.</w:t>
-      </w:r>
-    </w:p>
-    <w:p>
-      <w:pPr>
-        <w:rPr>
-          <w:rFonts w:cstheme="minorHAnsi"/>
-          <w:b/>
-          <w:bCs/>
-          <w:sz w:val="24"/>
-          <w:szCs w:val="24"/>
-        </w:rPr>
-      </w:pPr>
-    </w:p>
-    <w:p>
-      <w:pPr>
+      </w:pPr>
+      <w:r>
         <w:rPr>
           <w:rFonts w:ascii="Aptos" w:hAnsi="Aptos"/>
           <w:sz w:val="32"/>
@@ -557,7 +625,26 @@
           <w:u w:val="single"/>
           <w:lang w:val="es-ES"/>
         </w:rPr>
-      </w:pPr>
+        <w:t>Expansor de Gpios:</w:t>
+      </w:r>
+    </w:p>
+    <w:p>
+      <w:pPr>
+        <w:rPr>
+          <w:rFonts w:cstheme="minorHAnsi"/>
+          <w:sz w:val="24"/>
+          <w:szCs w:val="24"/>
+        </w:rPr>
+      </w:pPr>
+      <w:r>
+        <w:rPr>
+          <w:rFonts w:cstheme="minorHAnsi"/>
+          <w:sz w:val="24"/>
+          <w:szCs w:val="24"/>
+          <w:lang w:val="es-ES"/>
+        </w:rPr>
+        <w:t xml:space="preserve">Estoy entre dos expansores, </w:t>
+      </w:r>
       <w:r>
         <w:rPr>
           <w:rFonts w:ascii="Aptos" w:hAnsi="Aptos"/>
@@ -566,38 +653,39 @@
           <w:u w:val="single"/>
           <w:lang w:val="es-ES"/>
         </w:rPr>
-        <w:t xml:space="preserve">Conectores que van al Exterior: </w:t>
-      </w:r>
-    </w:p>
-    <w:p>
-      <w:pPr>
-        <w:rPr>
-          <w:rFonts w:cstheme="minorHAnsi"/>
-          <w:b/>
-          <w:bCs/>
-          <w:sz w:val="24"/>
-          <w:szCs w:val="24"/>
-        </w:rPr>
-      </w:pPr>
-    </w:p>
-    <w:bookmarkEnd w:id="1"/>
-    <w:p>
-      <w:pPr>
-        <w:rPr>
-          <w:rFonts w:cstheme="minorHAnsi"/>
-          <w:b/>
-          <w:bCs/>
-          <w:sz w:val="24"/>
-          <w:szCs w:val="24"/>
-        </w:rPr>
-      </w:pPr>
-      <w:r>
-        <w:rPr>
-          <w:rFonts w:cstheme="minorHAnsi"/>
-          <w:sz w:val="24"/>
-          <w:szCs w:val="24"/>
-        </w:rPr>
-        <w:t xml:space="preserve">Conector Servos: </w:t>
+        <w:t xml:space="preserve"> </w:t>
+      </w:r>
+      <w:r>
+        <w:rPr>
+          <w:rFonts w:cstheme="minorHAnsi"/>
+          <w:b/>
+          <w:bCs/>
+          <w:sz w:val="24"/>
+          <w:szCs w:val="24"/>
+          <w:lang w:val="es-ES"/>
+        </w:rPr>
+        <w:t>MCP23008T-E/SS</w:t>
+      </w:r>
+      <w:r>
+        <w:rPr>
+          <w:rFonts w:cstheme="minorHAnsi"/>
+          <w:b/>
+          <w:bCs/>
+          <w:sz w:val="24"/>
+          <w:szCs w:val="24"/>
+          <w:lang w:val="es-ES"/>
+        </w:rPr>
+        <w:t xml:space="preserve"> y</w:t>
+      </w:r>
+      <w:r>
+        <w:rPr>
+          <w:rFonts w:cstheme="minorHAnsi"/>
+          <w:b/>
+          <w:bCs/>
+          <w:sz w:val="24"/>
+          <w:szCs w:val="24"/>
+        </w:rPr>
+        <w:t xml:space="preserve"> </w:t>
       </w:r>
       <w:r>
         <w:rPr>
@@ -607,248 +695,6 @@
           <w:sz w:val="24"/>
           <w:szCs w:val="24"/>
         </w:rPr>
-        <w:t>2.54-2*3PPin</w:t>
-      </w:r>
-      <w:r>
-        <w:rPr>
-          <w:rFonts w:cstheme="minorHAnsi"/>
-          <w:b/>
-          <w:bCs/>
-          <w:sz w:val="24"/>
-          <w:szCs w:val="24"/>
-        </w:rPr>
-        <w:t>.</w:t>
-      </w:r>
-    </w:p>
-    <w:p>
-      <w:pPr>
-        <w:rPr>
-          <w:rFonts w:cstheme="minorHAnsi"/>
-          <w:b/>
-          <w:bCs/>
-          <w:sz w:val="24"/>
-          <w:szCs w:val="24"/>
-        </w:rPr>
-      </w:pPr>
-      <w:r>
-        <w:rPr>
-          <w:rFonts w:cstheme="minorHAnsi"/>
-          <w:sz w:val="24"/>
-          <w:szCs w:val="24"/>
-        </w:rPr>
-        <w:t>Cable</w:t>
-      </w:r>
-      <w:r>
-        <w:rPr>
-          <w:rFonts w:cstheme="minorHAnsi"/>
-          <w:sz w:val="24"/>
-          <w:szCs w:val="24"/>
-        </w:rPr>
-        <w:t xml:space="preserve"> Puente H:</w:t>
-      </w:r>
-      <w:r>
-        <w:rPr>
-          <w:rFonts w:cstheme="minorHAnsi"/>
-          <w:b/>
-          <w:bCs/>
-          <w:sz w:val="24"/>
-          <w:szCs w:val="24"/>
-        </w:rPr>
-        <w:t xml:space="preserve"> </w:t>
-      </w:r>
-      <w:proofErr w:type="spellStart"/>
-      <w:r>
-        <w:rPr>
-          <w:rFonts w:cstheme="minorHAnsi"/>
-          <w:b/>
-          <w:bCs/>
-          <w:sz w:val="24"/>
-          <w:szCs w:val="24"/>
-        </w:rPr>
-        <w:t>hanxia</w:t>
-      </w:r>
-      <w:proofErr w:type="spellEnd"/>
-      <w:r>
-        <w:rPr>
-          <w:rFonts w:cstheme="minorHAnsi"/>
-          <w:b/>
-          <w:bCs/>
-          <w:sz w:val="24"/>
-          <w:szCs w:val="24"/>
-        </w:rPr>
-        <w:t xml:space="preserve"> HX PH2.0-4P ST 200mm 24AWG</w:t>
-      </w:r>
-      <w:r>
-        <w:rPr>
-          <w:rFonts w:cstheme="minorHAnsi"/>
-          <w:b/>
-          <w:bCs/>
-          <w:sz w:val="24"/>
-          <w:szCs w:val="24"/>
-        </w:rPr>
-        <w:t>.</w:t>
-      </w:r>
-    </w:p>
-    <w:p>
-      <w:pPr>
-        <w:rPr>
-          <w:rFonts w:cstheme="minorHAnsi"/>
-          <w:b/>
-          <w:bCs/>
-          <w:sz w:val="24"/>
-          <w:szCs w:val="24"/>
-        </w:rPr>
-      </w:pPr>
-      <w:r>
-        <w:rPr>
-          <w:rFonts w:cstheme="minorHAnsi"/>
-          <w:sz w:val="24"/>
-          <w:szCs w:val="24"/>
-        </w:rPr>
-        <w:t>Conector Puente H:</w:t>
-      </w:r>
-      <w:r>
-        <w:rPr>
-          <w:rFonts w:cstheme="minorHAnsi"/>
-          <w:b/>
-          <w:bCs/>
-          <w:sz w:val="24"/>
-          <w:szCs w:val="24"/>
-        </w:rPr>
-        <w:t xml:space="preserve"> </w:t>
-      </w:r>
-      <w:r>
-        <w:rPr>
-          <w:rFonts w:cstheme="minorHAnsi"/>
-          <w:b/>
-          <w:bCs/>
-          <w:sz w:val="24"/>
-          <w:szCs w:val="24"/>
-        </w:rPr>
-        <w:t>S4B-PH-K-S</w:t>
-      </w:r>
-    </w:p>
-    <w:p>
-      <w:pPr>
-        <w:rPr>
-          <w:rFonts w:cstheme="minorHAnsi"/>
-          <w:b/>
-          <w:bCs/>
-          <w:sz w:val="24"/>
-          <w:szCs w:val="24"/>
-        </w:rPr>
-      </w:pPr>
-    </w:p>
-    <w:p>
-      <w:pPr>
-        <w:rPr>
-          <w:rFonts w:ascii="Aptos" w:hAnsi="Aptos"/>
-          <w:sz w:val="32"/>
-          <w:szCs w:val="32"/>
-          <w:u w:val="single"/>
-          <w:lang w:val="es-ES"/>
-        </w:rPr>
-      </w:pPr>
-      <w:r>
-        <w:rPr>
-          <w:rFonts w:ascii="Aptos" w:hAnsi="Aptos"/>
-          <w:sz w:val="32"/>
-          <w:szCs w:val="32"/>
-          <w:u w:val="single"/>
-          <w:lang w:val="es-ES"/>
-        </w:rPr>
-        <w:t xml:space="preserve">Expansor de </w:t>
-      </w:r>
-      <w:proofErr w:type="spellStart"/>
-      <w:r>
-        <w:rPr>
-          <w:rFonts w:ascii="Aptos" w:hAnsi="Aptos"/>
-          <w:sz w:val="32"/>
-          <w:szCs w:val="32"/>
-          <w:u w:val="single"/>
-          <w:lang w:val="es-ES"/>
-        </w:rPr>
-        <w:t>Gpios</w:t>
-      </w:r>
-      <w:proofErr w:type="spellEnd"/>
-      <w:r>
-        <w:rPr>
-          <w:rFonts w:ascii="Aptos" w:hAnsi="Aptos"/>
-          <w:sz w:val="32"/>
-          <w:szCs w:val="32"/>
-          <w:u w:val="single"/>
-          <w:lang w:val="es-ES"/>
-        </w:rPr>
-        <w:t>:</w:t>
-      </w:r>
-    </w:p>
-    <w:p>
-      <w:pPr>
-        <w:rPr>
-          <w:rFonts w:cstheme="minorHAnsi"/>
-          <w:sz w:val="24"/>
-          <w:szCs w:val="24"/>
-        </w:rPr>
-      </w:pPr>
-      <w:r>
-        <w:rPr>
-          <w:rFonts w:cstheme="minorHAnsi"/>
-          <w:sz w:val="24"/>
-          <w:szCs w:val="24"/>
-          <w:lang w:val="es-ES"/>
-        </w:rPr>
-        <w:t xml:space="preserve">Estoy entre dos expansores, </w:t>
-      </w:r>
-      <w:r>
-        <w:rPr>
-          <w:rFonts w:ascii="Aptos" w:hAnsi="Aptos"/>
-          <w:sz w:val="32"/>
-          <w:szCs w:val="32"/>
-          <w:u w:val="single"/>
-          <w:lang w:val="es-ES"/>
-        </w:rPr>
-        <w:t xml:space="preserve"> </w:t>
-      </w:r>
-      <w:r>
-        <w:rPr>
-          <w:rFonts w:cstheme="minorHAnsi"/>
-          <w:b/>
-          <w:bCs/>
-          <w:sz w:val="24"/>
-          <w:szCs w:val="24"/>
-          <w:lang w:val="es-ES"/>
-        </w:rPr>
-        <w:t>MCP23008T-E/SS</w:t>
-      </w:r>
-      <w:r>
-        <w:rPr>
-          <w:rFonts w:cstheme="minorHAnsi"/>
-          <w:b/>
-          <w:bCs/>
-          <w:sz w:val="24"/>
-          <w:szCs w:val="24"/>
-          <w:lang w:val="es-ES"/>
-        </w:rPr>
-        <w:t xml:space="preserve"> y</w:t>
-      </w:r>
-      <w:r>
-        <w:rPr>
-          <w:rFonts w:cstheme="minorHAnsi"/>
-          <w:b/>
-          <w:bCs/>
-          <w:sz w:val="24"/>
-          <w:szCs w:val="24"/>
-        </w:rPr>
-        <w:t xml:space="preserve"> </w:t>
-      </w:r>
-      <w:r>
-        <w:rPr>
-          <w:rFonts w:cstheme="minorHAnsi" w:hint="eastAsia"/>
-          <w:b/>
-          <w:bCs/>
-          <w:sz w:val="24"/>
-          <w:szCs w:val="24"/>
-        </w:rPr>
         <w:t>MCP23017T-E/SS</w:t>
       </w:r>
       <w:r>
@@ -889,25 +735,7 @@
           <w:sz w:val="24"/>
           <w:szCs w:val="24"/>
         </w:rPr>
-        <w:t xml:space="preserve"> </w:t>
-      </w:r>
-      <w:proofErr w:type="spellStart"/>
-      <w:r>
-        <w:rPr>
-          <w:rFonts w:cstheme="minorHAnsi"/>
-          <w:sz w:val="24"/>
-          <w:szCs w:val="24"/>
-        </w:rPr>
-        <w:t>datasheets</w:t>
-      </w:r>
-      <w:proofErr w:type="spellEnd"/>
-      <w:r>
-        <w:rPr>
-          <w:rFonts w:cstheme="minorHAnsi"/>
-          <w:sz w:val="24"/>
-          <w:szCs w:val="24"/>
-        </w:rPr>
-        <w:t xml:space="preserve"> tiene pero si veo que estoy jugado de espacio.</w:t>
+        <w:t xml:space="preserve"> datasheets tiene pero si veo que estoy jugado de espacio.</w:t>
       </w:r>
     </w:p>
     <w:p>
@@ -1052,7 +880,25 @@
             <w:sz w:val="24"/>
             <w:szCs w:val="24"/>
           </w:rPr>
-          <w:t>https://protosupplies.com/wp-content/uploads/2021/05/MCP23017-Module.jpg</w:t>
+          <w:t>https://protosupplies.com/wp-content/upl</w:t>
+        </w:r>
+        <w:r>
+          <w:rPr>
+            <w:rStyle w:val="Hipervnculo"/>
+            <w:rFonts w:cstheme="minorHAnsi"/>
+            <w:sz w:val="24"/>
+            <w:szCs w:val="24"/>
+          </w:rPr>
+          <w:t>o</w:t>
+        </w:r>
+        <w:r>
+          <w:rPr>
+            <w:rStyle w:val="Hipervnculo"/>
+            <w:rFonts w:cstheme="minorHAnsi"/>
+            <w:sz w:val="24"/>
+            <w:szCs w:val="24"/>
+          </w:rPr>
+          <w:t>ads/2021/05/MCP23017-Module.jpg</w:t>
         </w:r>
       </w:hyperlink>
     </w:p>
@@ -1071,6 +917,23 @@
           <w:szCs w:val="24"/>
         </w:rPr>
         <w:t>chrome-extension://efaidnbmnnnibpcajpcglclefindmkaj/https://cdn-learn.adafruit.com/downloads/pdf/adafruit-mcp23017-i2c-gpio-expander.pdf</w:t>
+      </w:r>
+    </w:p>
+    <w:p>
+      <w:pPr>
+        <w:rPr>
+          <w:rFonts w:cstheme="minorHAnsi"/>
+          <w:sz w:val="24"/>
+          <w:szCs w:val="24"/>
+        </w:rPr>
+      </w:pPr>
+      <w:r>
+        <w:rPr>
+          <w:rFonts w:cstheme="minorHAnsi"/>
+          <w:sz w:val="24"/>
+          <w:szCs w:val="24"/>
+        </w:rPr>
+        <w:t>La conexión en la PCB es coherente con lo visto en las dos pagina anteriores.</w:t>
       </w:r>
     </w:p>
     <w:p>
@@ -1154,25 +1017,7 @@
           <w:sz w:val="24"/>
           <w:szCs w:val="24"/>
         </w:rPr>
-        <w:t xml:space="preserve">Le agregamos una resistencia de 390 </w:t>
-      </w:r>
-      <w:proofErr w:type="spellStart"/>
-      <w:r>
-        <w:rPr>
-          <w:rFonts w:cstheme="minorHAnsi"/>
-          <w:sz w:val="24"/>
-          <w:szCs w:val="24"/>
-        </w:rPr>
-        <w:t>Ohms</w:t>
-      </w:r>
-      <w:proofErr w:type="spellEnd"/>
-      <w:r>
-        <w:rPr>
-          <w:rFonts w:cstheme="minorHAnsi"/>
-          <w:sz w:val="24"/>
-          <w:szCs w:val="24"/>
-        </w:rPr>
-        <w:t xml:space="preserve">: </w:t>
+        <w:t xml:space="preserve">Le agregamos una resistencia de 390 Ohms: </w:t>
       </w:r>
       <w:r>
         <w:rPr>
@@ -1361,25 +1206,7 @@
           <w:sz w:val="24"/>
           <w:szCs w:val="24"/>
         </w:rPr>
-        <w:t xml:space="preserve">Cambie las resistencias por dos </w:t>
-      </w:r>
-      <w:proofErr w:type="spellStart"/>
-      <w:r>
-        <w:rPr>
-          <w:rFonts w:cstheme="minorHAnsi"/>
-          <w:sz w:val="24"/>
-          <w:szCs w:val="24"/>
-        </w:rPr>
-        <w:t>arrays</w:t>
-      </w:r>
-      <w:proofErr w:type="spellEnd"/>
-      <w:r>
-        <w:rPr>
-          <w:rFonts w:cstheme="minorHAnsi"/>
-          <w:sz w:val="24"/>
-          <w:szCs w:val="24"/>
-        </w:rPr>
-        <w:t xml:space="preserve"> de ellas: </w:t>
+        <w:t xml:space="preserve">Cambie las resistencias por dos arrays de ellas: </w:t>
       </w:r>
       <w:r>
         <w:rPr>
@@ -1413,6 +1240,75 @@
           <w:szCs w:val="24"/>
         </w:rPr>
         <w:t>Agrego un capacitor de 100nF entre VCC y GND</w:t>
+      </w:r>
+    </w:p>
+    <w:p>
+      <w:pPr>
+        <w:rPr>
+          <w:rFonts w:cstheme="minorHAnsi"/>
+          <w:sz w:val="24"/>
+          <w:szCs w:val="24"/>
+        </w:rPr>
+      </w:pPr>
+      <w:r>
+        <w:rPr>
+          <w:rFonts w:cstheme="minorHAnsi"/>
+          <w:sz w:val="24"/>
+          <w:szCs w:val="24"/>
+        </w:rPr>
+        <w:lastRenderedPageBreak/>
+        <w:drawing>
+          <wp:inline distT="0" distB="0" distL="0" distR="0" wp14:anchorId="23115C19" wp14:editId="41455B12">
+            <wp:extent cx="5400040" cy="4835525"/>
+            <wp:effectExtent l="0" t="0" r="0" b="3175"/>
+            <wp:docPr id="947155164" name="Imagen 1"/>
+            <wp:cNvGraphicFramePr>
+              <a:graphicFrameLocks xmlns:a="http://schemas.openxmlformats.org/drawingml/2006/main" noChangeAspect="1"/>
+            </wp:cNvGraphicFramePr>
+            <a:graphic xmlns:a="http://schemas.openxmlformats.org/drawingml/2006/main">
+              <a:graphicData uri="http://schemas.openxmlformats.org/drawingml/2006/picture">
+                <pic:pic xmlns:pic="http://schemas.openxmlformats.org/drawingml/2006/picture">
+                  <pic:nvPicPr>
+                    <pic:cNvPr id="947155164" name=""/>
+                    <pic:cNvPicPr/>
+                  </pic:nvPicPr>
+                  <pic:blipFill>
+                    <a:blip r:embed="rId7"/>
+                    <a:stretch>
+                      <a:fillRect/>
+                    </a:stretch>
+                  </pic:blipFill>
+                  <pic:spPr>
+                    <a:xfrm>
+                      <a:off x="0" y="0"/>
+                      <a:ext cx="5400040" cy="4835525"/>
+                    </a:xfrm>
+                    <a:prstGeom prst="rect">
+                      <a:avLst/>
+                    </a:prstGeom>
+                  </pic:spPr>
+                </pic:pic>
+              </a:graphicData>
+            </a:graphic>
+          </wp:inline>
+        </w:drawing>
+      </w:r>
+    </w:p>
+    <w:p>
+      <w:pPr>
+        <w:rPr>
+          <w:rFonts w:cstheme="minorHAnsi"/>
+          <w:sz w:val="24"/>
+          <w:szCs w:val="24"/>
+        </w:rPr>
+      </w:pPr>
+      <w:r>
+        <w:rPr>
+          <w:rFonts w:cstheme="minorHAnsi"/>
+          <w:sz w:val="24"/>
+          <w:szCs w:val="24"/>
+        </w:rPr>
+        <w:t>La conexión en la PCB es coherente a lo mostrado en la imagen anterior.</w:t>
       </w:r>
     </w:p>
     <w:p>
@@ -1516,41 +1412,13 @@
           <w:szCs w:val="24"/>
         </w:rPr>
       </w:pPr>
-      <w:proofErr w:type="spellStart"/>
-      <w:r>
-        <w:rPr>
-          <w:rFonts w:cstheme="minorHAnsi"/>
-          <w:sz w:val="24"/>
-          <w:szCs w:val="24"/>
-        </w:rPr>
-        <w:t>Rele</w:t>
-      </w:r>
-      <w:proofErr w:type="spellEnd"/>
-      <w:r>
-        <w:rPr>
-          <w:rFonts w:cstheme="minorHAnsi"/>
-          <w:sz w:val="24"/>
-          <w:szCs w:val="24"/>
-        </w:rPr>
-        <w:t xml:space="preserve"> usado para lógica </w:t>
-      </w:r>
-      <w:proofErr w:type="spellStart"/>
-      <w:r>
-        <w:rPr>
-          <w:rFonts w:cstheme="minorHAnsi"/>
-          <w:sz w:val="24"/>
-          <w:szCs w:val="24"/>
-        </w:rPr>
-        <w:t>Rasp</w:t>
-      </w:r>
-      <w:proofErr w:type="spellEnd"/>
-      <w:r>
-        <w:rPr>
-          <w:rFonts w:cstheme="minorHAnsi"/>
-          <w:sz w:val="24"/>
-          <w:szCs w:val="24"/>
-        </w:rPr>
-        <w:t xml:space="preserve">: </w:t>
+      <w:r>
+        <w:rPr>
+          <w:rFonts w:cstheme="minorHAnsi"/>
+          <w:sz w:val="24"/>
+          <w:szCs w:val="24"/>
+        </w:rPr>
+        <w:t xml:space="preserve">Rele usado para lógica Rasp: </w:t>
       </w:r>
       <w:r>
         <w:rPr>
@@ -1612,18 +1480,8 @@
           <w:sz w:val="24"/>
           <w:szCs w:val="24"/>
         </w:rPr>
-        <w:t xml:space="preserve">Transistor usado en lógica </w:t>
-      </w:r>
-      <w:proofErr w:type="spellStart"/>
-      <w:r>
-        <w:rPr>
-          <w:rFonts w:cstheme="minorHAnsi"/>
-          <w:sz w:val="24"/>
-          <w:szCs w:val="24"/>
-        </w:rPr>
-        <w:t>Rasp</w:t>
-      </w:r>
-      <w:proofErr w:type="spellEnd"/>
+        <w:t>Transistor usado en lógica Rasp</w:t>
+      </w:r>
       <w:r>
         <w:rPr>
           <w:rFonts w:cstheme="minorHAnsi"/>
@@ -1727,7 +1585,7 @@
         </w:rPr>
         <w:t xml:space="preserve">Video tutorial: </w:t>
       </w:r>
-      <w:hyperlink r:id="rId7" w:history="1">
+      <w:hyperlink r:id="rId8" w:history="1">
         <w:r>
           <w:rPr>
             <w:rStyle w:val="Hipervnculo"/>
@@ -1753,45 +1611,9 @@
           <w:sz w:val="24"/>
           <w:szCs w:val="24"/>
         </w:rPr>
-        <w:t xml:space="preserve">Video de </w:t>
-      </w:r>
-      <w:proofErr w:type="spellStart"/>
-      <w:r>
-        <w:rPr>
-          <w:rFonts w:cstheme="minorHAnsi"/>
-          <w:sz w:val="24"/>
-          <w:szCs w:val="24"/>
-        </w:rPr>
-        <w:t>Guia</w:t>
-      </w:r>
-      <w:proofErr w:type="spellEnd"/>
-      <w:r>
-        <w:rPr>
-          <w:rFonts w:cstheme="minorHAnsi"/>
-          <w:sz w:val="24"/>
-          <w:szCs w:val="24"/>
-        </w:rPr>
-        <w:t xml:space="preserve"> </w:t>
-      </w:r>
-      <w:proofErr w:type="spellStart"/>
-      <w:r>
-        <w:rPr>
-          <w:rFonts w:cstheme="minorHAnsi"/>
-          <w:sz w:val="24"/>
-          <w:szCs w:val="24"/>
-        </w:rPr>
-        <w:t>Esquematica</w:t>
-      </w:r>
-      <w:proofErr w:type="spellEnd"/>
-      <w:r>
-        <w:rPr>
-          <w:rFonts w:cstheme="minorHAnsi"/>
-          <w:sz w:val="24"/>
-          <w:szCs w:val="24"/>
-        </w:rPr>
-        <w:t xml:space="preserve">: </w:t>
-      </w:r>
-      <w:hyperlink r:id="rId8" w:history="1">
+        <w:t xml:space="preserve">Video de Guia Esquematica: </w:t>
+      </w:r>
+      <w:hyperlink r:id="rId9" w:history="1">
         <w:r>
           <w:rPr>
             <w:rStyle w:val="Hipervnculo"/>
@@ -1825,7 +1647,7 @@
                     <pic:cNvPicPr/>
                   </pic:nvPicPr>
                   <pic:blipFill>
-                    <a:blip r:embed="rId9"/>
+                    <a:blip r:embed="rId10"/>
                     <a:stretch>
                       <a:fillRect/>
                     </a:stretch>
@@ -1854,19 +1676,11 @@
         <w:t>la resistencia</w:t>
       </w:r>
       <w:r>
-        <w:t xml:space="preserve"> </w:t>
-      </w:r>
-      <w:proofErr w:type="spellStart"/>
-      <w:r>
-        <w:t>pull</w:t>
-      </w:r>
-      <w:proofErr w:type="spellEnd"/>
-      <w:r>
-        <w:t>-up para I2C, además de las conexiones de USB-C como lo hace en el video, igualmente es una buena guía.</w:t>
-      </w:r>
-    </w:p>
-    <w:p>
-      <w:hyperlink r:id="rId10" w:history="1">
+        <w:t xml:space="preserve"> pull-up para I2C, además de las conexiones de USB-C como lo hace en el video, igualmente es una buena guía.</w:t>
+      </w:r>
+    </w:p>
+    <w:p>
+      <w:hyperlink r:id="rId11" w:history="1">
         <w:r>
           <w:rPr>
             <w:rStyle w:val="Hipervnculo"/>
@@ -1916,7 +1730,7 @@
           <w:bCs/>
         </w:rPr>
       </w:pPr>
-      <w:hyperlink r:id="rId11" w:history="1">
+      <w:hyperlink r:id="rId12" w:history="1">
         <w:r>
           <w:rPr>
             <w:rStyle w:val="Hipervnculo"/>
@@ -1934,7 +1748,7 @@
           <w:bCs/>
         </w:rPr>
       </w:pPr>
-      <w:hyperlink r:id="rId12" w:history="1">
+      <w:hyperlink r:id="rId13" w:history="1">
         <w:r>
           <w:rPr>
             <w:rStyle w:val="Hipervnculo"/>
@@ -1972,72 +1786,24 @@
           <w:b/>
           <w:bCs/>
         </w:rPr>
-        <w:t xml:space="preserve">Para el </w:t>
-      </w:r>
-      <w:proofErr w:type="spellStart"/>
-      <w:r>
-        <w:rPr>
-          <w:b/>
-          <w:bCs/>
-        </w:rPr>
-        <w:t>reincio</w:t>
-      </w:r>
-      <w:proofErr w:type="spellEnd"/>
-      <w:r>
-        <w:rPr>
-          <w:b/>
-          <w:bCs/>
-        </w:rPr>
-        <w:t xml:space="preserve"> del Chip: </w:t>
-      </w:r>
-      <w:r>
-        <w:rPr>
-          <w:b/>
-          <w:bCs/>
-        </w:rPr>
-        <w:t xml:space="preserve">El ajuste recomendado para el circuito de retardo RC suele ser R = 10 </w:t>
-      </w:r>
-      <w:proofErr w:type="spellStart"/>
-      <w:r>
-        <w:rPr>
-          <w:b/>
-          <w:bCs/>
-        </w:rPr>
-        <w:t>kΩ</w:t>
-      </w:r>
-      <w:proofErr w:type="spellEnd"/>
-      <w:r>
-        <w:rPr>
-          <w:b/>
-          <w:bCs/>
-        </w:rPr>
-        <w:t xml:space="preserve"> y C = 1 </w:t>
-      </w:r>
-      <w:proofErr w:type="spellStart"/>
-      <w:r>
-        <w:rPr>
-          <w:b/>
-          <w:bCs/>
-        </w:rPr>
-        <w:t>μF</w:t>
-      </w:r>
-      <w:proofErr w:type="spellEnd"/>
-      <w:r>
-        <w:rPr>
-          <w:b/>
-          <w:bCs/>
-        </w:rPr>
-        <w:t>. Sin embargo, se deben ajustar parámetros específicos según las características de la fuente de alimentación y la sincronización de encendido y reinicio del chip.</w:t>
-      </w:r>
-    </w:p>
-    <w:p>
-      <w:pPr>
-        <w:rPr>
-          <w:b/>
-          <w:bCs/>
-        </w:rPr>
-      </w:pPr>
-      <w:hyperlink r:id="rId13" w:history="1">
+        <w:t xml:space="preserve">Para el reincio del Chip: </w:t>
+      </w:r>
+      <w:r>
+        <w:rPr>
+          <w:b/>
+          <w:bCs/>
+        </w:rPr>
+        <w:t>El ajuste recomendado para el circuito de retardo RC suele ser R = 10 kΩ y C = 1 μF. Sin embargo, se deben ajustar parámetros específicos según las características de la fuente de alimentación y la sincronización de encendido y reinicio del chip.</w:t>
+      </w:r>
+    </w:p>
+    <w:p>
+      <w:pPr>
+        <w:rPr>
+          <w:b/>
+          <w:bCs/>
+        </w:rPr>
+      </w:pPr>
+      <w:hyperlink r:id="rId14" w:history="1">
         <w:r>
           <w:rPr>
             <w:rStyle w:val="Hipervnculo"/>
@@ -2052,33 +1818,8 @@
           <w:b/>
           <w:bCs/>
         </w:rPr>
-        <w:t xml:space="preserve"> Para </w:t>
-      </w:r>
-      <w:proofErr w:type="spellStart"/>
-      <w:r>
-        <w:rPr>
-          <w:b/>
-          <w:bCs/>
-        </w:rPr>
-        <w:t>guia</w:t>
-      </w:r>
-      <w:proofErr w:type="spellEnd"/>
-      <w:r>
-        <w:rPr>
-          <w:b/>
-          <w:bCs/>
-        </w:rPr>
-        <w:t xml:space="preserve"> de conexiones y </w:t>
-      </w:r>
-      <w:proofErr w:type="spellStart"/>
-      <w:r>
-        <w:rPr>
-          <w:b/>
-          <w:bCs/>
-        </w:rPr>
-        <w:t>esquematico</w:t>
-      </w:r>
-      <w:proofErr w:type="spellEnd"/>
+        <w:t xml:space="preserve"> Para guia de conexiones y esquematico</w:t>
+      </w:r>
     </w:p>
     <w:p>
       <w:pPr>
@@ -2093,7 +1834,7 @@
         </w:rPr>
         <w:lastRenderedPageBreak/>
         <w:drawing>
-          <wp:inline distT="0" distB="0" distL="0" distR="0" wp14:anchorId="0231EAB4" wp14:editId="4EFD0E9F">
+          <wp:inline distT="0" distB="0" distL="0" distR="0" wp14:anchorId="0231EAB4" wp14:editId="1CC38846">
             <wp:extent cx="5400040" cy="3576955"/>
             <wp:effectExtent l="0" t="0" r="0" b="4445"/>
             <wp:docPr id="1567547339" name="Imagen 1"/>
@@ -2110,7 +1851,7 @@
                     </pic:cNvPicPr>
                   </pic:nvPicPr>
                   <pic:blipFill>
-                    <a:blip r:embed="rId14" cstate="print">
+                    <a:blip r:embed="rId15" cstate="print">
                       <a:extLst>
                         <a:ext uri="{28A0092B-C50C-407E-A947-70E740481C1C}">
                           <a14:useLocalDpi xmlns:a14="http://schemas.microsoft.com/office/drawing/2010/main" val="0"/>
@@ -2154,35 +1895,26 @@
           <w:b/>
           <w:bCs/>
         </w:rPr>
-        <w:t xml:space="preserve">Placa usada por </w:t>
-      </w:r>
-      <w:proofErr w:type="spellStart"/>
-      <w:r>
-        <w:rPr>
-          <w:b/>
-          <w:bCs/>
-        </w:rPr>
-        <w:t>NodeMCU</w:t>
-      </w:r>
-      <w:proofErr w:type="spellEnd"/>
-    </w:p>
-    <w:p>
-      <w:pPr>
-        <w:rPr>
-          <w:b/>
-          <w:bCs/>
-        </w:rPr>
-      </w:pPr>
-    </w:p>
-    <w:p>
-      <w:pPr>
-        <w:rPr>
-          <w:rFonts w:cstheme="minorHAnsi"/>
-          <w:sz w:val="24"/>
-          <w:szCs w:val="24"/>
-        </w:rPr>
-      </w:pPr>
-      <w:hyperlink r:id="rId15" w:history="1">
+        <w:t>Placa usada por NodeMCU</w:t>
+      </w:r>
+    </w:p>
+    <w:p>
+      <w:pPr>
+        <w:rPr>
+          <w:b/>
+          <w:bCs/>
+        </w:rPr>
+      </w:pPr>
+    </w:p>
+    <w:p>
+      <w:pPr>
+        <w:rPr>
+          <w:rFonts w:cstheme="minorHAnsi"/>
+          <w:sz w:val="24"/>
+          <w:szCs w:val="24"/>
+        </w:rPr>
+      </w:pPr>
+      <w:hyperlink r:id="rId16" w:history="1">
         <w:r>
           <w:rPr>
             <w:rStyle w:val="Hipervnculo"/>
@@ -2368,7 +2100,7 @@
         </w:rPr>
         <w:t xml:space="preserve"> (</w:t>
       </w:r>
-      <w:hyperlink r:id="rId16" w:history="1">
+      <w:hyperlink r:id="rId17" w:history="1">
         <w:r>
           <w:rPr>
             <w:rStyle w:val="Hipervnculo"/>
@@ -2573,18 +2305,16 @@
           <w:sz w:val="24"/>
           <w:szCs w:val="24"/>
         </w:rPr>
-        <w:t xml:space="preserve">Resistencia 180 </w:t>
-      </w:r>
-      <w:proofErr w:type="spellStart"/>
-      <w:r>
-        <w:rPr>
-          <w:rFonts w:cstheme="minorHAnsi"/>
-          <w:sz w:val="24"/>
-          <w:szCs w:val="24"/>
-        </w:rPr>
-        <w:t>Ohms</w:t>
-      </w:r>
-      <w:proofErr w:type="spellEnd"/>
+        <w:t xml:space="preserve">Resistencia 180 Ohms LEDs -&gt; </w:t>
+      </w:r>
+      <w:r>
+        <w:rPr>
+          <w:rFonts w:cstheme="minorHAnsi"/>
+          <w:sz w:val="24"/>
+          <w:szCs w:val="24"/>
+        </w:rPr>
+        <w:t>1206W4J0181T5E</w:t>
+      </w:r>
       <w:r>
         <w:rPr>
           <w:rFonts w:cstheme="minorHAnsi"/>
@@ -2593,40 +2323,6 @@
         </w:rPr>
         <w:t xml:space="preserve"> </w:t>
       </w:r>
-      <w:proofErr w:type="spellStart"/>
-      <w:r>
-        <w:rPr>
-          <w:rFonts w:cstheme="minorHAnsi"/>
-          <w:sz w:val="24"/>
-          <w:szCs w:val="24"/>
-        </w:rPr>
-        <w:t>LEDs</w:t>
-      </w:r>
-      <w:proofErr w:type="spellEnd"/>
-      <w:r>
-        <w:rPr>
-          <w:rFonts w:cstheme="minorHAnsi"/>
-          <w:sz w:val="24"/>
-          <w:szCs w:val="24"/>
-        </w:rPr>
-        <w:t xml:space="preserve"> -&gt; </w:t>
-      </w:r>
-      <w:r>
-        <w:rPr>
-          <w:rFonts w:cstheme="minorHAnsi"/>
-          <w:sz w:val="24"/>
-          <w:szCs w:val="24"/>
-        </w:rPr>
-        <w:t>1206W4J0181T5E</w:t>
-      </w:r>
-      <w:r>
-        <w:rPr>
-          <w:rFonts w:cstheme="minorHAnsi"/>
-          <w:sz w:val="24"/>
-          <w:szCs w:val="24"/>
-        </w:rPr>
-        <w:t xml:space="preserve"> </w:t>
-      </w:r>
     </w:p>
     <w:p>
       <w:pPr>
@@ -2644,7 +2340,7 @@
         </w:rPr>
         <w:t xml:space="preserve">LED Rojo -&gt; </w:t>
       </w:r>
-      <w:hyperlink r:id="rId17" w:tgtFrame="_blank" w:tooltip="C2286" w:history="1">
+      <w:hyperlink r:id="rId18" w:tgtFrame="_blank" w:tooltip="C2286" w:history="1">
         <w:r>
           <w:rPr>
             <w:rStyle w:val="Hipervnculo"/>
@@ -2672,7 +2368,7 @@
         </w:rPr>
         <w:t xml:space="preserve">LED Amarillo -&gt; </w:t>
       </w:r>
-      <w:hyperlink r:id="rId18" w:tgtFrame="_blank" w:tooltip="C2296" w:history="1">
+      <w:hyperlink r:id="rId19" w:tgtFrame="_blank" w:tooltip="C2296" w:history="1">
         <w:r>
           <w:rPr>
             <w:rStyle w:val="Hipervnculo"/>
@@ -2749,43 +2445,7 @@
           <w:szCs w:val="24"/>
         </w:rPr>
         <w:lastRenderedPageBreak/>
-        <w:t xml:space="preserve">Capacitor </w:t>
-      </w:r>
-      <w:proofErr w:type="spellStart"/>
-      <w:r>
-        <w:rPr>
-          <w:rFonts w:cstheme="minorHAnsi"/>
-          <w:sz w:val="24"/>
-          <w:szCs w:val="24"/>
-        </w:rPr>
-        <w:t>Ceramico</w:t>
-      </w:r>
-      <w:proofErr w:type="spellEnd"/>
-      <w:r>
-        <w:rPr>
-          <w:rFonts w:cstheme="minorHAnsi"/>
-          <w:sz w:val="24"/>
-          <w:szCs w:val="24"/>
-        </w:rPr>
-        <w:t xml:space="preserve"> 100 </w:t>
-      </w:r>
-      <w:proofErr w:type="spellStart"/>
-      <w:r>
-        <w:rPr>
-          <w:rFonts w:cstheme="minorHAnsi"/>
-          <w:sz w:val="24"/>
-          <w:szCs w:val="24"/>
-        </w:rPr>
-        <w:t>nF</w:t>
-      </w:r>
-      <w:proofErr w:type="spellEnd"/>
-      <w:r>
-        <w:rPr>
-          <w:rFonts w:cstheme="minorHAnsi"/>
-          <w:sz w:val="24"/>
-          <w:szCs w:val="24"/>
-        </w:rPr>
-        <w:t xml:space="preserve">: </w:t>
+        <w:t xml:space="preserve">Capacitor Ceramico 100 nF: </w:t>
       </w:r>
       <w:r>
         <w:rPr>
@@ -2810,43 +2470,7 @@
           <w:sz w:val="24"/>
           <w:szCs w:val="24"/>
         </w:rPr>
-        <w:t xml:space="preserve">Capacitor </w:t>
-      </w:r>
-      <w:proofErr w:type="spellStart"/>
-      <w:r>
-        <w:rPr>
-          <w:rFonts w:cstheme="minorHAnsi"/>
-          <w:sz w:val="24"/>
-          <w:szCs w:val="24"/>
-        </w:rPr>
-        <w:t>Tantalium</w:t>
-      </w:r>
-      <w:proofErr w:type="spellEnd"/>
-      <w:r>
-        <w:rPr>
-          <w:rFonts w:cstheme="minorHAnsi"/>
-          <w:sz w:val="24"/>
-          <w:szCs w:val="24"/>
-        </w:rPr>
-        <w:t xml:space="preserve"> 22 </w:t>
-      </w:r>
-      <w:proofErr w:type="spellStart"/>
-      <w:r>
-        <w:rPr>
-          <w:rFonts w:cstheme="minorHAnsi"/>
-          <w:sz w:val="24"/>
-          <w:szCs w:val="24"/>
-        </w:rPr>
-        <w:t>uF</w:t>
-      </w:r>
-      <w:proofErr w:type="spellEnd"/>
-      <w:r>
-        <w:rPr>
-          <w:rFonts w:cstheme="minorHAnsi"/>
-          <w:sz w:val="24"/>
-          <w:szCs w:val="24"/>
-        </w:rPr>
-        <w:t xml:space="preserve">: </w:t>
+        <w:t xml:space="preserve">Capacitor Tantalium 22 uF: </w:t>
       </w:r>
       <w:r>
         <w:rPr>
@@ -2972,7 +2596,7 @@
         </w:rPr>
         <w:t xml:space="preserve"> pines para alimentación de Ultrasonidos: </w:t>
       </w:r>
-      <w:hyperlink r:id="rId19" w:tgtFrame="_blank" w:tooltip="2.54-2*8P" w:history="1">
+      <w:hyperlink r:id="rId20" w:tgtFrame="_blank" w:tooltip="2.54-2*8P" w:history="1">
         <w:r>
           <w:rPr>
             <w:rStyle w:val="Hipervnculo"/>
@@ -3002,7 +2626,7 @@
         </w:rPr>
         <w:t xml:space="preserve">Bornera de 2 pines: </w:t>
       </w:r>
-      <w:hyperlink r:id="rId20" w:tgtFrame="_blank" w:tooltip="WJ127-5.0-02P-14-00A" w:history="1">
+      <w:hyperlink r:id="rId21" w:tgtFrame="_blank" w:tooltip="WJ127-5.0-02P-14-00A" w:history="1">
         <w:r>
           <w:rPr>
             <w:rStyle w:val="Hipervnculo"/>
@@ -3023,25 +2647,14 @@
           <w:lang w:val="es-ES"/>
         </w:rPr>
       </w:pPr>
-      <w:proofErr w:type="spellStart"/>
-      <w:r>
-        <w:rPr>
-          <w:rFonts w:cstheme="minorHAnsi"/>
-          <w:sz w:val="24"/>
-          <w:szCs w:val="24"/>
-          <w:lang w:val="es-ES"/>
-        </w:rPr>
-        <w:t>Header</w:t>
-      </w:r>
-      <w:proofErr w:type="spellEnd"/>
-      <w:r>
-        <w:rPr>
-          <w:rFonts w:cstheme="minorHAnsi"/>
-          <w:sz w:val="24"/>
-          <w:szCs w:val="24"/>
-          <w:lang w:val="es-ES"/>
-        </w:rPr>
-        <w:t xml:space="preserve"> de 3 Pines: </w:t>
+      <w:r>
+        <w:rPr>
+          <w:rFonts w:cstheme="minorHAnsi"/>
+          <w:sz w:val="24"/>
+          <w:szCs w:val="24"/>
+          <w:lang w:val="es-ES"/>
+        </w:rPr>
+        <w:t xml:space="preserve">Header de 3 Pines: </w:t>
       </w:r>
       <w:r>
         <w:rPr>
@@ -3071,7 +2684,7 @@
         </w:rPr>
         <w:t xml:space="preserve">Conector de 6 Pines para Servos y Puente H: </w:t>
       </w:r>
-      <w:hyperlink r:id="rId21" w:tgtFrame="_blank" w:tooltip="2.54-2*3P" w:history="1">
+      <w:hyperlink r:id="rId22" w:tgtFrame="_blank" w:tooltip="2.54-2*3P" w:history="1">
         <w:r>
           <w:rPr>
             <w:rStyle w:val="Hipervnculo"/>
@@ -3225,7 +2838,7 @@
                     <pic:cNvPicPr/>
                   </pic:nvPicPr>
                   <pic:blipFill>
-                    <a:blip r:embed="rId22"/>
+                    <a:blip r:embed="rId23"/>
                     <a:stretch>
                       <a:fillRect/>
                     </a:stretch>

</xml_diff>